<commit_message>
atualizando automacao com novos processos e integracao cpj
Co-Authored-By: Claude Sonnet 4.6 <noreply@anthropic.com>
</commit_message>
<xml_diff>
--- a/sites/cpj-reembolso-bmg/documento_modelo/bmg/descritivo_custas_preenchido.docx
+++ b/sites/cpj-reembolso-bmg/documento_modelo/bmg/descritivo_custas_preenchido.docx
@@ -184,7 +184,7 @@
           </w:tcPr>
           <w:p>
             <w:r>
-              <w:t>11111</w:t>
+              <w:t>172947</w:t>
             </w:r>
           </w:p>
         </w:tc>
@@ -236,7 +236,7 @@
           </w:tcPr>
           <w:p>
             <w:r>
-              <w:t>02/02/2026</w:t>
+              <w:t>27/03/2026</w:t>
             </w:r>
           </w:p>
         </w:tc>
@@ -288,7 +288,7 @@
           </w:tcPr>
           <w:p>
             <w:r>
-              <w:t>02/2026</w:t>
+              <w:t>03/2026</w:t>
             </w:r>
           </w:p>
         </w:tc>
@@ -449,7 +449,7 @@
           </w:tcPr>
           <w:p>
             <w:r>
-              <w:t>23105,42</w:t>
+              <w:t>7611,84</w:t>
             </w:r>
           </w:p>
         </w:tc>
@@ -1256,15 +1256,15 @@
           <w:tcPr/>
           <w:p>
             <w:r>
-              <w:t>02/02/2026</w:t>
-            </w:r>
-          </w:p>
-        </w:tc>
-        <w:tc>
-          <w:tcPr/>
-          <w:p>
-            <w:r>
-              <w:t>CIV1513703</w:t>
+              <w:t>27/03/2026</w:t>
+            </w:r>
+          </w:p>
+        </w:tc>
+        <w:tc>
+          <w:tcPr/>
+          <w:p>
+            <w:r>
+              <w:t>CIV1517612</w:t>
             </w:r>
           </w:p>
         </w:tc>
@@ -1292,7 +1292,7 @@
           </w:tcPr>
           <w:p>
             <w:r>
-              <w:t>32,75</w:t>
+              <w:t>33,59</w:t>
             </w:r>
           </w:p>
         </w:tc>
@@ -1320,15 +1320,15 @@
           <w:tcPr/>
           <w:p>
             <w:r>
-              <w:t>02/02/2026</w:t>
-            </w:r>
-          </w:p>
-        </w:tc>
-        <w:tc>
-          <w:tcPr/>
-          <w:p>
-            <w:r>
-              <w:t>CIV1461942</w:t>
+              <w:t>27/03/2026</w:t>
+            </w:r>
+          </w:p>
+        </w:tc>
+        <w:tc>
+          <w:tcPr/>
+          <w:p>
+            <w:r>
+              <w:t>CIV1525006</w:t>
             </w:r>
           </w:p>
         </w:tc>
@@ -1340,7 +1340,7 @@
           </w:tcPr>
           <w:p>
             <w:r>
-              <w:t>CUSTAS DIVERSAS E TAXAS JUDICIAIS / TRIBUNAL DE JU</w:t>
+              <w:t>APELAÇÃO CIVEL</w:t>
             </w:r>
           </w:p>
         </w:tc>
@@ -1356,7 +1356,7 @@
           </w:tcPr>
           <w:p>
             <w:r>
-              <w:t>17,17</w:t>
+              <w:t>30,00</w:t>
             </w:r>
           </w:p>
         </w:tc>
@@ -1380,15 +1380,15 @@
           <w:tcPr/>
           <w:p>
             <w:r>
-              <w:t>02/02/2026</w:t>
-            </w:r>
-          </w:p>
-        </w:tc>
-        <w:tc>
-          <w:tcPr/>
-          <w:p>
-            <w:r>
-              <w:t>CIV1512736</w:t>
+              <w:t>27/03/2026</w:t>
+            </w:r>
+          </w:p>
+        </w:tc>
+        <w:tc>
+          <w:tcPr/>
+          <w:p>
+            <w:r>
+              <w:t>CIV1280160</w:t>
             </w:r>
           </w:p>
         </w:tc>
@@ -1416,7 +1416,7 @@
           </w:tcPr>
           <w:p>
             <w:r>
-              <w:t>515,01</w:t>
+              <w:t>649,57</w:t>
             </w:r>
           </w:p>
         </w:tc>
@@ -1440,15 +1440,15 @@
           <w:tcPr/>
           <w:p>
             <w:r>
-              <w:t>02/02/2026</w:t>
-            </w:r>
-          </w:p>
-        </w:tc>
-        <w:tc>
-          <w:tcPr/>
-          <w:p>
-            <w:r>
-              <w:t>CIV1210506</w:t>
+              <w:t>27/03/2026</w:t>
+            </w:r>
+          </w:p>
+        </w:tc>
+        <w:tc>
+          <w:tcPr/>
+          <w:p>
+            <w:r>
+              <w:t>CIV1299811</w:t>
             </w:r>
           </w:p>
         </w:tc>
@@ -1460,7 +1460,7 @@
           </w:tcPr>
           <w:p>
             <w:r>
-              <w:t>CUSTAS DIVERSAS E TAXAS JUDICIAIS / TRIBUNAL DE JU</w:t>
+              <w:t>APELAÇÃO CIVEL</w:t>
             </w:r>
           </w:p>
         </w:tc>
@@ -1476,7 +1476,7 @@
           </w:tcPr>
           <w:p>
             <w:r>
-              <w:t>2207,55</w:t>
+              <w:t>500,25</w:t>
             </w:r>
           </w:p>
         </w:tc>
@@ -1500,15 +1500,15 @@
           <w:tcPr/>
           <w:p>
             <w:r>
-              <w:t>02/02/2026</w:t>
-            </w:r>
-          </w:p>
-        </w:tc>
-        <w:tc>
-          <w:tcPr/>
-          <w:p>
-            <w:r>
-              <w:t>CIV1397493</w:t>
+              <w:t>27/03/2026</w:t>
+            </w:r>
+          </w:p>
+        </w:tc>
+        <w:tc>
+          <w:tcPr/>
+          <w:p>
+            <w:r>
+              <w:t>CIV1298731</w:t>
             </w:r>
           </w:p>
         </w:tc>
@@ -1536,7 +1536,7 @@
           </w:tcPr>
           <w:p>
             <w:r>
-              <w:t>185,10</w:t>
+              <w:t>1139,65</w:t>
             </w:r>
           </w:p>
         </w:tc>
@@ -1560,15 +1560,15 @@
           <w:tcPr/>
           <w:p>
             <w:r>
-              <w:t>02/02/2026</w:t>
-            </w:r>
-          </w:p>
-        </w:tc>
-        <w:tc>
-          <w:tcPr/>
-          <w:p>
-            <w:r>
-              <w:t>CIV1321754</w:t>
+              <w:t>27/03/2026</w:t>
+            </w:r>
+          </w:p>
+        </w:tc>
+        <w:tc>
+          <w:tcPr/>
+          <w:p>
+            <w:r>
+              <w:t>CIV1517612</w:t>
             </w:r>
           </w:p>
         </w:tc>
@@ -1596,7 +1596,7 @@
           </w:tcPr>
           <w:p>
             <w:r>
-              <w:t>84,13</w:t>
+              <w:t>192,10</w:t>
             </w:r>
           </w:p>
         </w:tc>
@@ -1620,15 +1620,15 @@
           <w:tcPr/>
           <w:p>
             <w:r>
-              <w:t>02/02/2026</w:t>
-            </w:r>
-          </w:p>
-        </w:tc>
-        <w:tc>
-          <w:tcPr/>
-          <w:p>
-            <w:r>
-              <w:t>CIV1190887</w:t>
+              <w:t>27/03/2026</w:t>
+            </w:r>
+          </w:p>
+        </w:tc>
+        <w:tc>
+          <w:tcPr/>
+          <w:p>
+            <w:r>
+              <w:t>CIV1516616</w:t>
             </w:r>
           </w:p>
         </w:tc>
@@ -1640,7 +1640,7 @@
           </w:tcPr>
           <w:p>
             <w:r>
-              <w:t>CUSTAS DIVERSAS E TAXAS JUDICIAIS / TRIBUNAL DE JU</w:t>
+              <w:t>CUSTA FINAIS</w:t>
             </w:r>
           </w:p>
         </w:tc>
@@ -1656,7 +1656,7 @@
           </w:tcPr>
           <w:p>
             <w:r>
-              <w:t>3470,16</w:t>
+              <w:t>192,10</w:t>
             </w:r>
           </w:p>
         </w:tc>
@@ -1680,15 +1680,15 @@
           <w:tcPr/>
           <w:p>
             <w:r>
-              <w:t>02/02/2026</w:t>
-            </w:r>
-          </w:p>
-        </w:tc>
-        <w:tc>
-          <w:tcPr/>
-          <w:p>
-            <w:r>
-              <w:t>CIV1135716</w:t>
+              <w:t>27/03/2026</w:t>
+            </w:r>
+          </w:p>
+        </w:tc>
+        <w:tc>
+          <w:tcPr/>
+          <w:p>
+            <w:r>
+              <w:t>CIV1600985</w:t>
             </w:r>
           </w:p>
         </w:tc>
@@ -1700,7 +1700,7 @@
           </w:tcPr>
           <w:p>
             <w:r>
-              <w:t>CUSTAS DIVERSAS E TAXAS JUDICIAIS / TRIBUNAL DE JU</w:t>
+              <w:t>CUSTA FINAIS</w:t>
             </w:r>
           </w:p>
         </w:tc>
@@ -1716,7 +1716,7 @@
           </w:tcPr>
           <w:p>
             <w:r>
-              <w:t>1245,74</w:t>
+              <w:t>311,72</w:t>
             </w:r>
           </w:p>
         </w:tc>
@@ -1740,15 +1740,15 @@
           <w:tcPr/>
           <w:p>
             <w:r>
-              <w:t>02/02/2026</w:t>
-            </w:r>
-          </w:p>
-        </w:tc>
-        <w:tc>
-          <w:tcPr/>
-          <w:p>
-            <w:r>
-              <w:t>CIV1163614</w:t>
+              <w:t>27/03/2026</w:t>
+            </w:r>
+          </w:p>
+        </w:tc>
+        <w:tc>
+          <w:tcPr/>
+          <w:p>
+            <w:r>
+              <w:t>CIV1649911</w:t>
             </w:r>
           </w:p>
         </w:tc>
@@ -1760,7 +1760,7 @@
           </w:tcPr>
           <w:p>
             <w:r>
-              <w:t>CUSTAS DIVERSAS E TAXAS JUDICIAIS / TRIBUNAL DE JU</w:t>
+              <w:t>CUSTA FINAIS</w:t>
             </w:r>
           </w:p>
         </w:tc>
@@ -1776,7 +1776,7 @@
           </w:tcPr>
           <w:p>
             <w:r>
-              <w:t>192,10</w:t>
+              <w:t>288,50</w:t>
             </w:r>
           </w:p>
         </w:tc>
@@ -1800,15 +1800,15 @@
           <w:tcPr/>
           <w:p>
             <w:r>
-              <w:t>02/02/2026</w:t>
-            </w:r>
-          </w:p>
-        </w:tc>
-        <w:tc>
-          <w:tcPr/>
-          <w:p>
-            <w:r>
-              <w:t>CIV1540406</w:t>
+              <w:t>27/03/2026</w:t>
+            </w:r>
+          </w:p>
+        </w:tc>
+        <w:tc>
+          <w:tcPr/>
+          <w:p>
+            <w:r>
+              <w:t>CIV1588967</w:t>
             </w:r>
           </w:p>
         </w:tc>
@@ -1820,7 +1820,7 @@
           </w:tcPr>
           <w:p>
             <w:r>
-              <w:t>CUSTAS DIVERSAS E TAXAS JUDICIAIS / TRIBUNAL DE JU</w:t>
+              <w:t>CUSTA FINAIS</w:t>
             </w:r>
           </w:p>
         </w:tc>
@@ -1836,7 +1836,7 @@
           </w:tcPr>
           <w:p>
             <w:r>
-              <w:t>999,68</w:t>
+              <w:t>288,50</w:t>
             </w:r>
           </w:p>
         </w:tc>
@@ -1860,15 +1860,15 @@
           <w:tcPr/>
           <w:p>
             <w:r>
-              <w:t>02/02/2026</w:t>
-            </w:r>
-          </w:p>
-        </w:tc>
-        <w:tc>
-          <w:tcPr/>
-          <w:p>
-            <w:r>
-              <w:t>CIV1564373</w:t>
+              <w:t>27/03/2026</w:t>
+            </w:r>
+          </w:p>
+        </w:tc>
+        <w:tc>
+          <w:tcPr/>
+          <w:p>
+            <w:r>
+              <w:t>CIV1458169</w:t>
             </w:r>
           </w:p>
         </w:tc>
@@ -1880,7 +1880,7 @@
           </w:tcPr>
           <w:p>
             <w:r>
-              <w:t>CUSTAS DIVERSAS E TAXAS JUDICIAIS / TRIBUNAL DE JU</w:t>
+              <w:t>CUSTA FINAIS</w:t>
             </w:r>
           </w:p>
         </w:tc>
@@ -1896,7 +1896,7 @@
           </w:tcPr>
           <w:p>
             <w:r>
-              <w:t>606,44</w:t>
+              <w:t>750,10</w:t>
             </w:r>
           </w:p>
         </w:tc>
@@ -1920,15 +1920,15 @@
           <w:tcPr/>
           <w:p>
             <w:r>
-              <w:t>02/02/2026</w:t>
-            </w:r>
-          </w:p>
-        </w:tc>
-        <w:tc>
-          <w:tcPr/>
-          <w:p>
-            <w:r>
-              <w:t>CIV1206649</w:t>
+              <w:t>27/03/2026</w:t>
+            </w:r>
+          </w:p>
+        </w:tc>
+        <w:tc>
+          <w:tcPr/>
+          <w:p>
+            <w:r>
+              <w:t>CIV1516312</w:t>
             </w:r>
           </w:p>
         </w:tc>
@@ -1940,7 +1940,7 @@
           </w:tcPr>
           <w:p>
             <w:r>
-              <w:t>CUSTAS DIVERSAS E TAXAS JUDICIAIS / TRIBUNAL DE JU</w:t>
+              <w:t>RECURSO INOMINADO</w:t>
             </w:r>
           </w:p>
         </w:tc>
@@ -1956,7 +1956,7 @@
           </w:tcPr>
           <w:p>
             <w:r>
-              <w:t>1028,94</w:t>
+              <w:t>1287,26</w:t>
             </w:r>
           </w:p>
         </w:tc>
@@ -1980,15 +1980,15 @@
           <w:tcPr/>
           <w:p>
             <w:r>
-              <w:t>02/02/2026</w:t>
-            </w:r>
-          </w:p>
-        </w:tc>
-        <w:tc>
-          <w:tcPr/>
-          <w:p>
-            <w:r>
-              <w:t>CIV1277543</w:t>
+              <w:t>27/03/2026</w:t>
+            </w:r>
+          </w:p>
+        </w:tc>
+        <w:tc>
+          <w:tcPr/>
+          <w:p>
+            <w:r>
+              <w:t>CIV1095022</w:t>
             </w:r>
           </w:p>
         </w:tc>
@@ -2000,7 +2000,7 @@
           </w:tcPr>
           <w:p>
             <w:r>
-              <w:t>CUSTAS DIVERSAS E TAXAS JUDICIAIS / TRIBUNAL DE JU</w:t>
+              <w:t>APELAÇÃO CIVEL</w:t>
             </w:r>
           </w:p>
         </w:tc>
@@ -2016,7 +2016,7 @@
           </w:tcPr>
           <w:p>
             <w:r>
-              <w:t>2502,53</w:t>
+              <w:t>649,50</w:t>
             </w:r>
           </w:p>
         </w:tc>
@@ -2040,15 +2040,15 @@
           <w:tcPr/>
           <w:p>
             <w:r>
-              <w:t>02/02/2026</w:t>
-            </w:r>
-          </w:p>
-        </w:tc>
-        <w:tc>
-          <w:tcPr/>
-          <w:p>
-            <w:r>
-              <w:t>CIV1525946</w:t>
+              <w:t>27/03/2026</w:t>
+            </w:r>
+          </w:p>
+        </w:tc>
+        <w:tc>
+          <w:tcPr/>
+          <w:p>
+            <w:r>
+              <w:t>CIV1567784</w:t>
             </w:r>
           </w:p>
         </w:tc>
@@ -2060,7 +2060,7 @@
           </w:tcPr>
           <w:p>
             <w:r>
-              <w:t>CUSTAS DIVERSAS E TAXAS JUDICIAIS / TRIBUNAL DE JU</w:t>
+              <w:t>APELAÇÃO CIVEL</w:t>
             </w:r>
           </w:p>
         </w:tc>
@@ -2076,7 +2076,7 @@
           </w:tcPr>
           <w:p>
             <w:r>
-              <w:t>192,10</w:t>
+              <w:t>649,50</w:t>
             </w:r>
           </w:p>
         </w:tc>
@@ -2100,15 +2100,15 @@
           <w:tcPr/>
           <w:p>
             <w:r>
-              <w:t>02/02/2026</w:t>
-            </w:r>
-          </w:p>
-        </w:tc>
-        <w:tc>
-          <w:tcPr/>
-          <w:p>
-            <w:r>
-              <w:t>CIV1099248</w:t>
+              <w:t>27/03/2026</w:t>
+            </w:r>
+          </w:p>
+        </w:tc>
+        <w:tc>
+          <w:tcPr/>
+          <w:p>
+            <w:r>
+              <w:t>CIV1667258</w:t>
             </w:r>
           </w:p>
         </w:tc>
@@ -2120,7 +2120,7 @@
           </w:tcPr>
           <w:p>
             <w:r>
-              <w:t>CUSTAS DIVERSAS E TAXAS JUDICIAIS / TRIBUNAL DE JU</w:t>
+              <w:t>APELAÇÃO CIVEL</w:t>
             </w:r>
           </w:p>
         </w:tc>
@@ -2136,7 +2136,7 @@
           </w:tcPr>
           <w:p>
             <w:r>
-              <w:t>192,10</w:t>
+              <w:t>649,50</w:t>
             </w:r>
           </w:p>
         </w:tc>
@@ -2151,606 +2151,6 @@
             <w:shd w:fill="auto" w:val="clear"/>
           </w:tcPr>
           <w:p>
-            <w:r>
-              <w:t>Custas</w:t>
-            </w:r>
-          </w:p>
-        </w:tc>
-        <w:tc>
-          <w:tcPr/>
-          <w:p>
-            <w:r>
-              <w:t>02/02/2026</w:t>
-            </w:r>
-          </w:p>
-        </w:tc>
-        <w:tc>
-          <w:tcPr/>
-          <w:p>
-            <w:r>
-              <w:t>CIV1365713</w:t>
-            </w:r>
-          </w:p>
-        </w:tc>
-        <w:tc>
-          <w:tcPr>
-            <w:tcBorders>
-              <w:right w:color="ffffff" w:space="0" w:sz="18" w:val="single"/>
-            </w:tcBorders>
-          </w:tcPr>
-          <w:p>
-            <w:r>
-              <w:t>CUSTAS DIVERSAS E TAXAS JUDICIAIS / TRIBUNAL DE JU</w:t>
-            </w:r>
-          </w:p>
-        </w:tc>
-        <w:tc>
-          <w:tcPr>
-            <w:tcBorders>
-              <w:top w:color="ffffff" w:space="0" w:sz="18" w:val="single"/>
-              <w:left w:color="ffffff" w:space="0" w:sz="18" w:val="single"/>
-              <w:bottom w:color="ffffff" w:space="0" w:sz="18" w:val="single"/>
-              <w:right w:color="000000" w:space="0" w:sz="0" w:val="nil"/>
-            </w:tcBorders>
-            <w:shd w:fill="fbe2d1" w:val="clear"/>
-          </w:tcPr>
-          <w:p>
-            <w:r>
-              <w:t>192,10</w:t>
-            </w:r>
-          </w:p>
-        </w:tc>
-      </w:tr>
-      <w:tr>
-        <w:trPr>
-          <w:cantSplit w:val="0"/>
-          <w:tblHeader w:val="0"/>
-        </w:trPr>
-        <w:tc>
-          <w:tcPr>
-            <w:shd w:fill="auto" w:val="clear"/>
-          </w:tcPr>
-          <w:p>
-            <w:r>
-              <w:t>Custas</w:t>
-            </w:r>
-          </w:p>
-        </w:tc>
-        <w:tc>
-          <w:tcPr/>
-          <w:p>
-            <w:r>
-              <w:t>02/02/2026</w:t>
-            </w:r>
-          </w:p>
-        </w:tc>
-        <w:tc>
-          <w:tcPr/>
-          <w:p>
-            <w:r>
-              <w:t>CIV1513502</w:t>
-            </w:r>
-          </w:p>
-        </w:tc>
-        <w:tc>
-          <w:tcPr>
-            <w:tcBorders>
-              <w:right w:color="ffffff" w:space="0" w:sz="18" w:val="single"/>
-            </w:tcBorders>
-          </w:tcPr>
-          <w:p>
-            <w:r>
-              <w:t>CUSTAS DIVERSAS E TAXAS JUDICIAIS / TRIBUNAL DE JU</w:t>
-            </w:r>
-          </w:p>
-        </w:tc>
-        <w:tc>
-          <w:tcPr>
-            <w:tcBorders>
-              <w:top w:color="ffffff" w:space="0" w:sz="18" w:val="single"/>
-              <w:left w:color="ffffff" w:space="0" w:sz="18" w:val="single"/>
-              <w:bottom w:color="ffffff" w:space="0" w:sz="18" w:val="single"/>
-              <w:right w:color="000000" w:space="0" w:sz="0" w:val="nil"/>
-            </w:tcBorders>
-            <w:shd w:fill="fbe2d1" w:val="clear"/>
-          </w:tcPr>
-          <w:p>
-            <w:r>
-              <w:t>999,68</w:t>
-            </w:r>
-          </w:p>
-        </w:tc>
-      </w:tr>
-      <w:tr>
-        <w:trPr>
-          <w:cantSplit w:val="0"/>
-          <w:tblHeader w:val="0"/>
-        </w:trPr>
-        <w:tc>
-          <w:tcPr>
-            <w:shd w:fill="auto" w:val="clear"/>
-          </w:tcPr>
-          <w:p>
-            <w:r>
-              <w:t>Custas</w:t>
-            </w:r>
-          </w:p>
-        </w:tc>
-        <w:tc>
-          <w:tcPr/>
-          <w:p>
-            <w:r>
-              <w:t>02/02/2026</w:t>
-            </w:r>
-          </w:p>
-        </w:tc>
-        <w:tc>
-          <w:tcPr/>
-          <w:p>
-            <w:r>
-              <w:t>CIV1142692</w:t>
-            </w:r>
-          </w:p>
-        </w:tc>
-        <w:tc>
-          <w:tcPr>
-            <w:tcBorders>
-              <w:right w:color="ffffff" w:space="0" w:sz="18" w:val="single"/>
-            </w:tcBorders>
-          </w:tcPr>
-          <w:p>
-            <w:r>
-              <w:t>CUSTAS DIVERSAS E TAXAS JUDICIAIS / TRIBUNAL DE JU</w:t>
-            </w:r>
-          </w:p>
-        </w:tc>
-        <w:tc>
-          <w:tcPr>
-            <w:tcBorders>
-              <w:top w:color="ffffff" w:space="0" w:sz="18" w:val="single"/>
-              <w:left w:color="ffffff" w:space="0" w:sz="18" w:val="single"/>
-              <w:bottom w:color="ffffff" w:space="0" w:sz="18" w:val="single"/>
-              <w:right w:color="000000" w:space="0" w:sz="0" w:val="nil"/>
-            </w:tcBorders>
-            <w:shd w:fill="fbe2d1" w:val="clear"/>
-          </w:tcPr>
-          <w:p>
-            <w:r>
-              <w:t>4486,05</w:t>
-            </w:r>
-          </w:p>
-        </w:tc>
-      </w:tr>
-      <w:tr>
-        <w:trPr>
-          <w:cantSplit w:val="0"/>
-          <w:tblHeader w:val="0"/>
-        </w:trPr>
-        <w:tc>
-          <w:tcPr>
-            <w:shd w:fill="auto" w:val="clear"/>
-          </w:tcPr>
-          <w:p>
-            <w:r>
-              <w:t>Custas</w:t>
-            </w:r>
-          </w:p>
-        </w:tc>
-        <w:tc>
-          <w:tcPr/>
-          <w:p>
-            <w:r>
-              <w:t>02/02/2026</w:t>
-            </w:r>
-          </w:p>
-        </w:tc>
-        <w:tc>
-          <w:tcPr/>
-          <w:p>
-            <w:r>
-              <w:t>CIV1046163</w:t>
-            </w:r>
-          </w:p>
-        </w:tc>
-        <w:tc>
-          <w:tcPr>
-            <w:tcBorders>
-              <w:right w:color="ffffff" w:space="0" w:sz="18" w:val="single"/>
-            </w:tcBorders>
-          </w:tcPr>
-          <w:p>
-            <w:r>
-              <w:t>CUSTAS DIVERSAS E TAXAS JUDICIAIS / TRIBUNAL DE JU</w:t>
-            </w:r>
-          </w:p>
-        </w:tc>
-        <w:tc>
-          <w:tcPr>
-            <w:tcBorders>
-              <w:top w:color="ffffff" w:space="0" w:sz="18" w:val="single"/>
-              <w:left w:color="ffffff" w:space="0" w:sz="18" w:val="single"/>
-              <w:bottom w:color="ffffff" w:space="0" w:sz="18" w:val="single"/>
-              <w:right w:color="000000" w:space="0" w:sz="0" w:val="nil"/>
-            </w:tcBorders>
-            <w:shd w:fill="fbe2d1" w:val="clear"/>
-          </w:tcPr>
-          <w:p>
-            <w:r>
-              <w:t>1250,38</w:t>
-            </w:r>
-          </w:p>
-        </w:tc>
-      </w:tr>
-      <w:tr>
-        <w:trPr>
-          <w:cantSplit w:val="0"/>
-          <w:tblHeader w:val="0"/>
-        </w:trPr>
-        <w:tc>
-          <w:tcPr>
-            <w:shd w:fill="auto" w:val="clear"/>
-          </w:tcPr>
-          <w:p>
-            <w:r>
-              <w:t>Custas</w:t>
-            </w:r>
-          </w:p>
-        </w:tc>
-        <w:tc>
-          <w:tcPr/>
-          <w:p>
-            <w:r>
-              <w:t>02/02/2026</w:t>
-            </w:r>
-          </w:p>
-        </w:tc>
-        <w:tc>
-          <w:tcPr/>
-          <w:p>
-            <w:r>
-              <w:t>CIV1512958</w:t>
-            </w:r>
-          </w:p>
-        </w:tc>
-        <w:tc>
-          <w:tcPr>
-            <w:tcBorders>
-              <w:right w:color="ffffff" w:space="0" w:sz="18" w:val="single"/>
-            </w:tcBorders>
-          </w:tcPr>
-          <w:p>
-            <w:r>
-              <w:t>CUSTAS DIVERSAS E TAXAS JUDICIAIS / TRIBUNAL DE JU</w:t>
-            </w:r>
-          </w:p>
-        </w:tc>
-        <w:tc>
-          <w:tcPr>
-            <w:tcBorders>
-              <w:top w:color="ffffff" w:space="0" w:sz="18" w:val="single"/>
-              <w:left w:color="ffffff" w:space="0" w:sz="18" w:val="single"/>
-              <w:bottom w:color="ffffff" w:space="0" w:sz="18" w:val="single"/>
-              <w:right w:color="000000" w:space="0" w:sz="0" w:val="nil"/>
-            </w:tcBorders>
-            <w:shd w:fill="fbe2d1" w:val="clear"/>
-          </w:tcPr>
-          <w:p>
-            <w:r>
-              <w:t>370,20</w:t>
-            </w:r>
-          </w:p>
-        </w:tc>
-      </w:tr>
-      <w:tr>
-        <w:trPr>
-          <w:cantSplit w:val="0"/>
-          <w:tblHeader w:val="0"/>
-        </w:trPr>
-        <w:tc>
-          <w:tcPr>
-            <w:shd w:fill="auto" w:val="clear"/>
-          </w:tcPr>
-          <w:p>
-            <w:r>
-              <w:t>Custas</w:t>
-            </w:r>
-          </w:p>
-        </w:tc>
-        <w:tc>
-          <w:tcPr/>
-          <w:p>
-            <w:r>
-              <w:t>02/02/2026</w:t>
-            </w:r>
-          </w:p>
-        </w:tc>
-        <w:tc>
-          <w:tcPr/>
-          <w:p>
-            <w:r>
-              <w:t>CIV1259980</w:t>
-            </w:r>
-          </w:p>
-        </w:tc>
-        <w:tc>
-          <w:tcPr>
-            <w:tcBorders>
-              <w:right w:color="ffffff" w:space="0" w:sz="18" w:val="single"/>
-            </w:tcBorders>
-          </w:tcPr>
-          <w:p>
-            <w:r>
-              <w:t>CUSTAS DIVERSAS E TAXAS JUDICIAIS / TRIBUNAL DE JU</w:t>
-            </w:r>
-          </w:p>
-        </w:tc>
-        <w:tc>
-          <w:tcPr>
-            <w:tcBorders>
-              <w:top w:color="ffffff" w:space="0" w:sz="18" w:val="single"/>
-              <w:left w:color="ffffff" w:space="0" w:sz="18" w:val="single"/>
-              <w:bottom w:color="ffffff" w:space="0" w:sz="18" w:val="single"/>
-              <w:right w:color="000000" w:space="0" w:sz="0" w:val="nil"/>
-            </w:tcBorders>
-            <w:shd w:fill="fbe2d1" w:val="clear"/>
-          </w:tcPr>
-          <w:p>
-            <w:r>
-              <w:t>1250,38</w:t>
-            </w:r>
-          </w:p>
-        </w:tc>
-      </w:tr>
-      <w:tr>
-        <w:trPr>
-          <w:cantSplit w:val="0"/>
-          <w:tblHeader w:val="0"/>
-        </w:trPr>
-        <w:tc>
-          <w:tcPr>
-            <w:shd w:fill="auto" w:val="clear"/>
-          </w:tcPr>
-          <w:p>
-            <w:r>
-              <w:t>Custas</w:t>
-            </w:r>
-          </w:p>
-        </w:tc>
-        <w:tc>
-          <w:tcPr/>
-          <w:p>
-            <w:r>
-              <w:t>02/02/2026</w:t>
-            </w:r>
-          </w:p>
-        </w:tc>
-        <w:tc>
-          <w:tcPr/>
-          <w:p>
-            <w:r>
-              <w:t>CIV1416214</w:t>
-            </w:r>
-          </w:p>
-        </w:tc>
-        <w:tc>
-          <w:tcPr>
-            <w:tcBorders>
-              <w:right w:color="ffffff" w:space="0" w:sz="18" w:val="single"/>
-            </w:tcBorders>
-          </w:tcPr>
-          <w:p>
-            <w:r>
-              <w:t>CUSTAS DIVERSAS E TAXAS JUDICIAIS / TRIBUNAL DE JU</w:t>
-            </w:r>
-          </w:p>
-        </w:tc>
-        <w:tc>
-          <w:tcPr>
-            <w:tcBorders>
-              <w:top w:color="ffffff" w:space="0" w:sz="18" w:val="single"/>
-              <w:left w:color="ffffff" w:space="0" w:sz="18" w:val="single"/>
-              <w:bottom w:color="ffffff" w:space="0" w:sz="18" w:val="single"/>
-              <w:right w:color="000000" w:space="0" w:sz="0" w:val="nil"/>
-            </w:tcBorders>
-            <w:shd w:fill="fbe2d1" w:val="clear"/>
-          </w:tcPr>
-          <w:p>
-            <w:r>
-              <w:t>192,10</w:t>
-            </w:r>
-          </w:p>
-        </w:tc>
-      </w:tr>
-      <w:tr>
-        <w:trPr>
-          <w:cantSplit w:val="0"/>
-          <w:tblHeader w:val="0"/>
-        </w:trPr>
-        <w:tc>
-          <w:tcPr>
-            <w:shd w:fill="auto" w:val="clear"/>
-          </w:tcPr>
-          <w:p>
-            <w:r>
-              <w:t>Custas</w:t>
-            </w:r>
-          </w:p>
-        </w:tc>
-        <w:tc>
-          <w:tcPr/>
-          <w:p>
-            <w:r>
-              <w:t>02/02/2026</w:t>
-            </w:r>
-          </w:p>
-        </w:tc>
-        <w:tc>
-          <w:tcPr/>
-          <w:p>
-            <w:r>
-              <w:t>CIV1480434</w:t>
-            </w:r>
-          </w:p>
-        </w:tc>
-        <w:tc>
-          <w:tcPr>
-            <w:tcBorders>
-              <w:right w:color="ffffff" w:space="0" w:sz="18" w:val="single"/>
-            </w:tcBorders>
-          </w:tcPr>
-          <w:p>
-            <w:r>
-              <w:t>CUSTAS DIVERSAS E TAXAS JUDICIAIS / TRIBUNAL DE JU</w:t>
-            </w:r>
-          </w:p>
-        </w:tc>
-        <w:tc>
-          <w:tcPr>
-            <w:tcBorders>
-              <w:top w:color="ffffff" w:space="0" w:sz="18" w:val="single"/>
-              <w:left w:color="ffffff" w:space="0" w:sz="18" w:val="single"/>
-              <w:bottom w:color="ffffff" w:space="0" w:sz="18" w:val="single"/>
-              <w:right w:color="000000" w:space="0" w:sz="0" w:val="nil"/>
-            </w:tcBorders>
-            <w:shd w:fill="fbe2d1" w:val="clear"/>
-          </w:tcPr>
-          <w:p>
-            <w:r>
-              <w:t>185,10</w:t>
-            </w:r>
-          </w:p>
-        </w:tc>
-      </w:tr>
-      <w:tr>
-        <w:trPr>
-          <w:cantSplit w:val="0"/>
-          <w:tblHeader w:val="0"/>
-        </w:trPr>
-        <w:tc>
-          <w:tcPr>
-            <w:shd w:fill="auto" w:val="clear"/>
-          </w:tcPr>
-          <w:p>
-            <w:r>
-              <w:t>Custas</w:t>
-            </w:r>
-          </w:p>
-        </w:tc>
-        <w:tc>
-          <w:tcPr/>
-          <w:p>
-            <w:r>
-              <w:t>02/02/2026</w:t>
-            </w:r>
-          </w:p>
-        </w:tc>
-        <w:tc>
-          <w:tcPr/>
-          <w:p>
-            <w:r>
-              <w:t>CIV1272637</w:t>
-            </w:r>
-          </w:p>
-        </w:tc>
-        <w:tc>
-          <w:tcPr>
-            <w:tcBorders>
-              <w:right w:color="ffffff" w:space="0" w:sz="18" w:val="single"/>
-            </w:tcBorders>
-          </w:tcPr>
-          <w:p>
-            <w:r>
-              <w:t>CUSTAS DIVERSAS E TAXAS JUDICIAIS / TRIBUNAL DE JU</w:t>
-            </w:r>
-          </w:p>
-        </w:tc>
-        <w:tc>
-          <w:tcPr>
-            <w:tcBorders>
-              <w:top w:color="ffffff" w:space="0" w:sz="18" w:val="single"/>
-              <w:left w:color="ffffff" w:space="0" w:sz="18" w:val="single"/>
-              <w:bottom w:color="ffffff" w:space="0" w:sz="18" w:val="single"/>
-              <w:right w:color="000000" w:space="0" w:sz="0" w:val="nil"/>
-            </w:tcBorders>
-            <w:shd w:fill="fbe2d1" w:val="clear"/>
-          </w:tcPr>
-          <w:p>
-            <w:r>
-              <w:t>207,68</w:t>
-            </w:r>
-          </w:p>
-        </w:tc>
-      </w:tr>
-      <w:tr>
-        <w:trPr>
-          <w:cantSplit w:val="0"/>
-          <w:tblHeader w:val="0"/>
-        </w:trPr>
-        <w:tc>
-          <w:tcPr>
-            <w:shd w:fill="auto" w:val="clear"/>
-          </w:tcPr>
-          <w:p>
-            <w:r>
-              <w:t>Custas</w:t>
-            </w:r>
-          </w:p>
-        </w:tc>
-        <w:tc>
-          <w:tcPr/>
-          <w:p>
-            <w:r>
-              <w:t>02/02/2026</w:t>
-            </w:r>
-          </w:p>
-        </w:tc>
-        <w:tc>
-          <w:tcPr/>
-          <w:p>
-            <w:r>
-              <w:t>CIV1364569</w:t>
-            </w:r>
-          </w:p>
-        </w:tc>
-        <w:tc>
-          <w:tcPr>
-            <w:tcBorders>
-              <w:right w:color="ffffff" w:space="0" w:sz="18" w:val="single"/>
-            </w:tcBorders>
-          </w:tcPr>
-          <w:p>
-            <w:r>
-              <w:t>CUSTAS DIVERSAS E TAXAS JUDICIAIS / TRIBUNAL DE JU</w:t>
-            </w:r>
-          </w:p>
-        </w:tc>
-        <w:tc>
-          <w:tcPr>
-            <w:tcBorders>
-              <w:top w:color="ffffff" w:space="0" w:sz="18" w:val="single"/>
-              <w:left w:color="ffffff" w:space="0" w:sz="18" w:val="single"/>
-              <w:bottom w:color="ffffff" w:space="0" w:sz="18" w:val="single"/>
-              <w:right w:color="000000" w:space="0" w:sz="0" w:val="nil"/>
-            </w:tcBorders>
-            <w:shd w:fill="fbe2d1" w:val="clear"/>
-          </w:tcPr>
-          <w:p>
-            <w:r>
-              <w:t>500,25</w:t>
-            </w:r>
-          </w:p>
-        </w:tc>
-      </w:tr>
-      <w:tr>
-        <w:trPr>
-          <w:cantSplit w:val="0"/>
-          <w:tblHeader w:val="0"/>
-        </w:trPr>
-        <w:tc>
-          <w:tcPr>
-            <w:shd w:fill="auto" w:val="clear"/>
-          </w:tcPr>
-          <w:p>
             <w:pPr>
               <w:pStyle w:val="Heading1"/>
               <w:rPr>
@@ -2759,8 +2159,8 @@
                 <w:szCs w:val="16"/>
               </w:rPr>
             </w:pPr>
-            <w:bookmarkStart w:colFirst="0" w:colLast="0" w:name="_ofjeporj49yh" w:id="14"/>
-            <w:bookmarkEnd w:id="14"/>
+            <w:bookmarkStart w:colFirst="0" w:colLast="0" w:name="_ebfubqqh2zjb" w:id="4"/>
+            <w:bookmarkEnd w:id="4"/>
             <w:r>
               <w:rPr>
                 <w:color w:val="404040"/>
@@ -2930,8 +2330,8 @@
                 <w:szCs w:val="16"/>
               </w:rPr>
             </w:pPr>
-            <w:bookmarkStart w:colFirst="0" w:colLast="0" w:name="_f5cind9pa8zf" w:id="15"/>
-            <w:bookmarkEnd w:id="15"/>
+            <w:bookmarkStart w:colFirst="0" w:colLast="0" w:name="_bxcrtqa4xafh" w:id="5"/>
+            <w:bookmarkEnd w:id="5"/>
             <w:r>
               <w:rPr>
                 <w:color w:val="404040"/>
@@ -3101,8 +2501,8 @@
                 <w:szCs w:val="16"/>
               </w:rPr>
             </w:pPr>
-            <w:bookmarkStart w:colFirst="0" w:colLast="0" w:name="_t1d3h6rn0nct" w:id="16"/>
-            <w:bookmarkEnd w:id="16"/>
+            <w:bookmarkStart w:colFirst="0" w:colLast="0" w:name="_up6n6jj68oid" w:id="6"/>
+            <w:bookmarkEnd w:id="6"/>
             <w:r>
               <w:rPr>
                 <w:color w:val="404040"/>
@@ -3272,8 +2672,8 @@
                 <w:szCs w:val="16"/>
               </w:rPr>
             </w:pPr>
-            <w:bookmarkStart w:colFirst="0" w:colLast="0" w:name="_6on19tlxeb2m" w:id="17"/>
-            <w:bookmarkEnd w:id="17"/>
+            <w:bookmarkStart w:colFirst="0" w:colLast="0" w:name="_30n9v1q38zcw" w:id="7"/>
+            <w:bookmarkEnd w:id="7"/>
             <w:r>
               <w:rPr>
                 <w:color w:val="404040"/>
@@ -3443,8 +2843,8 @@
                 <w:szCs w:val="16"/>
               </w:rPr>
             </w:pPr>
-            <w:bookmarkStart w:colFirst="0" w:colLast="0" w:name="_4cwo4kgzeb0s" w:id="18"/>
-            <w:bookmarkEnd w:id="18"/>
+            <w:bookmarkStart w:colFirst="0" w:colLast="0" w:name="_7bppt4fwklnt" w:id="8"/>
+            <w:bookmarkEnd w:id="8"/>
             <w:r>
               <w:rPr>
                 <w:color w:val="404040"/>
@@ -3614,8 +3014,8 @@
                 <w:szCs w:val="16"/>
               </w:rPr>
             </w:pPr>
-            <w:bookmarkStart w:colFirst="0" w:colLast="0" w:name="_cc4a4yedhsqv" w:id="19"/>
-            <w:bookmarkEnd w:id="19"/>
+            <w:bookmarkStart w:colFirst="0" w:colLast="0" w:name="_uhzybp3fj983" w:id="9"/>
+            <w:bookmarkEnd w:id="9"/>
             <w:r>
               <w:rPr>
                 <w:color w:val="404040"/>
@@ -3785,8 +3185,8 @@
                 <w:szCs w:val="16"/>
               </w:rPr>
             </w:pPr>
-            <w:bookmarkStart w:colFirst="0" w:colLast="0" w:name="_63rhf2cx9ffs" w:id="20"/>
-            <w:bookmarkEnd w:id="20"/>
+            <w:bookmarkStart w:colFirst="0" w:colLast="0" w:name="_a92w015znzg1" w:id="10"/>
+            <w:bookmarkEnd w:id="10"/>
             <w:r>
               <w:rPr>
                 <w:color w:val="404040"/>
@@ -3956,8 +3356,8 @@
                 <w:szCs w:val="16"/>
               </w:rPr>
             </w:pPr>
-            <w:bookmarkStart w:colFirst="0" w:colLast="0" w:name="_mv34e6my0ku4" w:id="21"/>
-            <w:bookmarkEnd w:id="21"/>
+            <w:bookmarkStart w:colFirst="0" w:colLast="0" w:name="_urdskom0lpfu" w:id="11"/>
+            <w:bookmarkEnd w:id="11"/>
             <w:r>
               <w:rPr>
                 <w:color w:val="404040"/>
@@ -4127,8 +3527,8 @@
                 <w:szCs w:val="16"/>
               </w:rPr>
             </w:pPr>
-            <w:bookmarkStart w:colFirst="0" w:colLast="0" w:name="_mk15luoi5okf" w:id="22"/>
-            <w:bookmarkEnd w:id="22"/>
+            <w:bookmarkStart w:colFirst="0" w:colLast="0" w:name="_2rw37dvji088" w:id="12"/>
+            <w:bookmarkEnd w:id="12"/>
             <w:r>
               <w:rPr>
                 <w:color w:val="404040"/>
@@ -4298,8 +3698,8 @@
                 <w:szCs w:val="16"/>
               </w:rPr>
             </w:pPr>
-            <w:bookmarkStart w:colFirst="0" w:colLast="0" w:name="_yrfs3cplasrf" w:id="23"/>
-            <w:bookmarkEnd w:id="23"/>
+            <w:bookmarkStart w:colFirst="0" w:colLast="0" w:name="_n2wyfa8c264d" w:id="13"/>
+            <w:bookmarkEnd w:id="13"/>
             <w:r>
               <w:rPr>
                 <w:color w:val="404040"/>
@@ -4469,8 +3869,8 @@
                 <w:szCs w:val="16"/>
               </w:rPr>
             </w:pPr>
-            <w:bookmarkStart w:colFirst="0" w:colLast="0" w:name="_mhgo4jfnucw" w:id="24"/>
-            <w:bookmarkEnd w:id="24"/>
+            <w:bookmarkStart w:colFirst="0" w:colLast="0" w:name="_ofjeporj49yh" w:id="14"/>
+            <w:bookmarkEnd w:id="14"/>
             <w:r>
               <w:rPr>
                 <w:color w:val="404040"/>
@@ -4640,8 +4040,8 @@
                 <w:szCs w:val="16"/>
               </w:rPr>
             </w:pPr>
-            <w:bookmarkStart w:colFirst="0" w:colLast="0" w:name="_jpgqoighbi7l" w:id="25"/>
-            <w:bookmarkEnd w:id="25"/>
+            <w:bookmarkStart w:colFirst="0" w:colLast="0" w:name="_f5cind9pa8zf" w:id="15"/>
+            <w:bookmarkEnd w:id="15"/>
             <w:r>
               <w:rPr>
                 <w:color w:val="404040"/>
@@ -4811,8 +4211,8 @@
                 <w:szCs w:val="16"/>
               </w:rPr>
             </w:pPr>
-            <w:bookmarkStart w:colFirst="0" w:colLast="0" w:name="_hwvt8npkipj0" w:id="26"/>
-            <w:bookmarkEnd w:id="26"/>
+            <w:bookmarkStart w:colFirst="0" w:colLast="0" w:name="_t1d3h6rn0nct" w:id="16"/>
+            <w:bookmarkEnd w:id="16"/>
             <w:r>
               <w:rPr>
                 <w:color w:val="404040"/>
@@ -4982,19 +4382,16 @@
                 <w:szCs w:val="16"/>
               </w:rPr>
             </w:pPr>
-            <w:r>
-              <w:rPr>
-                <w:color w:val="808080"/>
-                <w:sz w:val="16"/>
-                <w:szCs w:val="16"/>
-                <w:rtl w:val="0"/>
-              </w:rPr>
-              <w:t xml:space="preserve">Escolher um item.</w:t>
-            </w:r>
-            <w:r>
-              <w:rPr>
-                <w:rtl w:val="0"/>
-              </w:rPr>
+            <w:bookmarkStart w:colFirst="0" w:colLast="0" w:name="_6on19tlxeb2m" w:id="17"/>
+            <w:bookmarkEnd w:id="17"/>
+            <w:r>
+              <w:rPr>
+                <w:color w:val="404040"/>
+                <w:sz w:val="16"/>
+                <w:szCs w:val="16"/>
+                <w:rtl w:val="0"/>
+              </w:rPr>
+              <w:t xml:space="preserve">Custas</w:t>
             </w:r>
           </w:p>
         </w:tc>
@@ -5156,19 +4553,16 @@
                 <w:szCs w:val="16"/>
               </w:rPr>
             </w:pPr>
-            <w:r>
-              <w:rPr>
-                <w:color w:val="808080"/>
-                <w:sz w:val="16"/>
-                <w:szCs w:val="16"/>
-                <w:rtl w:val="0"/>
-              </w:rPr>
-              <w:t xml:space="preserve">Escolher um item.</w:t>
-            </w:r>
-            <w:r>
-              <w:rPr>
-                <w:rtl w:val="0"/>
-              </w:rPr>
+            <w:bookmarkStart w:colFirst="0" w:colLast="0" w:name="_4cwo4kgzeb0s" w:id="18"/>
+            <w:bookmarkEnd w:id="18"/>
+            <w:r>
+              <w:rPr>
+                <w:color w:val="404040"/>
+                <w:sz w:val="16"/>
+                <w:szCs w:val="16"/>
+                <w:rtl w:val="0"/>
+              </w:rPr>
+              <w:t xml:space="preserve">Custas</w:t>
             </w:r>
           </w:p>
         </w:tc>
@@ -5330,19 +4724,16 @@
                 <w:szCs w:val="16"/>
               </w:rPr>
             </w:pPr>
-            <w:r>
-              <w:rPr>
-                <w:color w:val="808080"/>
-                <w:sz w:val="16"/>
-                <w:szCs w:val="16"/>
-                <w:rtl w:val="0"/>
-              </w:rPr>
-              <w:t xml:space="preserve">Escolher um item.</w:t>
-            </w:r>
-            <w:r>
-              <w:rPr>
-                <w:rtl w:val="0"/>
-              </w:rPr>
+            <w:bookmarkStart w:colFirst="0" w:colLast="0" w:name="_cc4a4yedhsqv" w:id="19"/>
+            <w:bookmarkEnd w:id="19"/>
+            <w:r>
+              <w:rPr>
+                <w:color w:val="404040"/>
+                <w:sz w:val="16"/>
+                <w:szCs w:val="16"/>
+                <w:rtl w:val="0"/>
+              </w:rPr>
+              <w:t xml:space="preserve">Custas</w:t>
             </w:r>
           </w:p>
         </w:tc>
@@ -5504,19 +4895,16 @@
                 <w:szCs w:val="16"/>
               </w:rPr>
             </w:pPr>
-            <w:r>
-              <w:rPr>
-                <w:color w:val="808080"/>
-                <w:sz w:val="16"/>
-                <w:szCs w:val="16"/>
-                <w:rtl w:val="0"/>
-              </w:rPr>
-              <w:t xml:space="preserve">Escolher um item.</w:t>
-            </w:r>
-            <w:r>
-              <w:rPr>
-                <w:rtl w:val="0"/>
-              </w:rPr>
+            <w:bookmarkStart w:colFirst="0" w:colLast="0" w:name="_63rhf2cx9ffs" w:id="20"/>
+            <w:bookmarkEnd w:id="20"/>
+            <w:r>
+              <w:rPr>
+                <w:color w:val="404040"/>
+                <w:sz w:val="16"/>
+                <w:szCs w:val="16"/>
+                <w:rtl w:val="0"/>
+              </w:rPr>
+              <w:t xml:space="preserve">Custas</w:t>
             </w:r>
           </w:p>
         </w:tc>
@@ -5678,19 +5066,16 @@
                 <w:szCs w:val="16"/>
               </w:rPr>
             </w:pPr>
-            <w:r>
-              <w:rPr>
-                <w:color w:val="808080"/>
-                <w:sz w:val="16"/>
-                <w:szCs w:val="16"/>
-                <w:rtl w:val="0"/>
-              </w:rPr>
-              <w:t xml:space="preserve">Escolher um item.</w:t>
-            </w:r>
-            <w:r>
-              <w:rPr>
-                <w:rtl w:val="0"/>
-              </w:rPr>
+            <w:bookmarkStart w:colFirst="0" w:colLast="0" w:name="_mv34e6my0ku4" w:id="21"/>
+            <w:bookmarkEnd w:id="21"/>
+            <w:r>
+              <w:rPr>
+                <w:color w:val="404040"/>
+                <w:sz w:val="16"/>
+                <w:szCs w:val="16"/>
+                <w:rtl w:val="0"/>
+              </w:rPr>
+              <w:t xml:space="preserve">Custas</w:t>
             </w:r>
           </w:p>
         </w:tc>
@@ -5852,19 +5237,16 @@
                 <w:szCs w:val="16"/>
               </w:rPr>
             </w:pPr>
-            <w:r>
-              <w:rPr>
-                <w:color w:val="808080"/>
-                <w:sz w:val="16"/>
-                <w:szCs w:val="16"/>
-                <w:rtl w:val="0"/>
-              </w:rPr>
-              <w:t xml:space="preserve">Escolher um item.</w:t>
-            </w:r>
-            <w:r>
-              <w:rPr>
-                <w:rtl w:val="0"/>
-              </w:rPr>
+            <w:bookmarkStart w:colFirst="0" w:colLast="0" w:name="_mk15luoi5okf" w:id="22"/>
+            <w:bookmarkEnd w:id="22"/>
+            <w:r>
+              <w:rPr>
+                <w:color w:val="404040"/>
+                <w:sz w:val="16"/>
+                <w:szCs w:val="16"/>
+                <w:rtl w:val="0"/>
+              </w:rPr>
+              <w:t xml:space="preserve">Custas</w:t>
             </w:r>
           </w:p>
         </w:tc>
@@ -6026,19 +5408,16 @@
                 <w:szCs w:val="16"/>
               </w:rPr>
             </w:pPr>
-            <w:r>
-              <w:rPr>
-                <w:color w:val="808080"/>
-                <w:sz w:val="16"/>
-                <w:szCs w:val="16"/>
-                <w:rtl w:val="0"/>
-              </w:rPr>
-              <w:t xml:space="preserve">Escolher um item.</w:t>
-            </w:r>
-            <w:r>
-              <w:rPr>
-                <w:rtl w:val="0"/>
-              </w:rPr>
+            <w:bookmarkStart w:colFirst="0" w:colLast="0" w:name="_yrfs3cplasrf" w:id="23"/>
+            <w:bookmarkEnd w:id="23"/>
+            <w:r>
+              <w:rPr>
+                <w:color w:val="404040"/>
+                <w:sz w:val="16"/>
+                <w:szCs w:val="16"/>
+                <w:rtl w:val="0"/>
+              </w:rPr>
+              <w:t xml:space="preserve">Custas</w:t>
             </w:r>
           </w:p>
         </w:tc>
@@ -6200,19 +5579,16 @@
                 <w:szCs w:val="16"/>
               </w:rPr>
             </w:pPr>
-            <w:r>
-              <w:rPr>
-                <w:color w:val="808080"/>
-                <w:sz w:val="16"/>
-                <w:szCs w:val="16"/>
-                <w:rtl w:val="0"/>
-              </w:rPr>
-              <w:t xml:space="preserve">Escolher um item.</w:t>
-            </w:r>
-            <w:r>
-              <w:rPr>
-                <w:rtl w:val="0"/>
-              </w:rPr>
+            <w:bookmarkStart w:colFirst="0" w:colLast="0" w:name="_mhgo4jfnucw" w:id="24"/>
+            <w:bookmarkEnd w:id="24"/>
+            <w:r>
+              <w:rPr>
+                <w:color w:val="404040"/>
+                <w:sz w:val="16"/>
+                <w:szCs w:val="16"/>
+                <w:rtl w:val="0"/>
+              </w:rPr>
+              <w:t xml:space="preserve">Custas</w:t>
             </w:r>
           </w:p>
         </w:tc>
@@ -6374,19 +5750,16 @@
                 <w:szCs w:val="16"/>
               </w:rPr>
             </w:pPr>
-            <w:r>
-              <w:rPr>
-                <w:color w:val="808080"/>
-                <w:sz w:val="16"/>
-                <w:szCs w:val="16"/>
-                <w:rtl w:val="0"/>
-              </w:rPr>
-              <w:t xml:space="preserve">Escolher um item.</w:t>
-            </w:r>
-            <w:r>
-              <w:rPr>
-                <w:rtl w:val="0"/>
-              </w:rPr>
+            <w:bookmarkStart w:colFirst="0" w:colLast="0" w:name="_jpgqoighbi7l" w:id="25"/>
+            <w:bookmarkEnd w:id="25"/>
+            <w:r>
+              <w:rPr>
+                <w:color w:val="404040"/>
+                <w:sz w:val="16"/>
+                <w:szCs w:val="16"/>
+                <w:rtl w:val="0"/>
+              </w:rPr>
+              <w:t xml:space="preserve">Custas</w:t>
             </w:r>
           </w:p>
         </w:tc>
@@ -6548,19 +5921,16 @@
                 <w:szCs w:val="16"/>
               </w:rPr>
             </w:pPr>
-            <w:r>
-              <w:rPr>
-                <w:color w:val="808080"/>
-                <w:sz w:val="16"/>
-                <w:szCs w:val="16"/>
-                <w:rtl w:val="0"/>
-              </w:rPr>
-              <w:t xml:space="preserve">Escolher um item.</w:t>
-            </w:r>
-            <w:r>
-              <w:rPr>
-                <w:rtl w:val="0"/>
-              </w:rPr>
+            <w:bookmarkStart w:colFirst="0" w:colLast="0" w:name="_hwvt8npkipj0" w:id="26"/>
+            <w:bookmarkEnd w:id="26"/>
+            <w:r>
+              <w:rPr>
+                <w:color w:val="404040"/>
+                <w:sz w:val="16"/>
+                <w:szCs w:val="16"/>
+                <w:rtl w:val="0"/>
+              </w:rPr>
+              <w:t xml:space="preserve">Custas</w:t>
             </w:r>
           </w:p>
         </w:tc>
@@ -10361,6 +9731,1746 @@
       <w:tr>
         <w:trPr>
           <w:cantSplit w:val="0"/>
+          <w:tblHeader w:val="0"/>
+        </w:trPr>
+        <w:tc>
+          <w:tcPr>
+            <w:shd w:fill="auto" w:val="clear"/>
+          </w:tcPr>
+          <w:p>
+            <w:pPr>
+              <w:pStyle w:val="Heading1"/>
+              <w:rPr>
+                <w:color w:val="404040"/>
+                <w:sz w:val="16"/>
+                <w:szCs w:val="16"/>
+              </w:rPr>
+            </w:pPr>
+            <w:r>
+              <w:rPr>
+                <w:color w:val="808080"/>
+                <w:sz w:val="16"/>
+                <w:szCs w:val="16"/>
+                <w:rtl w:val="0"/>
+              </w:rPr>
+              <w:t xml:space="preserve">Escolher um item.</w:t>
+            </w:r>
+            <w:r>
+              <w:rPr>
+                <w:rtl w:val="0"/>
+              </w:rPr>
+            </w:r>
+          </w:p>
+        </w:tc>
+        <w:tc>
+          <w:tcPr/>
+          <w:p>
+            <w:pPr>
+              <w:rPr>
+                <w:color w:val="404040"/>
+                <w:sz w:val="16"/>
+                <w:szCs w:val="16"/>
+              </w:rPr>
+            </w:pPr>
+            <w:r>
+              <w:rPr>
+                <w:color w:val="808080"/>
+                <w:sz w:val="16"/>
+                <w:szCs w:val="16"/>
+                <w:rtl w:val="0"/>
+              </w:rPr>
+              <w:t xml:space="preserve">Inserir data</w:t>
+            </w:r>
+            <w:r>
+              <w:rPr>
+                <w:rtl w:val="0"/>
+              </w:rPr>
+            </w:r>
+          </w:p>
+        </w:tc>
+        <w:tc>
+          <w:tcPr/>
+          <w:p>
+            <w:pPr>
+              <w:rPr>
+                <w:color w:val="404040"/>
+                <w:sz w:val="16"/>
+                <w:szCs w:val="16"/>
+              </w:rPr>
+            </w:pPr>
+            <w:r>
+              <w:rPr>
+                <w:color w:val="404040"/>
+                <w:sz w:val="16"/>
+                <w:szCs w:val="16"/>
+                <w:rtl w:val="0"/>
+              </w:rPr>
+              <w:t xml:space="preserve">Insira aqui a CIV</w:t>
+            </w:r>
+          </w:p>
+        </w:tc>
+        <w:tc>
+          <w:tcPr>
+            <w:tcBorders>
+              <w:right w:color="ffffff" w:space="0" w:sz="18" w:val="single"/>
+            </w:tcBorders>
+          </w:tcPr>
+          <w:p>
+            <w:pPr>
+              <w:rPr>
+                <w:color w:val="404040"/>
+              </w:rPr>
+            </w:pPr>
+            <w:r>
+              <w:rPr>
+                <w:color w:val="404040"/>
+                <w:sz w:val="14"/>
+                <w:szCs w:val="14"/>
+                <w:rtl w:val="0"/>
+              </w:rPr>
+              <w:t xml:space="preserve">Clique ou toque aqui para inserir o texto.</w:t>
+            </w:r>
+            <w:r>
+              <w:rPr>
+                <w:rtl w:val="0"/>
+              </w:rPr>
+            </w:r>
+          </w:p>
+        </w:tc>
+        <w:tc>
+          <w:tcPr>
+            <w:tcBorders>
+              <w:top w:color="ffffff" w:space="0" w:sz="18" w:val="single"/>
+              <w:left w:color="ffffff" w:space="0" w:sz="18" w:val="single"/>
+              <w:bottom w:color="ffffff" w:space="0" w:sz="18" w:val="single"/>
+              <w:right w:color="000000" w:space="0" w:sz="0" w:val="nil"/>
+            </w:tcBorders>
+            <w:shd w:fill="fbe2d1" w:val="clear"/>
+          </w:tcPr>
+          <w:p>
+            <w:pPr>
+              <w:keepNext w:val="0"/>
+              <w:keepLines w:val="0"/>
+              <w:pageBreakBefore w:val="0"/>
+              <w:widowControl w:val="1"/>
+              <w:pBdr>
+                <w:top w:space="0" w:sz="0" w:val="nil"/>
+                <w:left w:space="0" w:sz="0" w:val="nil"/>
+                <w:bottom w:space="0" w:sz="0" w:val="nil"/>
+                <w:right w:space="0" w:sz="0" w:val="nil"/>
+                <w:between w:space="0" w:sz="0" w:val="nil"/>
+              </w:pBdr>
+              <w:shd w:fill="auto" w:val="clear"/>
+              <w:spacing w:after="20" w:before="20" w:line="240" w:lineRule="auto"/>
+              <w:ind w:left="0" w:right="0" w:firstLine="0"/>
+              <w:jc w:val="right"/>
+              <w:rPr>
+                <w:rFonts w:ascii="Century Gothic" w:cs="Century Gothic" w:eastAsia="Century Gothic" w:hAnsi="Century Gothic"/>
+                <w:b w:val="0"/>
+                <w:bCs w:val="0"/>
+                <w:i w:val="0"/>
+                <w:iCs w:val="0"/>
+                <w:smallCaps w:val="0"/>
+                <w:strike w:val="0"/>
+                <w:color w:val="404040"/>
+                <w:sz w:val="16"/>
+                <w:szCs w:val="16"/>
+                <w:u w:val="none"/>
+                <w:shd w:fill="auto" w:val="clear"/>
+                <w:vertAlign w:val="baseline"/>
+              </w:rPr>
+            </w:pPr>
+            <w:r>
+              <w:rPr>
+                <w:rFonts w:ascii="Century Gothic" w:cs="Century Gothic" w:eastAsia="Century Gothic" w:hAnsi="Century Gothic"/>
+                <w:b w:val="0"/>
+                <w:bCs w:val="0"/>
+                <w:i w:val="0"/>
+                <w:iCs w:val="0"/>
+                <w:smallCaps w:val="0"/>
+                <w:strike w:val="0"/>
+                <w:color w:val="404040"/>
+                <w:sz w:val="16"/>
+                <w:szCs w:val="16"/>
+                <w:u w:val="none"/>
+                <w:shd w:fill="auto" w:val="clear"/>
+                <w:vertAlign w:val="baseline"/>
+                <w:rtl w:val="0"/>
+              </w:rPr>
+              <w:t xml:space="preserve">Insira aqui o valor</w:t>
+            </w:r>
+          </w:p>
+        </w:tc>
+      </w:tr>
+      <w:tr>
+        <w:trPr>
+          <w:cantSplit w:val="0"/>
+          <w:tblHeader w:val="0"/>
+        </w:trPr>
+        <w:tc>
+          <w:tcPr>
+            <w:shd w:fill="auto" w:val="clear"/>
+          </w:tcPr>
+          <w:p>
+            <w:pPr>
+              <w:pStyle w:val="Heading1"/>
+              <w:rPr>
+                <w:color w:val="404040"/>
+                <w:sz w:val="16"/>
+                <w:szCs w:val="16"/>
+              </w:rPr>
+            </w:pPr>
+            <w:r>
+              <w:rPr>
+                <w:color w:val="808080"/>
+                <w:sz w:val="16"/>
+                <w:szCs w:val="16"/>
+                <w:rtl w:val="0"/>
+              </w:rPr>
+              <w:t xml:space="preserve">Escolher um item.</w:t>
+            </w:r>
+            <w:r>
+              <w:rPr>
+                <w:rtl w:val="0"/>
+              </w:rPr>
+            </w:r>
+          </w:p>
+        </w:tc>
+        <w:tc>
+          <w:tcPr/>
+          <w:p>
+            <w:pPr>
+              <w:rPr>
+                <w:color w:val="404040"/>
+                <w:sz w:val="16"/>
+                <w:szCs w:val="16"/>
+              </w:rPr>
+            </w:pPr>
+            <w:r>
+              <w:rPr>
+                <w:color w:val="808080"/>
+                <w:sz w:val="16"/>
+                <w:szCs w:val="16"/>
+                <w:rtl w:val="0"/>
+              </w:rPr>
+              <w:t xml:space="preserve">Inserir data</w:t>
+            </w:r>
+            <w:r>
+              <w:rPr>
+                <w:rtl w:val="0"/>
+              </w:rPr>
+            </w:r>
+          </w:p>
+        </w:tc>
+        <w:tc>
+          <w:tcPr/>
+          <w:p>
+            <w:pPr>
+              <w:rPr>
+                <w:color w:val="404040"/>
+                <w:sz w:val="16"/>
+                <w:szCs w:val="16"/>
+              </w:rPr>
+            </w:pPr>
+            <w:r>
+              <w:rPr>
+                <w:color w:val="404040"/>
+                <w:sz w:val="16"/>
+                <w:szCs w:val="16"/>
+                <w:rtl w:val="0"/>
+              </w:rPr>
+              <w:t xml:space="preserve">Insira aqui a CIV</w:t>
+            </w:r>
+          </w:p>
+        </w:tc>
+        <w:tc>
+          <w:tcPr>
+            <w:tcBorders>
+              <w:right w:color="ffffff" w:space="0" w:sz="18" w:val="single"/>
+            </w:tcBorders>
+          </w:tcPr>
+          <w:p>
+            <w:pPr>
+              <w:rPr>
+                <w:color w:val="404040"/>
+              </w:rPr>
+            </w:pPr>
+            <w:r>
+              <w:rPr>
+                <w:color w:val="404040"/>
+                <w:sz w:val="14"/>
+                <w:szCs w:val="14"/>
+                <w:rtl w:val="0"/>
+              </w:rPr>
+              <w:t xml:space="preserve">Clique ou toque aqui para inserir o texto.</w:t>
+            </w:r>
+            <w:r>
+              <w:rPr>
+                <w:rtl w:val="0"/>
+              </w:rPr>
+            </w:r>
+          </w:p>
+        </w:tc>
+        <w:tc>
+          <w:tcPr>
+            <w:tcBorders>
+              <w:top w:color="ffffff" w:space="0" w:sz="18" w:val="single"/>
+              <w:left w:color="ffffff" w:space="0" w:sz="18" w:val="single"/>
+              <w:bottom w:color="ffffff" w:space="0" w:sz="18" w:val="single"/>
+              <w:right w:color="000000" w:space="0" w:sz="0" w:val="nil"/>
+            </w:tcBorders>
+            <w:shd w:fill="fbe2d1" w:val="clear"/>
+          </w:tcPr>
+          <w:p>
+            <w:pPr>
+              <w:keepNext w:val="0"/>
+              <w:keepLines w:val="0"/>
+              <w:pageBreakBefore w:val="0"/>
+              <w:widowControl w:val="1"/>
+              <w:pBdr>
+                <w:top w:space="0" w:sz="0" w:val="nil"/>
+                <w:left w:space="0" w:sz="0" w:val="nil"/>
+                <w:bottom w:space="0" w:sz="0" w:val="nil"/>
+                <w:right w:space="0" w:sz="0" w:val="nil"/>
+                <w:between w:space="0" w:sz="0" w:val="nil"/>
+              </w:pBdr>
+              <w:shd w:fill="auto" w:val="clear"/>
+              <w:spacing w:after="20" w:before="20" w:line="240" w:lineRule="auto"/>
+              <w:ind w:left="0" w:right="0" w:firstLine="0"/>
+              <w:jc w:val="right"/>
+              <w:rPr>
+                <w:rFonts w:ascii="Century Gothic" w:cs="Century Gothic" w:eastAsia="Century Gothic" w:hAnsi="Century Gothic"/>
+                <w:b w:val="0"/>
+                <w:bCs w:val="0"/>
+                <w:i w:val="0"/>
+                <w:iCs w:val="0"/>
+                <w:smallCaps w:val="0"/>
+                <w:strike w:val="0"/>
+                <w:color w:val="404040"/>
+                <w:sz w:val="16"/>
+                <w:szCs w:val="16"/>
+                <w:u w:val="none"/>
+                <w:shd w:fill="auto" w:val="clear"/>
+                <w:vertAlign w:val="baseline"/>
+              </w:rPr>
+            </w:pPr>
+            <w:r>
+              <w:rPr>
+                <w:rFonts w:ascii="Century Gothic" w:cs="Century Gothic" w:eastAsia="Century Gothic" w:hAnsi="Century Gothic"/>
+                <w:b w:val="0"/>
+                <w:bCs w:val="0"/>
+                <w:i w:val="0"/>
+                <w:iCs w:val="0"/>
+                <w:smallCaps w:val="0"/>
+                <w:strike w:val="0"/>
+                <w:color w:val="404040"/>
+                <w:sz w:val="16"/>
+                <w:szCs w:val="16"/>
+                <w:u w:val="none"/>
+                <w:shd w:fill="auto" w:val="clear"/>
+                <w:vertAlign w:val="baseline"/>
+                <w:rtl w:val="0"/>
+              </w:rPr>
+              <w:t xml:space="preserve">Insira aqui o valor</w:t>
+            </w:r>
+          </w:p>
+        </w:tc>
+      </w:tr>
+      <w:tr>
+        <w:trPr>
+          <w:cantSplit w:val="0"/>
+          <w:tblHeader w:val="0"/>
+        </w:trPr>
+        <w:tc>
+          <w:tcPr>
+            <w:shd w:fill="auto" w:val="clear"/>
+          </w:tcPr>
+          <w:p>
+            <w:pPr>
+              <w:pStyle w:val="Heading1"/>
+              <w:rPr>
+                <w:color w:val="404040"/>
+                <w:sz w:val="16"/>
+                <w:szCs w:val="16"/>
+              </w:rPr>
+            </w:pPr>
+            <w:r>
+              <w:rPr>
+                <w:color w:val="808080"/>
+                <w:sz w:val="16"/>
+                <w:szCs w:val="16"/>
+                <w:rtl w:val="0"/>
+              </w:rPr>
+              <w:t xml:space="preserve">Escolher um item.</w:t>
+            </w:r>
+            <w:r>
+              <w:rPr>
+                <w:rtl w:val="0"/>
+              </w:rPr>
+            </w:r>
+          </w:p>
+        </w:tc>
+        <w:tc>
+          <w:tcPr/>
+          <w:p>
+            <w:pPr>
+              <w:rPr>
+                <w:color w:val="404040"/>
+                <w:sz w:val="16"/>
+                <w:szCs w:val="16"/>
+              </w:rPr>
+            </w:pPr>
+            <w:r>
+              <w:rPr>
+                <w:color w:val="808080"/>
+                <w:sz w:val="16"/>
+                <w:szCs w:val="16"/>
+                <w:rtl w:val="0"/>
+              </w:rPr>
+              <w:t xml:space="preserve">Inserir data</w:t>
+            </w:r>
+            <w:r>
+              <w:rPr>
+                <w:rtl w:val="0"/>
+              </w:rPr>
+            </w:r>
+          </w:p>
+        </w:tc>
+        <w:tc>
+          <w:tcPr/>
+          <w:p>
+            <w:pPr>
+              <w:rPr>
+                <w:color w:val="404040"/>
+                <w:sz w:val="16"/>
+                <w:szCs w:val="16"/>
+              </w:rPr>
+            </w:pPr>
+            <w:r>
+              <w:rPr>
+                <w:color w:val="404040"/>
+                <w:sz w:val="16"/>
+                <w:szCs w:val="16"/>
+                <w:rtl w:val="0"/>
+              </w:rPr>
+              <w:t xml:space="preserve">Insira aqui a CIV</w:t>
+            </w:r>
+          </w:p>
+        </w:tc>
+        <w:tc>
+          <w:tcPr>
+            <w:tcBorders>
+              <w:right w:color="ffffff" w:space="0" w:sz="18" w:val="single"/>
+            </w:tcBorders>
+          </w:tcPr>
+          <w:p>
+            <w:pPr>
+              <w:rPr>
+                <w:color w:val="404040"/>
+              </w:rPr>
+            </w:pPr>
+            <w:r>
+              <w:rPr>
+                <w:color w:val="404040"/>
+                <w:sz w:val="14"/>
+                <w:szCs w:val="14"/>
+                <w:rtl w:val="0"/>
+              </w:rPr>
+              <w:t xml:space="preserve">Clique ou toque aqui para inserir o texto.</w:t>
+            </w:r>
+            <w:r>
+              <w:rPr>
+                <w:rtl w:val="0"/>
+              </w:rPr>
+            </w:r>
+          </w:p>
+        </w:tc>
+        <w:tc>
+          <w:tcPr>
+            <w:tcBorders>
+              <w:top w:color="ffffff" w:space="0" w:sz="18" w:val="single"/>
+              <w:left w:color="ffffff" w:space="0" w:sz="18" w:val="single"/>
+              <w:bottom w:color="ffffff" w:space="0" w:sz="18" w:val="single"/>
+              <w:right w:color="000000" w:space="0" w:sz="0" w:val="nil"/>
+            </w:tcBorders>
+            <w:shd w:fill="fbe2d1" w:val="clear"/>
+          </w:tcPr>
+          <w:p>
+            <w:pPr>
+              <w:keepNext w:val="0"/>
+              <w:keepLines w:val="0"/>
+              <w:pageBreakBefore w:val="0"/>
+              <w:widowControl w:val="1"/>
+              <w:pBdr>
+                <w:top w:space="0" w:sz="0" w:val="nil"/>
+                <w:left w:space="0" w:sz="0" w:val="nil"/>
+                <w:bottom w:space="0" w:sz="0" w:val="nil"/>
+                <w:right w:space="0" w:sz="0" w:val="nil"/>
+                <w:between w:space="0" w:sz="0" w:val="nil"/>
+              </w:pBdr>
+              <w:shd w:fill="auto" w:val="clear"/>
+              <w:spacing w:after="20" w:before="20" w:line="240" w:lineRule="auto"/>
+              <w:ind w:left="0" w:right="0" w:firstLine="0"/>
+              <w:jc w:val="right"/>
+              <w:rPr>
+                <w:rFonts w:ascii="Century Gothic" w:cs="Century Gothic" w:eastAsia="Century Gothic" w:hAnsi="Century Gothic"/>
+                <w:b w:val="0"/>
+                <w:bCs w:val="0"/>
+                <w:i w:val="0"/>
+                <w:iCs w:val="0"/>
+                <w:smallCaps w:val="0"/>
+                <w:strike w:val="0"/>
+                <w:color w:val="404040"/>
+                <w:sz w:val="16"/>
+                <w:szCs w:val="16"/>
+                <w:u w:val="none"/>
+                <w:shd w:fill="auto" w:val="clear"/>
+                <w:vertAlign w:val="baseline"/>
+              </w:rPr>
+            </w:pPr>
+            <w:r>
+              <w:rPr>
+                <w:rFonts w:ascii="Century Gothic" w:cs="Century Gothic" w:eastAsia="Century Gothic" w:hAnsi="Century Gothic"/>
+                <w:b w:val="0"/>
+                <w:bCs w:val="0"/>
+                <w:i w:val="0"/>
+                <w:iCs w:val="0"/>
+                <w:smallCaps w:val="0"/>
+                <w:strike w:val="0"/>
+                <w:color w:val="404040"/>
+                <w:sz w:val="16"/>
+                <w:szCs w:val="16"/>
+                <w:u w:val="none"/>
+                <w:shd w:fill="auto" w:val="clear"/>
+                <w:vertAlign w:val="baseline"/>
+                <w:rtl w:val="0"/>
+              </w:rPr>
+              <w:t xml:space="preserve">Insira aqui o valor</w:t>
+            </w:r>
+          </w:p>
+        </w:tc>
+      </w:tr>
+      <w:tr>
+        <w:trPr>
+          <w:cantSplit w:val="0"/>
+          <w:tblHeader w:val="0"/>
+        </w:trPr>
+        <w:tc>
+          <w:tcPr>
+            <w:shd w:fill="auto" w:val="clear"/>
+          </w:tcPr>
+          <w:p>
+            <w:pPr>
+              <w:pStyle w:val="Heading1"/>
+              <w:rPr>
+                <w:color w:val="404040"/>
+                <w:sz w:val="16"/>
+                <w:szCs w:val="16"/>
+              </w:rPr>
+            </w:pPr>
+            <w:r>
+              <w:rPr>
+                <w:color w:val="808080"/>
+                <w:sz w:val="16"/>
+                <w:szCs w:val="16"/>
+                <w:rtl w:val="0"/>
+              </w:rPr>
+              <w:t xml:space="preserve">Escolher um item.</w:t>
+            </w:r>
+            <w:r>
+              <w:rPr>
+                <w:rtl w:val="0"/>
+              </w:rPr>
+            </w:r>
+          </w:p>
+        </w:tc>
+        <w:tc>
+          <w:tcPr/>
+          <w:p>
+            <w:pPr>
+              <w:rPr>
+                <w:color w:val="404040"/>
+                <w:sz w:val="16"/>
+                <w:szCs w:val="16"/>
+              </w:rPr>
+            </w:pPr>
+            <w:r>
+              <w:rPr>
+                <w:color w:val="808080"/>
+                <w:sz w:val="16"/>
+                <w:szCs w:val="16"/>
+                <w:rtl w:val="0"/>
+              </w:rPr>
+              <w:t xml:space="preserve">Inserir data</w:t>
+            </w:r>
+            <w:r>
+              <w:rPr>
+                <w:rtl w:val="0"/>
+              </w:rPr>
+            </w:r>
+          </w:p>
+        </w:tc>
+        <w:tc>
+          <w:tcPr/>
+          <w:p>
+            <w:pPr>
+              <w:rPr>
+                <w:color w:val="404040"/>
+                <w:sz w:val="16"/>
+                <w:szCs w:val="16"/>
+              </w:rPr>
+            </w:pPr>
+            <w:r>
+              <w:rPr>
+                <w:color w:val="404040"/>
+                <w:sz w:val="16"/>
+                <w:szCs w:val="16"/>
+                <w:rtl w:val="0"/>
+              </w:rPr>
+              <w:t xml:space="preserve">Insira aqui a CIV</w:t>
+            </w:r>
+          </w:p>
+        </w:tc>
+        <w:tc>
+          <w:tcPr>
+            <w:tcBorders>
+              <w:right w:color="ffffff" w:space="0" w:sz="18" w:val="single"/>
+            </w:tcBorders>
+          </w:tcPr>
+          <w:p>
+            <w:pPr>
+              <w:rPr>
+                <w:color w:val="404040"/>
+              </w:rPr>
+            </w:pPr>
+            <w:r>
+              <w:rPr>
+                <w:color w:val="404040"/>
+                <w:sz w:val="14"/>
+                <w:szCs w:val="14"/>
+                <w:rtl w:val="0"/>
+              </w:rPr>
+              <w:t xml:space="preserve">Clique ou toque aqui para inserir o texto.</w:t>
+            </w:r>
+            <w:r>
+              <w:rPr>
+                <w:rtl w:val="0"/>
+              </w:rPr>
+            </w:r>
+          </w:p>
+        </w:tc>
+        <w:tc>
+          <w:tcPr>
+            <w:tcBorders>
+              <w:top w:color="ffffff" w:space="0" w:sz="18" w:val="single"/>
+              <w:left w:color="ffffff" w:space="0" w:sz="18" w:val="single"/>
+              <w:bottom w:color="ffffff" w:space="0" w:sz="18" w:val="single"/>
+              <w:right w:color="000000" w:space="0" w:sz="0" w:val="nil"/>
+            </w:tcBorders>
+            <w:shd w:fill="fbe2d1" w:val="clear"/>
+          </w:tcPr>
+          <w:p>
+            <w:pPr>
+              <w:keepNext w:val="0"/>
+              <w:keepLines w:val="0"/>
+              <w:pageBreakBefore w:val="0"/>
+              <w:widowControl w:val="1"/>
+              <w:pBdr>
+                <w:top w:space="0" w:sz="0" w:val="nil"/>
+                <w:left w:space="0" w:sz="0" w:val="nil"/>
+                <w:bottom w:space="0" w:sz="0" w:val="nil"/>
+                <w:right w:space="0" w:sz="0" w:val="nil"/>
+                <w:between w:space="0" w:sz="0" w:val="nil"/>
+              </w:pBdr>
+              <w:shd w:fill="auto" w:val="clear"/>
+              <w:spacing w:after="20" w:before="20" w:line="240" w:lineRule="auto"/>
+              <w:ind w:left="0" w:right="0" w:firstLine="0"/>
+              <w:jc w:val="right"/>
+              <w:rPr>
+                <w:rFonts w:ascii="Century Gothic" w:cs="Century Gothic" w:eastAsia="Century Gothic" w:hAnsi="Century Gothic"/>
+                <w:b w:val="0"/>
+                <w:bCs w:val="0"/>
+                <w:i w:val="0"/>
+                <w:iCs w:val="0"/>
+                <w:smallCaps w:val="0"/>
+                <w:strike w:val="0"/>
+                <w:color w:val="404040"/>
+                <w:sz w:val="16"/>
+                <w:szCs w:val="16"/>
+                <w:u w:val="none"/>
+                <w:shd w:fill="auto" w:val="clear"/>
+                <w:vertAlign w:val="baseline"/>
+              </w:rPr>
+            </w:pPr>
+            <w:r>
+              <w:rPr>
+                <w:rFonts w:ascii="Century Gothic" w:cs="Century Gothic" w:eastAsia="Century Gothic" w:hAnsi="Century Gothic"/>
+                <w:b w:val="0"/>
+                <w:bCs w:val="0"/>
+                <w:i w:val="0"/>
+                <w:iCs w:val="0"/>
+                <w:smallCaps w:val="0"/>
+                <w:strike w:val="0"/>
+                <w:color w:val="404040"/>
+                <w:sz w:val="16"/>
+                <w:szCs w:val="16"/>
+                <w:u w:val="none"/>
+                <w:shd w:fill="auto" w:val="clear"/>
+                <w:vertAlign w:val="baseline"/>
+                <w:rtl w:val="0"/>
+              </w:rPr>
+              <w:t xml:space="preserve">Insira aqui o valor</w:t>
+            </w:r>
+          </w:p>
+        </w:tc>
+      </w:tr>
+      <w:tr>
+        <w:trPr>
+          <w:cantSplit w:val="0"/>
+          <w:tblHeader w:val="0"/>
+        </w:trPr>
+        <w:tc>
+          <w:tcPr>
+            <w:shd w:fill="auto" w:val="clear"/>
+          </w:tcPr>
+          <w:p>
+            <w:pPr>
+              <w:pStyle w:val="Heading1"/>
+              <w:rPr>
+                <w:color w:val="404040"/>
+                <w:sz w:val="16"/>
+                <w:szCs w:val="16"/>
+              </w:rPr>
+            </w:pPr>
+            <w:r>
+              <w:rPr>
+                <w:color w:val="808080"/>
+                <w:sz w:val="16"/>
+                <w:szCs w:val="16"/>
+                <w:rtl w:val="0"/>
+              </w:rPr>
+              <w:t xml:space="preserve">Escolher um item.</w:t>
+            </w:r>
+            <w:r>
+              <w:rPr>
+                <w:rtl w:val="0"/>
+              </w:rPr>
+            </w:r>
+          </w:p>
+        </w:tc>
+        <w:tc>
+          <w:tcPr/>
+          <w:p>
+            <w:pPr>
+              <w:rPr>
+                <w:color w:val="404040"/>
+                <w:sz w:val="16"/>
+                <w:szCs w:val="16"/>
+              </w:rPr>
+            </w:pPr>
+            <w:r>
+              <w:rPr>
+                <w:color w:val="808080"/>
+                <w:sz w:val="16"/>
+                <w:szCs w:val="16"/>
+                <w:rtl w:val="0"/>
+              </w:rPr>
+              <w:t xml:space="preserve">Inserir data</w:t>
+            </w:r>
+            <w:r>
+              <w:rPr>
+                <w:rtl w:val="0"/>
+              </w:rPr>
+            </w:r>
+          </w:p>
+        </w:tc>
+        <w:tc>
+          <w:tcPr/>
+          <w:p>
+            <w:pPr>
+              <w:rPr>
+                <w:color w:val="404040"/>
+                <w:sz w:val="16"/>
+                <w:szCs w:val="16"/>
+              </w:rPr>
+            </w:pPr>
+            <w:r>
+              <w:rPr>
+                <w:color w:val="404040"/>
+                <w:sz w:val="16"/>
+                <w:szCs w:val="16"/>
+                <w:rtl w:val="0"/>
+              </w:rPr>
+              <w:t xml:space="preserve">Insira aqui a CIV</w:t>
+            </w:r>
+          </w:p>
+        </w:tc>
+        <w:tc>
+          <w:tcPr>
+            <w:tcBorders>
+              <w:right w:color="ffffff" w:space="0" w:sz="18" w:val="single"/>
+            </w:tcBorders>
+          </w:tcPr>
+          <w:p>
+            <w:pPr>
+              <w:rPr>
+                <w:color w:val="404040"/>
+              </w:rPr>
+            </w:pPr>
+            <w:r>
+              <w:rPr>
+                <w:color w:val="404040"/>
+                <w:sz w:val="14"/>
+                <w:szCs w:val="14"/>
+                <w:rtl w:val="0"/>
+              </w:rPr>
+              <w:t xml:space="preserve">Clique ou toque aqui para inserir o texto.</w:t>
+            </w:r>
+            <w:r>
+              <w:rPr>
+                <w:rtl w:val="0"/>
+              </w:rPr>
+            </w:r>
+          </w:p>
+        </w:tc>
+        <w:tc>
+          <w:tcPr>
+            <w:tcBorders>
+              <w:top w:color="ffffff" w:space="0" w:sz="18" w:val="single"/>
+              <w:left w:color="ffffff" w:space="0" w:sz="18" w:val="single"/>
+              <w:bottom w:color="ffffff" w:space="0" w:sz="18" w:val="single"/>
+              <w:right w:color="000000" w:space="0" w:sz="0" w:val="nil"/>
+            </w:tcBorders>
+            <w:shd w:fill="fbe2d1" w:val="clear"/>
+          </w:tcPr>
+          <w:p>
+            <w:pPr>
+              <w:keepNext w:val="0"/>
+              <w:keepLines w:val="0"/>
+              <w:pageBreakBefore w:val="0"/>
+              <w:widowControl w:val="1"/>
+              <w:pBdr>
+                <w:top w:space="0" w:sz="0" w:val="nil"/>
+                <w:left w:space="0" w:sz="0" w:val="nil"/>
+                <w:bottom w:space="0" w:sz="0" w:val="nil"/>
+                <w:right w:space="0" w:sz="0" w:val="nil"/>
+                <w:between w:space="0" w:sz="0" w:val="nil"/>
+              </w:pBdr>
+              <w:shd w:fill="auto" w:val="clear"/>
+              <w:spacing w:after="20" w:before="20" w:line="240" w:lineRule="auto"/>
+              <w:ind w:left="0" w:right="0" w:firstLine="0"/>
+              <w:jc w:val="right"/>
+              <w:rPr>
+                <w:rFonts w:ascii="Century Gothic" w:cs="Century Gothic" w:eastAsia="Century Gothic" w:hAnsi="Century Gothic"/>
+                <w:b w:val="0"/>
+                <w:bCs w:val="0"/>
+                <w:i w:val="0"/>
+                <w:iCs w:val="0"/>
+                <w:smallCaps w:val="0"/>
+                <w:strike w:val="0"/>
+                <w:color w:val="404040"/>
+                <w:sz w:val="16"/>
+                <w:szCs w:val="16"/>
+                <w:u w:val="none"/>
+                <w:shd w:fill="auto" w:val="clear"/>
+                <w:vertAlign w:val="baseline"/>
+              </w:rPr>
+            </w:pPr>
+            <w:r>
+              <w:rPr>
+                <w:rFonts w:ascii="Century Gothic" w:cs="Century Gothic" w:eastAsia="Century Gothic" w:hAnsi="Century Gothic"/>
+                <w:b w:val="0"/>
+                <w:bCs w:val="0"/>
+                <w:i w:val="0"/>
+                <w:iCs w:val="0"/>
+                <w:smallCaps w:val="0"/>
+                <w:strike w:val="0"/>
+                <w:color w:val="404040"/>
+                <w:sz w:val="16"/>
+                <w:szCs w:val="16"/>
+                <w:u w:val="none"/>
+                <w:shd w:fill="auto" w:val="clear"/>
+                <w:vertAlign w:val="baseline"/>
+                <w:rtl w:val="0"/>
+              </w:rPr>
+              <w:t xml:space="preserve">Insira aqui o valor</w:t>
+            </w:r>
+          </w:p>
+        </w:tc>
+      </w:tr>
+      <w:tr>
+        <w:trPr>
+          <w:cantSplit w:val="0"/>
+          <w:tblHeader w:val="0"/>
+        </w:trPr>
+        <w:tc>
+          <w:tcPr>
+            <w:shd w:fill="auto" w:val="clear"/>
+          </w:tcPr>
+          <w:p>
+            <w:pPr>
+              <w:pStyle w:val="Heading1"/>
+              <w:rPr>
+                <w:color w:val="404040"/>
+                <w:sz w:val="16"/>
+                <w:szCs w:val="16"/>
+              </w:rPr>
+            </w:pPr>
+            <w:r>
+              <w:rPr>
+                <w:color w:val="808080"/>
+                <w:sz w:val="16"/>
+                <w:szCs w:val="16"/>
+                <w:rtl w:val="0"/>
+              </w:rPr>
+              <w:t xml:space="preserve">Escolher um item.</w:t>
+            </w:r>
+            <w:r>
+              <w:rPr>
+                <w:rtl w:val="0"/>
+              </w:rPr>
+            </w:r>
+          </w:p>
+        </w:tc>
+        <w:tc>
+          <w:tcPr/>
+          <w:p>
+            <w:pPr>
+              <w:rPr>
+                <w:color w:val="404040"/>
+                <w:sz w:val="16"/>
+                <w:szCs w:val="16"/>
+              </w:rPr>
+            </w:pPr>
+            <w:r>
+              <w:rPr>
+                <w:color w:val="808080"/>
+                <w:sz w:val="16"/>
+                <w:szCs w:val="16"/>
+                <w:rtl w:val="0"/>
+              </w:rPr>
+              <w:t xml:space="preserve">Inserir data</w:t>
+            </w:r>
+            <w:r>
+              <w:rPr>
+                <w:rtl w:val="0"/>
+              </w:rPr>
+            </w:r>
+          </w:p>
+        </w:tc>
+        <w:tc>
+          <w:tcPr/>
+          <w:p>
+            <w:pPr>
+              <w:rPr>
+                <w:color w:val="404040"/>
+                <w:sz w:val="16"/>
+                <w:szCs w:val="16"/>
+              </w:rPr>
+            </w:pPr>
+            <w:r>
+              <w:rPr>
+                <w:color w:val="404040"/>
+                <w:sz w:val="16"/>
+                <w:szCs w:val="16"/>
+                <w:rtl w:val="0"/>
+              </w:rPr>
+              <w:t xml:space="preserve">Insira aqui a CIV</w:t>
+            </w:r>
+          </w:p>
+        </w:tc>
+        <w:tc>
+          <w:tcPr>
+            <w:tcBorders>
+              <w:right w:color="ffffff" w:space="0" w:sz="18" w:val="single"/>
+            </w:tcBorders>
+          </w:tcPr>
+          <w:p>
+            <w:pPr>
+              <w:rPr>
+                <w:color w:val="404040"/>
+              </w:rPr>
+            </w:pPr>
+            <w:r>
+              <w:rPr>
+                <w:color w:val="404040"/>
+                <w:sz w:val="14"/>
+                <w:szCs w:val="14"/>
+                <w:rtl w:val="0"/>
+              </w:rPr>
+              <w:t xml:space="preserve">Clique ou toque aqui para inserir o texto.</w:t>
+            </w:r>
+            <w:r>
+              <w:rPr>
+                <w:rtl w:val="0"/>
+              </w:rPr>
+            </w:r>
+          </w:p>
+        </w:tc>
+        <w:tc>
+          <w:tcPr>
+            <w:tcBorders>
+              <w:top w:color="ffffff" w:space="0" w:sz="18" w:val="single"/>
+              <w:left w:color="ffffff" w:space="0" w:sz="18" w:val="single"/>
+              <w:bottom w:color="ffffff" w:space="0" w:sz="18" w:val="single"/>
+              <w:right w:color="000000" w:space="0" w:sz="0" w:val="nil"/>
+            </w:tcBorders>
+            <w:shd w:fill="fbe2d1" w:val="clear"/>
+          </w:tcPr>
+          <w:p>
+            <w:pPr>
+              <w:keepNext w:val="0"/>
+              <w:keepLines w:val="0"/>
+              <w:pageBreakBefore w:val="0"/>
+              <w:widowControl w:val="1"/>
+              <w:pBdr>
+                <w:top w:space="0" w:sz="0" w:val="nil"/>
+                <w:left w:space="0" w:sz="0" w:val="nil"/>
+                <w:bottom w:space="0" w:sz="0" w:val="nil"/>
+                <w:right w:space="0" w:sz="0" w:val="nil"/>
+                <w:between w:space="0" w:sz="0" w:val="nil"/>
+              </w:pBdr>
+              <w:shd w:fill="auto" w:val="clear"/>
+              <w:spacing w:after="20" w:before="20" w:line="240" w:lineRule="auto"/>
+              <w:ind w:left="0" w:right="0" w:firstLine="0"/>
+              <w:jc w:val="right"/>
+              <w:rPr>
+                <w:rFonts w:ascii="Century Gothic" w:cs="Century Gothic" w:eastAsia="Century Gothic" w:hAnsi="Century Gothic"/>
+                <w:b w:val="0"/>
+                <w:bCs w:val="0"/>
+                <w:i w:val="0"/>
+                <w:iCs w:val="0"/>
+                <w:smallCaps w:val="0"/>
+                <w:strike w:val="0"/>
+                <w:color w:val="404040"/>
+                <w:sz w:val="16"/>
+                <w:szCs w:val="16"/>
+                <w:u w:val="none"/>
+                <w:shd w:fill="auto" w:val="clear"/>
+                <w:vertAlign w:val="baseline"/>
+              </w:rPr>
+            </w:pPr>
+            <w:r>
+              <w:rPr>
+                <w:rFonts w:ascii="Century Gothic" w:cs="Century Gothic" w:eastAsia="Century Gothic" w:hAnsi="Century Gothic"/>
+                <w:b w:val="0"/>
+                <w:bCs w:val="0"/>
+                <w:i w:val="0"/>
+                <w:iCs w:val="0"/>
+                <w:smallCaps w:val="0"/>
+                <w:strike w:val="0"/>
+                <w:color w:val="404040"/>
+                <w:sz w:val="16"/>
+                <w:szCs w:val="16"/>
+                <w:u w:val="none"/>
+                <w:shd w:fill="auto" w:val="clear"/>
+                <w:vertAlign w:val="baseline"/>
+                <w:rtl w:val="0"/>
+              </w:rPr>
+              <w:t xml:space="preserve">Insira aqui o valor</w:t>
+            </w:r>
+          </w:p>
+        </w:tc>
+      </w:tr>
+      <w:tr>
+        <w:trPr>
+          <w:cantSplit w:val="0"/>
+          <w:tblHeader w:val="0"/>
+        </w:trPr>
+        <w:tc>
+          <w:tcPr>
+            <w:shd w:fill="auto" w:val="clear"/>
+          </w:tcPr>
+          <w:p>
+            <w:pPr>
+              <w:pStyle w:val="Heading1"/>
+              <w:rPr>
+                <w:color w:val="404040"/>
+                <w:sz w:val="16"/>
+                <w:szCs w:val="16"/>
+              </w:rPr>
+            </w:pPr>
+            <w:r>
+              <w:rPr>
+                <w:color w:val="808080"/>
+                <w:sz w:val="16"/>
+                <w:szCs w:val="16"/>
+                <w:rtl w:val="0"/>
+              </w:rPr>
+              <w:t xml:space="preserve">Escolher um item.</w:t>
+            </w:r>
+            <w:r>
+              <w:rPr>
+                <w:rtl w:val="0"/>
+              </w:rPr>
+            </w:r>
+          </w:p>
+        </w:tc>
+        <w:tc>
+          <w:tcPr/>
+          <w:p>
+            <w:pPr>
+              <w:rPr>
+                <w:color w:val="404040"/>
+                <w:sz w:val="16"/>
+                <w:szCs w:val="16"/>
+              </w:rPr>
+            </w:pPr>
+            <w:r>
+              <w:rPr>
+                <w:color w:val="808080"/>
+                <w:sz w:val="16"/>
+                <w:szCs w:val="16"/>
+                <w:rtl w:val="0"/>
+              </w:rPr>
+              <w:t xml:space="preserve">Inserir data</w:t>
+            </w:r>
+            <w:r>
+              <w:rPr>
+                <w:rtl w:val="0"/>
+              </w:rPr>
+            </w:r>
+          </w:p>
+        </w:tc>
+        <w:tc>
+          <w:tcPr/>
+          <w:p>
+            <w:pPr>
+              <w:rPr>
+                <w:color w:val="404040"/>
+                <w:sz w:val="16"/>
+                <w:szCs w:val="16"/>
+              </w:rPr>
+            </w:pPr>
+            <w:r>
+              <w:rPr>
+                <w:color w:val="404040"/>
+                <w:sz w:val="16"/>
+                <w:szCs w:val="16"/>
+                <w:rtl w:val="0"/>
+              </w:rPr>
+              <w:t xml:space="preserve">Insira aqui a CIV</w:t>
+            </w:r>
+          </w:p>
+        </w:tc>
+        <w:tc>
+          <w:tcPr>
+            <w:tcBorders>
+              <w:right w:color="ffffff" w:space="0" w:sz="18" w:val="single"/>
+            </w:tcBorders>
+          </w:tcPr>
+          <w:p>
+            <w:pPr>
+              <w:rPr>
+                <w:color w:val="404040"/>
+              </w:rPr>
+            </w:pPr>
+            <w:r>
+              <w:rPr>
+                <w:color w:val="404040"/>
+                <w:sz w:val="14"/>
+                <w:szCs w:val="14"/>
+                <w:rtl w:val="0"/>
+              </w:rPr>
+              <w:t xml:space="preserve">Clique ou toque aqui para inserir o texto.</w:t>
+            </w:r>
+            <w:r>
+              <w:rPr>
+                <w:rtl w:val="0"/>
+              </w:rPr>
+            </w:r>
+          </w:p>
+        </w:tc>
+        <w:tc>
+          <w:tcPr>
+            <w:tcBorders>
+              <w:top w:color="ffffff" w:space="0" w:sz="18" w:val="single"/>
+              <w:left w:color="ffffff" w:space="0" w:sz="18" w:val="single"/>
+              <w:bottom w:color="ffffff" w:space="0" w:sz="18" w:val="single"/>
+              <w:right w:color="000000" w:space="0" w:sz="0" w:val="nil"/>
+            </w:tcBorders>
+            <w:shd w:fill="fbe2d1" w:val="clear"/>
+          </w:tcPr>
+          <w:p>
+            <w:pPr>
+              <w:keepNext w:val="0"/>
+              <w:keepLines w:val="0"/>
+              <w:pageBreakBefore w:val="0"/>
+              <w:widowControl w:val="1"/>
+              <w:pBdr>
+                <w:top w:space="0" w:sz="0" w:val="nil"/>
+                <w:left w:space="0" w:sz="0" w:val="nil"/>
+                <w:bottom w:space="0" w:sz="0" w:val="nil"/>
+                <w:right w:space="0" w:sz="0" w:val="nil"/>
+                <w:between w:space="0" w:sz="0" w:val="nil"/>
+              </w:pBdr>
+              <w:shd w:fill="auto" w:val="clear"/>
+              <w:spacing w:after="20" w:before="20" w:line="240" w:lineRule="auto"/>
+              <w:ind w:left="0" w:right="0" w:firstLine="0"/>
+              <w:jc w:val="right"/>
+              <w:rPr>
+                <w:rFonts w:ascii="Century Gothic" w:cs="Century Gothic" w:eastAsia="Century Gothic" w:hAnsi="Century Gothic"/>
+                <w:b w:val="0"/>
+                <w:bCs w:val="0"/>
+                <w:i w:val="0"/>
+                <w:iCs w:val="0"/>
+                <w:smallCaps w:val="0"/>
+                <w:strike w:val="0"/>
+                <w:color w:val="404040"/>
+                <w:sz w:val="16"/>
+                <w:szCs w:val="16"/>
+                <w:u w:val="none"/>
+                <w:shd w:fill="auto" w:val="clear"/>
+                <w:vertAlign w:val="baseline"/>
+              </w:rPr>
+            </w:pPr>
+            <w:r>
+              <w:rPr>
+                <w:rFonts w:ascii="Century Gothic" w:cs="Century Gothic" w:eastAsia="Century Gothic" w:hAnsi="Century Gothic"/>
+                <w:b w:val="0"/>
+                <w:bCs w:val="0"/>
+                <w:i w:val="0"/>
+                <w:iCs w:val="0"/>
+                <w:smallCaps w:val="0"/>
+                <w:strike w:val="0"/>
+                <w:color w:val="404040"/>
+                <w:sz w:val="16"/>
+                <w:szCs w:val="16"/>
+                <w:u w:val="none"/>
+                <w:shd w:fill="auto" w:val="clear"/>
+                <w:vertAlign w:val="baseline"/>
+                <w:rtl w:val="0"/>
+              </w:rPr>
+              <w:t xml:space="preserve">Insira aqui o valor</w:t>
+            </w:r>
+          </w:p>
+        </w:tc>
+      </w:tr>
+      <w:tr>
+        <w:trPr>
+          <w:cantSplit w:val="0"/>
+          <w:tblHeader w:val="0"/>
+        </w:trPr>
+        <w:tc>
+          <w:tcPr>
+            <w:shd w:fill="auto" w:val="clear"/>
+          </w:tcPr>
+          <w:p>
+            <w:pPr>
+              <w:pStyle w:val="Heading1"/>
+              <w:rPr>
+                <w:color w:val="404040"/>
+                <w:sz w:val="16"/>
+                <w:szCs w:val="16"/>
+              </w:rPr>
+            </w:pPr>
+            <w:r>
+              <w:rPr>
+                <w:color w:val="808080"/>
+                <w:sz w:val="16"/>
+                <w:szCs w:val="16"/>
+                <w:rtl w:val="0"/>
+              </w:rPr>
+              <w:t xml:space="preserve">Escolher um item.</w:t>
+            </w:r>
+            <w:r>
+              <w:rPr>
+                <w:rtl w:val="0"/>
+              </w:rPr>
+            </w:r>
+          </w:p>
+        </w:tc>
+        <w:tc>
+          <w:tcPr/>
+          <w:p>
+            <w:pPr>
+              <w:rPr>
+                <w:color w:val="404040"/>
+                <w:sz w:val="16"/>
+                <w:szCs w:val="16"/>
+              </w:rPr>
+            </w:pPr>
+            <w:r>
+              <w:rPr>
+                <w:color w:val="808080"/>
+                <w:sz w:val="16"/>
+                <w:szCs w:val="16"/>
+                <w:rtl w:val="0"/>
+              </w:rPr>
+              <w:t xml:space="preserve">Inserir data</w:t>
+            </w:r>
+            <w:r>
+              <w:rPr>
+                <w:rtl w:val="0"/>
+              </w:rPr>
+            </w:r>
+          </w:p>
+        </w:tc>
+        <w:tc>
+          <w:tcPr/>
+          <w:p>
+            <w:pPr>
+              <w:rPr>
+                <w:color w:val="404040"/>
+                <w:sz w:val="16"/>
+                <w:szCs w:val="16"/>
+              </w:rPr>
+            </w:pPr>
+            <w:r>
+              <w:rPr>
+                <w:color w:val="404040"/>
+                <w:sz w:val="16"/>
+                <w:szCs w:val="16"/>
+                <w:rtl w:val="0"/>
+              </w:rPr>
+              <w:t xml:space="preserve">Insira aqui a CIV</w:t>
+            </w:r>
+          </w:p>
+        </w:tc>
+        <w:tc>
+          <w:tcPr>
+            <w:tcBorders>
+              <w:right w:color="ffffff" w:space="0" w:sz="18" w:val="single"/>
+            </w:tcBorders>
+          </w:tcPr>
+          <w:p>
+            <w:pPr>
+              <w:rPr>
+                <w:color w:val="404040"/>
+              </w:rPr>
+            </w:pPr>
+            <w:r>
+              <w:rPr>
+                <w:color w:val="404040"/>
+                <w:sz w:val="14"/>
+                <w:szCs w:val="14"/>
+                <w:rtl w:val="0"/>
+              </w:rPr>
+              <w:t xml:space="preserve">Clique ou toque aqui para inserir o texto.</w:t>
+            </w:r>
+            <w:r>
+              <w:rPr>
+                <w:rtl w:val="0"/>
+              </w:rPr>
+            </w:r>
+          </w:p>
+        </w:tc>
+        <w:tc>
+          <w:tcPr>
+            <w:tcBorders>
+              <w:top w:color="ffffff" w:space="0" w:sz="18" w:val="single"/>
+              <w:left w:color="ffffff" w:space="0" w:sz="18" w:val="single"/>
+              <w:bottom w:color="ffffff" w:space="0" w:sz="18" w:val="single"/>
+              <w:right w:color="000000" w:space="0" w:sz="0" w:val="nil"/>
+            </w:tcBorders>
+            <w:shd w:fill="fbe2d1" w:val="clear"/>
+          </w:tcPr>
+          <w:p>
+            <w:pPr>
+              <w:keepNext w:val="0"/>
+              <w:keepLines w:val="0"/>
+              <w:pageBreakBefore w:val="0"/>
+              <w:widowControl w:val="1"/>
+              <w:pBdr>
+                <w:top w:space="0" w:sz="0" w:val="nil"/>
+                <w:left w:space="0" w:sz="0" w:val="nil"/>
+                <w:bottom w:space="0" w:sz="0" w:val="nil"/>
+                <w:right w:space="0" w:sz="0" w:val="nil"/>
+                <w:between w:space="0" w:sz="0" w:val="nil"/>
+              </w:pBdr>
+              <w:shd w:fill="auto" w:val="clear"/>
+              <w:spacing w:after="20" w:before="20" w:line="240" w:lineRule="auto"/>
+              <w:ind w:left="0" w:right="0" w:firstLine="0"/>
+              <w:jc w:val="right"/>
+              <w:rPr>
+                <w:rFonts w:ascii="Century Gothic" w:cs="Century Gothic" w:eastAsia="Century Gothic" w:hAnsi="Century Gothic"/>
+                <w:b w:val="0"/>
+                <w:bCs w:val="0"/>
+                <w:i w:val="0"/>
+                <w:iCs w:val="0"/>
+                <w:smallCaps w:val="0"/>
+                <w:strike w:val="0"/>
+                <w:color w:val="404040"/>
+                <w:sz w:val="16"/>
+                <w:szCs w:val="16"/>
+                <w:u w:val="none"/>
+                <w:shd w:fill="auto" w:val="clear"/>
+                <w:vertAlign w:val="baseline"/>
+              </w:rPr>
+            </w:pPr>
+            <w:r>
+              <w:rPr>
+                <w:rFonts w:ascii="Century Gothic" w:cs="Century Gothic" w:eastAsia="Century Gothic" w:hAnsi="Century Gothic"/>
+                <w:b w:val="0"/>
+                <w:bCs w:val="0"/>
+                <w:i w:val="0"/>
+                <w:iCs w:val="0"/>
+                <w:smallCaps w:val="0"/>
+                <w:strike w:val="0"/>
+                <w:color w:val="404040"/>
+                <w:sz w:val="16"/>
+                <w:szCs w:val="16"/>
+                <w:u w:val="none"/>
+                <w:shd w:fill="auto" w:val="clear"/>
+                <w:vertAlign w:val="baseline"/>
+                <w:rtl w:val="0"/>
+              </w:rPr>
+              <w:t xml:space="preserve">Insira aqui o valor</w:t>
+            </w:r>
+          </w:p>
+        </w:tc>
+      </w:tr>
+      <w:tr>
+        <w:trPr>
+          <w:cantSplit w:val="0"/>
+          <w:tblHeader w:val="0"/>
+        </w:trPr>
+        <w:tc>
+          <w:tcPr>
+            <w:shd w:fill="auto" w:val="clear"/>
+          </w:tcPr>
+          <w:p>
+            <w:pPr>
+              <w:pStyle w:val="Heading1"/>
+              <w:rPr>
+                <w:color w:val="404040"/>
+                <w:sz w:val="16"/>
+                <w:szCs w:val="16"/>
+              </w:rPr>
+            </w:pPr>
+            <w:r>
+              <w:rPr>
+                <w:color w:val="808080"/>
+                <w:sz w:val="16"/>
+                <w:szCs w:val="16"/>
+                <w:rtl w:val="0"/>
+              </w:rPr>
+              <w:t xml:space="preserve">Escolher um item.</w:t>
+            </w:r>
+            <w:r>
+              <w:rPr>
+                <w:rtl w:val="0"/>
+              </w:rPr>
+            </w:r>
+          </w:p>
+        </w:tc>
+        <w:tc>
+          <w:tcPr/>
+          <w:p>
+            <w:pPr>
+              <w:rPr>
+                <w:color w:val="404040"/>
+                <w:sz w:val="16"/>
+                <w:szCs w:val="16"/>
+              </w:rPr>
+            </w:pPr>
+            <w:r>
+              <w:rPr>
+                <w:color w:val="808080"/>
+                <w:sz w:val="16"/>
+                <w:szCs w:val="16"/>
+                <w:rtl w:val="0"/>
+              </w:rPr>
+              <w:t xml:space="preserve">Inserir data</w:t>
+            </w:r>
+            <w:r>
+              <w:rPr>
+                <w:rtl w:val="0"/>
+              </w:rPr>
+            </w:r>
+          </w:p>
+        </w:tc>
+        <w:tc>
+          <w:tcPr/>
+          <w:p>
+            <w:pPr>
+              <w:rPr>
+                <w:color w:val="404040"/>
+                <w:sz w:val="16"/>
+                <w:szCs w:val="16"/>
+              </w:rPr>
+            </w:pPr>
+            <w:r>
+              <w:rPr>
+                <w:color w:val="404040"/>
+                <w:sz w:val="16"/>
+                <w:szCs w:val="16"/>
+                <w:rtl w:val="0"/>
+              </w:rPr>
+              <w:t xml:space="preserve">Insira aqui a CIV</w:t>
+            </w:r>
+          </w:p>
+        </w:tc>
+        <w:tc>
+          <w:tcPr>
+            <w:tcBorders>
+              <w:right w:color="ffffff" w:space="0" w:sz="18" w:val="single"/>
+            </w:tcBorders>
+          </w:tcPr>
+          <w:p>
+            <w:pPr>
+              <w:rPr>
+                <w:color w:val="404040"/>
+              </w:rPr>
+            </w:pPr>
+            <w:r>
+              <w:rPr>
+                <w:color w:val="404040"/>
+                <w:sz w:val="14"/>
+                <w:szCs w:val="14"/>
+                <w:rtl w:val="0"/>
+              </w:rPr>
+              <w:t xml:space="preserve">Clique ou toque aqui para inserir o texto.</w:t>
+            </w:r>
+            <w:r>
+              <w:rPr>
+                <w:rtl w:val="0"/>
+              </w:rPr>
+            </w:r>
+          </w:p>
+        </w:tc>
+        <w:tc>
+          <w:tcPr>
+            <w:tcBorders>
+              <w:top w:color="ffffff" w:space="0" w:sz="18" w:val="single"/>
+              <w:left w:color="ffffff" w:space="0" w:sz="18" w:val="single"/>
+              <w:bottom w:color="ffffff" w:space="0" w:sz="18" w:val="single"/>
+              <w:right w:color="000000" w:space="0" w:sz="0" w:val="nil"/>
+            </w:tcBorders>
+            <w:shd w:fill="fbe2d1" w:val="clear"/>
+          </w:tcPr>
+          <w:p>
+            <w:pPr>
+              <w:keepNext w:val="0"/>
+              <w:keepLines w:val="0"/>
+              <w:pageBreakBefore w:val="0"/>
+              <w:widowControl w:val="1"/>
+              <w:pBdr>
+                <w:top w:space="0" w:sz="0" w:val="nil"/>
+                <w:left w:space="0" w:sz="0" w:val="nil"/>
+                <w:bottom w:space="0" w:sz="0" w:val="nil"/>
+                <w:right w:space="0" w:sz="0" w:val="nil"/>
+                <w:between w:space="0" w:sz="0" w:val="nil"/>
+              </w:pBdr>
+              <w:shd w:fill="auto" w:val="clear"/>
+              <w:spacing w:after="20" w:before="20" w:line="240" w:lineRule="auto"/>
+              <w:ind w:left="0" w:right="0" w:firstLine="0"/>
+              <w:jc w:val="right"/>
+              <w:rPr>
+                <w:rFonts w:ascii="Century Gothic" w:cs="Century Gothic" w:eastAsia="Century Gothic" w:hAnsi="Century Gothic"/>
+                <w:b w:val="0"/>
+                <w:bCs w:val="0"/>
+                <w:i w:val="0"/>
+                <w:iCs w:val="0"/>
+                <w:smallCaps w:val="0"/>
+                <w:strike w:val="0"/>
+                <w:color w:val="404040"/>
+                <w:sz w:val="16"/>
+                <w:szCs w:val="16"/>
+                <w:u w:val="none"/>
+                <w:shd w:fill="auto" w:val="clear"/>
+                <w:vertAlign w:val="baseline"/>
+              </w:rPr>
+            </w:pPr>
+            <w:r>
+              <w:rPr>
+                <w:rFonts w:ascii="Century Gothic" w:cs="Century Gothic" w:eastAsia="Century Gothic" w:hAnsi="Century Gothic"/>
+                <w:b w:val="0"/>
+                <w:bCs w:val="0"/>
+                <w:i w:val="0"/>
+                <w:iCs w:val="0"/>
+                <w:smallCaps w:val="0"/>
+                <w:strike w:val="0"/>
+                <w:color w:val="404040"/>
+                <w:sz w:val="16"/>
+                <w:szCs w:val="16"/>
+                <w:u w:val="none"/>
+                <w:shd w:fill="auto" w:val="clear"/>
+                <w:vertAlign w:val="baseline"/>
+                <w:rtl w:val="0"/>
+              </w:rPr>
+              <w:t xml:space="preserve">Insira aqui o valor</w:t>
+            </w:r>
+          </w:p>
+        </w:tc>
+      </w:tr>
+      <w:tr>
+        <w:trPr>
+          <w:cantSplit w:val="0"/>
+          <w:tblHeader w:val="0"/>
+        </w:trPr>
+        <w:tc>
+          <w:tcPr>
+            <w:shd w:fill="auto" w:val="clear"/>
+          </w:tcPr>
+          <w:p>
+            <w:pPr>
+              <w:pStyle w:val="Heading1"/>
+              <w:rPr>
+                <w:color w:val="404040"/>
+                <w:sz w:val="16"/>
+                <w:szCs w:val="16"/>
+              </w:rPr>
+            </w:pPr>
+            <w:r>
+              <w:rPr>
+                <w:color w:val="808080"/>
+                <w:sz w:val="16"/>
+                <w:szCs w:val="16"/>
+                <w:rtl w:val="0"/>
+              </w:rPr>
+              <w:t xml:space="preserve">Escolher um item.</w:t>
+            </w:r>
+            <w:r>
+              <w:rPr>
+                <w:rtl w:val="0"/>
+              </w:rPr>
+            </w:r>
+          </w:p>
+        </w:tc>
+        <w:tc>
+          <w:tcPr/>
+          <w:p>
+            <w:pPr>
+              <w:rPr>
+                <w:color w:val="404040"/>
+                <w:sz w:val="16"/>
+                <w:szCs w:val="16"/>
+              </w:rPr>
+            </w:pPr>
+            <w:r>
+              <w:rPr>
+                <w:color w:val="808080"/>
+                <w:sz w:val="16"/>
+                <w:szCs w:val="16"/>
+                <w:rtl w:val="0"/>
+              </w:rPr>
+              <w:t xml:space="preserve">Inserir data</w:t>
+            </w:r>
+            <w:r>
+              <w:rPr>
+                <w:rtl w:val="0"/>
+              </w:rPr>
+            </w:r>
+          </w:p>
+        </w:tc>
+        <w:tc>
+          <w:tcPr/>
+          <w:p>
+            <w:pPr>
+              <w:rPr>
+                <w:color w:val="404040"/>
+                <w:sz w:val="16"/>
+                <w:szCs w:val="16"/>
+              </w:rPr>
+            </w:pPr>
+            <w:r>
+              <w:rPr>
+                <w:color w:val="404040"/>
+                <w:sz w:val="16"/>
+                <w:szCs w:val="16"/>
+                <w:rtl w:val="0"/>
+              </w:rPr>
+              <w:t xml:space="preserve">Insira aqui a CIV</w:t>
+            </w:r>
+          </w:p>
+        </w:tc>
+        <w:tc>
+          <w:tcPr>
+            <w:tcBorders>
+              <w:right w:color="ffffff" w:space="0" w:sz="18" w:val="single"/>
+            </w:tcBorders>
+          </w:tcPr>
+          <w:p>
+            <w:pPr>
+              <w:rPr>
+                <w:color w:val="404040"/>
+              </w:rPr>
+            </w:pPr>
+            <w:r>
+              <w:rPr>
+                <w:color w:val="404040"/>
+                <w:sz w:val="14"/>
+                <w:szCs w:val="14"/>
+                <w:rtl w:val="0"/>
+              </w:rPr>
+              <w:t xml:space="preserve">Clique ou toque aqui para inserir o texto.</w:t>
+            </w:r>
+            <w:r>
+              <w:rPr>
+                <w:rtl w:val="0"/>
+              </w:rPr>
+            </w:r>
+          </w:p>
+        </w:tc>
+        <w:tc>
+          <w:tcPr>
+            <w:tcBorders>
+              <w:top w:color="ffffff" w:space="0" w:sz="18" w:val="single"/>
+              <w:left w:color="ffffff" w:space="0" w:sz="18" w:val="single"/>
+              <w:bottom w:color="ffffff" w:space="0" w:sz="18" w:val="single"/>
+              <w:right w:color="000000" w:space="0" w:sz="0" w:val="nil"/>
+            </w:tcBorders>
+            <w:shd w:fill="fbe2d1" w:val="clear"/>
+          </w:tcPr>
+          <w:p>
+            <w:pPr>
+              <w:keepNext w:val="0"/>
+              <w:keepLines w:val="0"/>
+              <w:pageBreakBefore w:val="0"/>
+              <w:widowControl w:val="1"/>
+              <w:pBdr>
+                <w:top w:space="0" w:sz="0" w:val="nil"/>
+                <w:left w:space="0" w:sz="0" w:val="nil"/>
+                <w:bottom w:space="0" w:sz="0" w:val="nil"/>
+                <w:right w:space="0" w:sz="0" w:val="nil"/>
+                <w:between w:space="0" w:sz="0" w:val="nil"/>
+              </w:pBdr>
+              <w:shd w:fill="auto" w:val="clear"/>
+              <w:spacing w:after="20" w:before="20" w:line="240" w:lineRule="auto"/>
+              <w:ind w:left="0" w:right="0" w:firstLine="0"/>
+              <w:jc w:val="right"/>
+              <w:rPr>
+                <w:rFonts w:ascii="Century Gothic" w:cs="Century Gothic" w:eastAsia="Century Gothic" w:hAnsi="Century Gothic"/>
+                <w:b w:val="0"/>
+                <w:bCs w:val="0"/>
+                <w:i w:val="0"/>
+                <w:iCs w:val="0"/>
+                <w:smallCaps w:val="0"/>
+                <w:strike w:val="0"/>
+                <w:color w:val="404040"/>
+                <w:sz w:val="16"/>
+                <w:szCs w:val="16"/>
+                <w:u w:val="none"/>
+                <w:shd w:fill="auto" w:val="clear"/>
+                <w:vertAlign w:val="baseline"/>
+              </w:rPr>
+            </w:pPr>
+            <w:r>
+              <w:rPr>
+                <w:rFonts w:ascii="Century Gothic" w:cs="Century Gothic" w:eastAsia="Century Gothic" w:hAnsi="Century Gothic"/>
+                <w:b w:val="0"/>
+                <w:bCs w:val="0"/>
+                <w:i w:val="0"/>
+                <w:iCs w:val="0"/>
+                <w:smallCaps w:val="0"/>
+                <w:strike w:val="0"/>
+                <w:color w:val="404040"/>
+                <w:sz w:val="16"/>
+                <w:szCs w:val="16"/>
+                <w:u w:val="none"/>
+                <w:shd w:fill="auto" w:val="clear"/>
+                <w:vertAlign w:val="baseline"/>
+                <w:rtl w:val="0"/>
+              </w:rPr>
+              <w:t xml:space="preserve">Insira aqui o valor</w:t>
+            </w:r>
+          </w:p>
+        </w:tc>
+      </w:tr>
+      <w:tr>
+        <w:trPr>
+          <w:cantSplit w:val="0"/>
           <w:trHeight w:val="158" w:hRule="atLeast"/>
           <w:tblHeader w:val="0"/>
         </w:trPr>
@@ -10453,7 +11563,7 @@
           </w:tcPr>
           <w:p>
             <w:r>
-              <w:t>23105,42</w:t>
+              <w:t>7611,84</w:t>
             </w:r>
           </w:p>
         </w:tc>

</xml_diff>

<commit_message>
adiciona robo Omni PDE FSP TRC ao initializr e painel de ativacao
- Cria ProcessoOmniPdeFspTrc e registra no initializr (paths, instancias, __init__)
- Adiciona card Omni no painel com campos de data inicial/final e download Excel
- Routes: salvar_omni_config, omni_download_erros, omni_download_pastas
- Atualiza cpj-reembolso-bmg, omni-pde-fsp-trc e artefatos relacionados

Co-Authored-By: Claude Sonnet 4.6 <noreply@anthropic.com>
</commit_message>
<xml_diff>
--- a/sites/cpj-reembolso-bmg/documento_modelo/bmg/descritivo_custas_preenchido.docx
+++ b/sites/cpj-reembolso-bmg/documento_modelo/bmg/descritivo_custas_preenchido.docx
@@ -184,7 +184,7 @@
           </w:tcPr>
           <w:p>
             <w:r>
-              <w:t>172947</w:t>
+              <w:t>173696</w:t>
             </w:r>
           </w:p>
         </w:tc>
@@ -236,7 +236,7 @@
           </w:tcPr>
           <w:p>
             <w:r>
-              <w:t>27/03/2026</w:t>
+              <w:t>08/04/2026</w:t>
             </w:r>
           </w:p>
         </w:tc>
@@ -288,7 +288,7 @@
           </w:tcPr>
           <w:p>
             <w:r>
-              <w:t>03/2026</w:t>
+              <w:t>04/2026</w:t>
             </w:r>
           </w:p>
         </w:tc>
@@ -449,7 +449,7 @@
           </w:tcPr>
           <w:p>
             <w:r>
-              <w:t>7611,84</w:t>
+              <w:t>288,50</w:t>
             </w:r>
           </w:p>
         </w:tc>
@@ -1256,7 +1256,7 @@
           <w:tcPr/>
           <w:p>
             <w:r>
-              <w:t>27/03/2026</w:t>
+              <w:t>08/04/2026</w:t>
             </w:r>
           </w:p>
         </w:tc>
@@ -1264,7 +1264,7 @@
           <w:tcPr/>
           <w:p>
             <w:r>
-              <w:t>CIV1517612</w:t>
+              <w:t>CIV1449545</w:t>
             </w:r>
           </w:p>
         </w:tc>
@@ -1292,7 +1292,7 @@
           </w:tcPr>
           <w:p>
             <w:r>
-              <w:t>33,59</w:t>
+              <w:t>288,50</w:t>
             </w:r>
           </w:p>
         </w:tc>
@@ -1311,24 +1311,68 @@
             <w:shd w:fill="auto" w:val="clear"/>
           </w:tcPr>
           <w:p>
-            <w:r>
-              <w:t>Custas</w:t>
+            <w:pPr>
+              <w:pStyle w:val="Heading1"/>
+              <w:spacing w:after="20" w:before="20" w:lineRule="auto"/>
+              <w:rPr>
+                <w:color w:val="404040"/>
+                <w:sz w:val="16"/>
+                <w:szCs w:val="16"/>
+              </w:rPr>
+            </w:pPr>
+            <w:r>
+              <w:rPr>
+                <w:color w:val="404040"/>
+                <w:sz w:val="16"/>
+                <w:szCs w:val="16"/>
+                <w:rtl w:val="0"/>
+              </w:rPr>
+              <w:t xml:space="preserve">Custas</w:t>
             </w:r>
           </w:p>
         </w:tc>
         <w:tc>
           <w:tcPr/>
           <w:p>
-            <w:r>
-              <w:t>27/03/2026</w:t>
+            <w:pPr>
+              <w:rPr>
+                <w:color w:val="404040"/>
+              </w:rPr>
+            </w:pPr>
+            <w:r>
+              <w:rPr>
+                <w:color w:val="808080"/>
+                <w:sz w:val="16"/>
+                <w:szCs w:val="16"/>
+                <w:rtl w:val="0"/>
+              </w:rPr>
+              <w:t xml:space="preserve">Inserir data</w:t>
+            </w:r>
+            <w:r>
+              <w:rPr>
+                <w:rtl w:val="0"/>
+              </w:rPr>
             </w:r>
           </w:p>
         </w:tc>
         <w:tc>
           <w:tcPr/>
           <w:p>
-            <w:r>
-              <w:t>CIV1525006</w:t>
+            <w:pPr>
+              <w:rPr>
+                <w:color w:val="404040"/>
+                <w:sz w:val="16"/>
+                <w:szCs w:val="16"/>
+              </w:rPr>
+            </w:pPr>
+            <w:r>
+              <w:rPr>
+                <w:color w:val="404040"/>
+                <w:sz w:val="16"/>
+                <w:szCs w:val="16"/>
+                <w:rtl w:val="0"/>
+              </w:rPr>
+              <w:t xml:space="preserve">Insira aqui a CIV</w:t>
             </w:r>
           </w:p>
         </w:tc>
@@ -1339,8 +1383,24 @@
             </w:tcBorders>
           </w:tcPr>
           <w:p>
-            <w:r>
-              <w:t>APELAÇÃO CIVEL</w:t>
+            <w:pPr>
+              <w:rPr>
+                <w:color w:val="404040"/>
+              </w:rPr>
+            </w:pPr>
+            <w:r>
+              <w:rPr>
+                <w:color w:val="404040"/>
+                <w:sz w:val="14"/>
+                <w:szCs w:val="14"/>
+                <w:rtl w:val="0"/>
+              </w:rPr>
+              <w:t xml:space="preserve">Clique ou toque aqui para inserir o texto.</w:t>
+            </w:r>
+            <w:r>
+              <w:rPr>
+                <w:rtl w:val="0"/>
+              </w:rPr>
             </w:r>
           </w:p>
         </w:tc>
@@ -1355,8 +1415,23 @@
             <w:shd w:fill="fbe2d1" w:val="clear"/>
           </w:tcPr>
           <w:p>
-            <w:r>
-              <w:t>30,00</w:t>
+            <w:pPr>
+              <w:spacing w:after="20" w:before="20" w:lineRule="auto"/>
+              <w:jc w:val="right"/>
+              <w:rPr>
+                <w:color w:val="404040"/>
+                <w:sz w:val="16"/>
+                <w:szCs w:val="16"/>
+              </w:rPr>
+            </w:pPr>
+            <w:r>
+              <w:rPr>
+                <w:color w:val="404040"/>
+                <w:sz w:val="16"/>
+                <w:szCs w:val="16"/>
+                <w:rtl w:val="0"/>
+              </w:rPr>
+              <w:t xml:space="preserve">Insira aqui o valor</w:t>
             </w:r>
           </w:p>
         </w:tc>
@@ -1371,24 +1446,68 @@
             <w:shd w:fill="auto" w:val="clear"/>
           </w:tcPr>
           <w:p>
-            <w:r>
-              <w:t>Custas</w:t>
+            <w:pPr>
+              <w:pStyle w:val="Heading1"/>
+              <w:spacing w:after="20" w:before="20" w:lineRule="auto"/>
+              <w:rPr>
+                <w:color w:val="404040"/>
+                <w:sz w:val="16"/>
+                <w:szCs w:val="16"/>
+              </w:rPr>
+            </w:pPr>
+            <w:r>
+              <w:rPr>
+                <w:color w:val="404040"/>
+                <w:sz w:val="16"/>
+                <w:szCs w:val="16"/>
+                <w:rtl w:val="0"/>
+              </w:rPr>
+              <w:t xml:space="preserve">Custas</w:t>
             </w:r>
           </w:p>
         </w:tc>
         <w:tc>
           <w:tcPr/>
           <w:p>
-            <w:r>
-              <w:t>27/03/2026</w:t>
+            <w:pPr>
+              <w:rPr>
+                <w:color w:val="404040"/>
+              </w:rPr>
+            </w:pPr>
+            <w:r>
+              <w:rPr>
+                <w:color w:val="808080"/>
+                <w:sz w:val="16"/>
+                <w:szCs w:val="16"/>
+                <w:rtl w:val="0"/>
+              </w:rPr>
+              <w:t xml:space="preserve">Inserir data</w:t>
+            </w:r>
+            <w:r>
+              <w:rPr>
+                <w:rtl w:val="0"/>
+              </w:rPr>
             </w:r>
           </w:p>
         </w:tc>
         <w:tc>
           <w:tcPr/>
           <w:p>
-            <w:r>
-              <w:t>CIV1280160</w:t>
+            <w:pPr>
+              <w:rPr>
+                <w:color w:val="404040"/>
+                <w:sz w:val="16"/>
+                <w:szCs w:val="16"/>
+              </w:rPr>
+            </w:pPr>
+            <w:r>
+              <w:rPr>
+                <w:color w:val="404040"/>
+                <w:sz w:val="16"/>
+                <w:szCs w:val="16"/>
+                <w:rtl w:val="0"/>
+              </w:rPr>
+              <w:t xml:space="preserve">Insira aqui a CIV</w:t>
             </w:r>
           </w:p>
         </w:tc>
@@ -1399,8 +1518,24 @@
             </w:tcBorders>
           </w:tcPr>
           <w:p>
-            <w:r>
-              <w:t>CUSTAS DIVERSAS E TAXAS JUDICIAIS / TRIBUNAL DE JU</w:t>
+            <w:pPr>
+              <w:rPr>
+                <w:color w:val="404040"/>
+              </w:rPr>
+            </w:pPr>
+            <w:r>
+              <w:rPr>
+                <w:color w:val="404040"/>
+                <w:sz w:val="14"/>
+                <w:szCs w:val="14"/>
+                <w:rtl w:val="0"/>
+              </w:rPr>
+              <w:t xml:space="preserve">Clique ou toque aqui para inserir o texto.</w:t>
+            </w:r>
+            <w:r>
+              <w:rPr>
+                <w:rtl w:val="0"/>
+              </w:rPr>
             </w:r>
           </w:p>
         </w:tc>
@@ -1415,8 +1550,23 @@
             <w:shd w:fill="fbe2d1" w:val="clear"/>
           </w:tcPr>
           <w:p>
-            <w:r>
-              <w:t>649,57</w:t>
+            <w:pPr>
+              <w:spacing w:after="20" w:before="20" w:lineRule="auto"/>
+              <w:jc w:val="right"/>
+              <w:rPr>
+                <w:color w:val="404040"/>
+                <w:sz w:val="16"/>
+                <w:szCs w:val="16"/>
+              </w:rPr>
+            </w:pPr>
+            <w:r>
+              <w:rPr>
+                <w:color w:val="404040"/>
+                <w:sz w:val="16"/>
+                <w:szCs w:val="16"/>
+                <w:rtl w:val="0"/>
+              </w:rPr>
+              <w:t xml:space="preserve">Insira aqui o valor</w:t>
             </w:r>
           </w:p>
         </w:tc>
@@ -1431,24 +1581,68 @@
             <w:shd w:fill="auto" w:val="clear"/>
           </w:tcPr>
           <w:p>
-            <w:r>
-              <w:t>Custas</w:t>
+            <w:pPr>
+              <w:pStyle w:val="Heading1"/>
+              <w:spacing w:after="20" w:before="20" w:lineRule="auto"/>
+              <w:rPr>
+                <w:color w:val="404040"/>
+                <w:sz w:val="16"/>
+                <w:szCs w:val="16"/>
+              </w:rPr>
+            </w:pPr>
+            <w:r>
+              <w:rPr>
+                <w:color w:val="404040"/>
+                <w:sz w:val="16"/>
+                <w:szCs w:val="16"/>
+                <w:rtl w:val="0"/>
+              </w:rPr>
+              <w:t xml:space="preserve">Custas</w:t>
             </w:r>
           </w:p>
         </w:tc>
         <w:tc>
           <w:tcPr/>
           <w:p>
-            <w:r>
-              <w:t>27/03/2026</w:t>
+            <w:pPr>
+              <w:rPr>
+                <w:color w:val="404040"/>
+              </w:rPr>
+            </w:pPr>
+            <w:r>
+              <w:rPr>
+                <w:color w:val="808080"/>
+                <w:sz w:val="16"/>
+                <w:szCs w:val="16"/>
+                <w:rtl w:val="0"/>
+              </w:rPr>
+              <w:t xml:space="preserve">Inserir data</w:t>
+            </w:r>
+            <w:r>
+              <w:rPr>
+                <w:rtl w:val="0"/>
+              </w:rPr>
             </w:r>
           </w:p>
         </w:tc>
         <w:tc>
           <w:tcPr/>
           <w:p>
-            <w:r>
-              <w:t>CIV1299811</w:t>
+            <w:pPr>
+              <w:rPr>
+                <w:color w:val="404040"/>
+                <w:sz w:val="16"/>
+                <w:szCs w:val="16"/>
+              </w:rPr>
+            </w:pPr>
+            <w:r>
+              <w:rPr>
+                <w:color w:val="404040"/>
+                <w:sz w:val="16"/>
+                <w:szCs w:val="16"/>
+                <w:rtl w:val="0"/>
+              </w:rPr>
+              <w:t xml:space="preserve">Insira aqui a CIV</w:t>
             </w:r>
           </w:p>
         </w:tc>
@@ -1459,8 +1653,24 @@
             </w:tcBorders>
           </w:tcPr>
           <w:p>
-            <w:r>
-              <w:t>APELAÇÃO CIVEL</w:t>
+            <w:pPr>
+              <w:rPr>
+                <w:color w:val="404040"/>
+              </w:rPr>
+            </w:pPr>
+            <w:r>
+              <w:rPr>
+                <w:color w:val="404040"/>
+                <w:sz w:val="14"/>
+                <w:szCs w:val="14"/>
+                <w:rtl w:val="0"/>
+              </w:rPr>
+              <w:t xml:space="preserve">Clique ou toque aqui para inserir o texto.</w:t>
+            </w:r>
+            <w:r>
+              <w:rPr>
+                <w:rtl w:val="0"/>
+              </w:rPr>
             </w:r>
           </w:p>
         </w:tc>
@@ -1475,8 +1685,23 @@
             <w:shd w:fill="fbe2d1" w:val="clear"/>
           </w:tcPr>
           <w:p>
-            <w:r>
-              <w:t>500,25</w:t>
+            <w:pPr>
+              <w:spacing w:after="20" w:before="20" w:lineRule="auto"/>
+              <w:jc w:val="right"/>
+              <w:rPr>
+                <w:color w:val="404040"/>
+                <w:sz w:val="16"/>
+                <w:szCs w:val="16"/>
+              </w:rPr>
+            </w:pPr>
+            <w:r>
+              <w:rPr>
+                <w:color w:val="404040"/>
+                <w:sz w:val="16"/>
+                <w:szCs w:val="16"/>
+                <w:rtl w:val="0"/>
+              </w:rPr>
+              <w:t xml:space="preserve">Insira aqui o valor</w:t>
             </w:r>
           </w:p>
         </w:tc>
@@ -1491,24 +1716,67 @@
             <w:shd w:fill="auto" w:val="clear"/>
           </w:tcPr>
           <w:p>
-            <w:r>
-              <w:t>Custas</w:t>
+            <w:pPr>
+              <w:pStyle w:val="Heading1"/>
+              <w:rPr>
+                <w:color w:val="404040"/>
+                <w:sz w:val="16"/>
+                <w:szCs w:val="16"/>
+              </w:rPr>
+            </w:pPr>
+            <w:r>
+              <w:rPr>
+                <w:color w:val="404040"/>
+                <w:sz w:val="16"/>
+                <w:szCs w:val="16"/>
+                <w:rtl w:val="0"/>
+              </w:rPr>
+              <w:t xml:space="preserve">Custas</w:t>
             </w:r>
           </w:p>
         </w:tc>
         <w:tc>
           <w:tcPr/>
           <w:p>
-            <w:r>
-              <w:t>27/03/2026</w:t>
+            <w:pPr>
+              <w:rPr>
+                <w:color w:val="404040"/>
+              </w:rPr>
+            </w:pPr>
+            <w:r>
+              <w:rPr>
+                <w:color w:val="808080"/>
+                <w:sz w:val="16"/>
+                <w:szCs w:val="16"/>
+                <w:rtl w:val="0"/>
+              </w:rPr>
+              <w:t xml:space="preserve">Inserir data</w:t>
+            </w:r>
+            <w:r>
+              <w:rPr>
+                <w:rtl w:val="0"/>
+              </w:rPr>
             </w:r>
           </w:p>
         </w:tc>
         <w:tc>
           <w:tcPr/>
           <w:p>
-            <w:r>
-              <w:t>CIV1298731</w:t>
+            <w:pPr>
+              <w:rPr>
+                <w:color w:val="404040"/>
+                <w:sz w:val="16"/>
+                <w:szCs w:val="16"/>
+              </w:rPr>
+            </w:pPr>
+            <w:r>
+              <w:rPr>
+                <w:color w:val="404040"/>
+                <w:sz w:val="16"/>
+                <w:szCs w:val="16"/>
+                <w:rtl w:val="0"/>
+              </w:rPr>
+              <w:t xml:space="preserve">Insira aqui a CIV</w:t>
             </w:r>
           </w:p>
         </w:tc>
@@ -1519,8 +1787,24 @@
             </w:tcBorders>
           </w:tcPr>
           <w:p>
-            <w:r>
-              <w:t>CUSTAS DIVERSAS E TAXAS JUDICIAIS / TRIBUNAL DE JU</w:t>
+            <w:pPr>
+              <w:rPr>
+                <w:color w:val="404040"/>
+              </w:rPr>
+            </w:pPr>
+            <w:r>
+              <w:rPr>
+                <w:color w:val="404040"/>
+                <w:sz w:val="14"/>
+                <w:szCs w:val="14"/>
+                <w:rtl w:val="0"/>
+              </w:rPr>
+              <w:t xml:space="preserve">Clique ou toque aqui para inserir o texto.</w:t>
+            </w:r>
+            <w:r>
+              <w:rPr>
+                <w:rtl w:val="0"/>
+              </w:rPr>
             </w:r>
           </w:p>
         </w:tc>
@@ -1535,8 +1819,23 @@
             <w:shd w:fill="fbe2d1" w:val="clear"/>
           </w:tcPr>
           <w:p>
-            <w:r>
-              <w:t>1139,65</w:t>
+            <w:pPr>
+              <w:spacing w:after="20" w:before="20" w:lineRule="auto"/>
+              <w:jc w:val="right"/>
+              <w:rPr>
+                <w:color w:val="404040"/>
+                <w:sz w:val="16"/>
+                <w:szCs w:val="16"/>
+              </w:rPr>
+            </w:pPr>
+            <w:r>
+              <w:rPr>
+                <w:color w:val="404040"/>
+                <w:sz w:val="16"/>
+                <w:szCs w:val="16"/>
+                <w:rtl w:val="0"/>
+              </w:rPr>
+              <w:t xml:space="preserve">Insira aqui o valor</w:t>
             </w:r>
           </w:p>
         </w:tc>
@@ -1551,24 +1850,67 @@
             <w:shd w:fill="auto" w:val="clear"/>
           </w:tcPr>
           <w:p>
-            <w:r>
-              <w:t>Custas</w:t>
+            <w:pPr>
+              <w:pStyle w:val="Heading1"/>
+              <w:rPr>
+                <w:color w:val="404040"/>
+                <w:sz w:val="16"/>
+                <w:szCs w:val="16"/>
+              </w:rPr>
+            </w:pPr>
+            <w:r>
+              <w:rPr>
+                <w:color w:val="404040"/>
+                <w:sz w:val="16"/>
+                <w:szCs w:val="16"/>
+                <w:rtl w:val="0"/>
+              </w:rPr>
+              <w:t xml:space="preserve">Custas</w:t>
             </w:r>
           </w:p>
         </w:tc>
         <w:tc>
           <w:tcPr/>
           <w:p>
-            <w:r>
-              <w:t>27/03/2026</w:t>
+            <w:pPr>
+              <w:rPr>
+                <w:color w:val="404040"/>
+              </w:rPr>
+            </w:pPr>
+            <w:r>
+              <w:rPr>
+                <w:color w:val="808080"/>
+                <w:sz w:val="16"/>
+                <w:szCs w:val="16"/>
+                <w:rtl w:val="0"/>
+              </w:rPr>
+              <w:t xml:space="preserve">Inserir data</w:t>
+            </w:r>
+            <w:r>
+              <w:rPr>
+                <w:rtl w:val="0"/>
+              </w:rPr>
             </w:r>
           </w:p>
         </w:tc>
         <w:tc>
           <w:tcPr/>
           <w:p>
-            <w:r>
-              <w:t>CIV1517612</w:t>
+            <w:pPr>
+              <w:rPr>
+                <w:color w:val="404040"/>
+                <w:sz w:val="16"/>
+                <w:szCs w:val="16"/>
+              </w:rPr>
+            </w:pPr>
+            <w:r>
+              <w:rPr>
+                <w:color w:val="404040"/>
+                <w:sz w:val="16"/>
+                <w:szCs w:val="16"/>
+                <w:rtl w:val="0"/>
+              </w:rPr>
+              <w:t xml:space="preserve">Insira aqui a CIV</w:t>
             </w:r>
           </w:p>
         </w:tc>
@@ -1579,8 +1921,24 @@
             </w:tcBorders>
           </w:tcPr>
           <w:p>
-            <w:r>
-              <w:t>CUSTAS DIVERSAS E TAXAS JUDICIAIS / TRIBUNAL DE JU</w:t>
+            <w:pPr>
+              <w:rPr>
+                <w:color w:val="404040"/>
+              </w:rPr>
+            </w:pPr>
+            <w:r>
+              <w:rPr>
+                <w:color w:val="404040"/>
+                <w:sz w:val="14"/>
+                <w:szCs w:val="14"/>
+                <w:rtl w:val="0"/>
+              </w:rPr>
+              <w:t xml:space="preserve">Clique ou toque aqui para inserir o texto.</w:t>
+            </w:r>
+            <w:r>
+              <w:rPr>
+                <w:rtl w:val="0"/>
+              </w:rPr>
             </w:r>
           </w:p>
         </w:tc>
@@ -1595,8 +1953,23 @@
             <w:shd w:fill="fbe2d1" w:val="clear"/>
           </w:tcPr>
           <w:p>
-            <w:r>
-              <w:t>192,10</w:t>
+            <w:pPr>
+              <w:spacing w:after="20" w:before="20" w:lineRule="auto"/>
+              <w:jc w:val="right"/>
+              <w:rPr>
+                <w:color w:val="404040"/>
+                <w:sz w:val="16"/>
+                <w:szCs w:val="16"/>
+              </w:rPr>
+            </w:pPr>
+            <w:r>
+              <w:rPr>
+                <w:color w:val="404040"/>
+                <w:sz w:val="16"/>
+                <w:szCs w:val="16"/>
+                <w:rtl w:val="0"/>
+              </w:rPr>
+              <w:t xml:space="preserve">Insira aqui o valor</w:t>
             </w:r>
           </w:p>
         </w:tc>
@@ -1611,24 +1984,67 @@
             <w:shd w:fill="auto" w:val="clear"/>
           </w:tcPr>
           <w:p>
-            <w:r>
-              <w:t>Custas</w:t>
+            <w:pPr>
+              <w:pStyle w:val="Heading1"/>
+              <w:rPr>
+                <w:color w:val="404040"/>
+                <w:sz w:val="16"/>
+                <w:szCs w:val="16"/>
+              </w:rPr>
+            </w:pPr>
+            <w:r>
+              <w:rPr>
+                <w:color w:val="404040"/>
+                <w:sz w:val="16"/>
+                <w:szCs w:val="16"/>
+                <w:rtl w:val="0"/>
+              </w:rPr>
+              <w:t xml:space="preserve">Custas</w:t>
             </w:r>
           </w:p>
         </w:tc>
         <w:tc>
           <w:tcPr/>
           <w:p>
-            <w:r>
-              <w:t>27/03/2026</w:t>
+            <w:pPr>
+              <w:rPr>
+                <w:color w:val="404040"/>
+              </w:rPr>
+            </w:pPr>
+            <w:r>
+              <w:rPr>
+                <w:color w:val="808080"/>
+                <w:sz w:val="16"/>
+                <w:szCs w:val="16"/>
+                <w:rtl w:val="0"/>
+              </w:rPr>
+              <w:t xml:space="preserve">Inserir data</w:t>
+            </w:r>
+            <w:r>
+              <w:rPr>
+                <w:rtl w:val="0"/>
+              </w:rPr>
             </w:r>
           </w:p>
         </w:tc>
         <w:tc>
           <w:tcPr/>
           <w:p>
-            <w:r>
-              <w:t>CIV1516616</w:t>
+            <w:pPr>
+              <w:rPr>
+                <w:color w:val="404040"/>
+                <w:sz w:val="16"/>
+                <w:szCs w:val="16"/>
+              </w:rPr>
+            </w:pPr>
+            <w:r>
+              <w:rPr>
+                <w:color w:val="404040"/>
+                <w:sz w:val="16"/>
+                <w:szCs w:val="16"/>
+                <w:rtl w:val="0"/>
+              </w:rPr>
+              <w:t xml:space="preserve">Insira aqui a CIV</w:t>
             </w:r>
           </w:p>
         </w:tc>
@@ -1639,8 +2055,24 @@
             </w:tcBorders>
           </w:tcPr>
           <w:p>
-            <w:r>
-              <w:t>CUSTA FINAIS</w:t>
+            <w:pPr>
+              <w:rPr>
+                <w:color w:val="404040"/>
+              </w:rPr>
+            </w:pPr>
+            <w:r>
+              <w:rPr>
+                <w:color w:val="404040"/>
+                <w:sz w:val="14"/>
+                <w:szCs w:val="14"/>
+                <w:rtl w:val="0"/>
+              </w:rPr>
+              <w:t xml:space="preserve">Clique ou toque aqui para inserir o texto.</w:t>
+            </w:r>
+            <w:r>
+              <w:rPr>
+                <w:rtl w:val="0"/>
+              </w:rPr>
             </w:r>
           </w:p>
         </w:tc>
@@ -1655,8 +2087,23 @@
             <w:shd w:fill="fbe2d1" w:val="clear"/>
           </w:tcPr>
           <w:p>
-            <w:r>
-              <w:t>192,10</w:t>
+            <w:pPr>
+              <w:spacing w:after="20" w:before="20" w:lineRule="auto"/>
+              <w:jc w:val="right"/>
+              <w:rPr>
+                <w:color w:val="404040"/>
+                <w:sz w:val="16"/>
+                <w:szCs w:val="16"/>
+              </w:rPr>
+            </w:pPr>
+            <w:r>
+              <w:rPr>
+                <w:color w:val="404040"/>
+                <w:sz w:val="16"/>
+                <w:szCs w:val="16"/>
+                <w:rtl w:val="0"/>
+              </w:rPr>
+              <w:t xml:space="preserve">Insira aqui o valor</w:t>
             </w:r>
           </w:p>
         </w:tc>
@@ -1671,24 +2118,69 @@
             <w:shd w:fill="auto" w:val="clear"/>
           </w:tcPr>
           <w:p>
-            <w:r>
-              <w:t>Custas</w:t>
+            <w:pPr>
+              <w:pStyle w:val="Heading1"/>
+              <w:rPr>
+                <w:color w:val="404040"/>
+                <w:sz w:val="16"/>
+                <w:szCs w:val="16"/>
+              </w:rPr>
+            </w:pPr>
+            <w:r>
+              <w:rPr>
+                <w:color w:val="404040"/>
+                <w:sz w:val="16"/>
+                <w:szCs w:val="16"/>
+                <w:rtl w:val="0"/>
+              </w:rPr>
+              <w:t xml:space="preserve">Custas</w:t>
             </w:r>
           </w:p>
         </w:tc>
         <w:tc>
           <w:tcPr/>
           <w:p>
-            <w:r>
-              <w:t>27/03/2026</w:t>
+            <w:pPr>
+              <w:rPr>
+                <w:color w:val="404040"/>
+                <w:sz w:val="16"/>
+                <w:szCs w:val="16"/>
+              </w:rPr>
+            </w:pPr>
+            <w:r>
+              <w:rPr>
+                <w:color w:val="808080"/>
+                <w:sz w:val="16"/>
+                <w:szCs w:val="16"/>
+                <w:rtl w:val="0"/>
+              </w:rPr>
+              <w:t xml:space="preserve">Inserir data</w:t>
+            </w:r>
+            <w:r>
+              <w:rPr>
+                <w:rtl w:val="0"/>
+              </w:rPr>
             </w:r>
           </w:p>
         </w:tc>
         <w:tc>
           <w:tcPr/>
           <w:p>
-            <w:r>
-              <w:t>CIV1600985</w:t>
+            <w:pPr>
+              <w:rPr>
+                <w:color w:val="404040"/>
+                <w:sz w:val="16"/>
+                <w:szCs w:val="16"/>
+              </w:rPr>
+            </w:pPr>
+            <w:r>
+              <w:rPr>
+                <w:color w:val="404040"/>
+                <w:sz w:val="16"/>
+                <w:szCs w:val="16"/>
+                <w:rtl w:val="0"/>
+              </w:rPr>
+              <w:t xml:space="preserve">Insira aqui a CIV</w:t>
             </w:r>
           </w:p>
         </w:tc>
@@ -1699,8 +2191,24 @@
             </w:tcBorders>
           </w:tcPr>
           <w:p>
-            <w:r>
-              <w:t>CUSTA FINAIS</w:t>
+            <w:pPr>
+              <w:rPr>
+                <w:color w:val="404040"/>
+              </w:rPr>
+            </w:pPr>
+            <w:r>
+              <w:rPr>
+                <w:color w:val="404040"/>
+                <w:sz w:val="14"/>
+                <w:szCs w:val="14"/>
+                <w:rtl w:val="0"/>
+              </w:rPr>
+              <w:t xml:space="preserve">Clique ou toque aqui para inserir o texto.</w:t>
+            </w:r>
+            <w:r>
+              <w:rPr>
+                <w:rtl w:val="0"/>
+              </w:rPr>
             </w:r>
           </w:p>
         </w:tc>
@@ -1715,8 +2223,23 @@
             <w:shd w:fill="fbe2d1" w:val="clear"/>
           </w:tcPr>
           <w:p>
-            <w:r>
-              <w:t>311,72</w:t>
+            <w:pPr>
+              <w:spacing w:after="20" w:before="20" w:lineRule="auto"/>
+              <w:jc w:val="right"/>
+              <w:rPr>
+                <w:color w:val="404040"/>
+                <w:sz w:val="16"/>
+                <w:szCs w:val="16"/>
+              </w:rPr>
+            </w:pPr>
+            <w:r>
+              <w:rPr>
+                <w:color w:val="404040"/>
+                <w:sz w:val="16"/>
+                <w:szCs w:val="16"/>
+                <w:rtl w:val="0"/>
+              </w:rPr>
+              <w:t xml:space="preserve">Insira aqui o valor</w:t>
             </w:r>
           </w:p>
         </w:tc>
@@ -1731,24 +2254,69 @@
             <w:shd w:fill="auto" w:val="clear"/>
           </w:tcPr>
           <w:p>
-            <w:r>
-              <w:t>Custas</w:t>
+            <w:pPr>
+              <w:pStyle w:val="Heading1"/>
+              <w:rPr>
+                <w:color w:val="404040"/>
+                <w:sz w:val="16"/>
+                <w:szCs w:val="16"/>
+              </w:rPr>
+            </w:pPr>
+            <w:r>
+              <w:rPr>
+                <w:color w:val="404040"/>
+                <w:sz w:val="16"/>
+                <w:szCs w:val="16"/>
+                <w:rtl w:val="0"/>
+              </w:rPr>
+              <w:t xml:space="preserve">Custas</w:t>
             </w:r>
           </w:p>
         </w:tc>
         <w:tc>
           <w:tcPr/>
           <w:p>
-            <w:r>
-              <w:t>27/03/2026</w:t>
+            <w:pPr>
+              <w:rPr>
+                <w:color w:val="404040"/>
+                <w:sz w:val="16"/>
+                <w:szCs w:val="16"/>
+              </w:rPr>
+            </w:pPr>
+            <w:r>
+              <w:rPr>
+                <w:color w:val="808080"/>
+                <w:sz w:val="16"/>
+                <w:szCs w:val="16"/>
+                <w:rtl w:val="0"/>
+              </w:rPr>
+              <w:t xml:space="preserve">Inserir data</w:t>
+            </w:r>
+            <w:r>
+              <w:rPr>
+                <w:rtl w:val="0"/>
+              </w:rPr>
             </w:r>
           </w:p>
         </w:tc>
         <w:tc>
           <w:tcPr/>
           <w:p>
-            <w:r>
-              <w:t>CIV1649911</w:t>
+            <w:pPr>
+              <w:rPr>
+                <w:color w:val="404040"/>
+                <w:sz w:val="16"/>
+                <w:szCs w:val="16"/>
+              </w:rPr>
+            </w:pPr>
+            <w:r>
+              <w:rPr>
+                <w:color w:val="404040"/>
+                <w:sz w:val="16"/>
+                <w:szCs w:val="16"/>
+                <w:rtl w:val="0"/>
+              </w:rPr>
+              <w:t xml:space="preserve">Insira aqui a CIV</w:t>
             </w:r>
           </w:p>
         </w:tc>
@@ -1759,8 +2327,24 @@
             </w:tcBorders>
           </w:tcPr>
           <w:p>
-            <w:r>
-              <w:t>CUSTA FINAIS</w:t>
+            <w:pPr>
+              <w:rPr>
+                <w:color w:val="404040"/>
+              </w:rPr>
+            </w:pPr>
+            <w:r>
+              <w:rPr>
+                <w:color w:val="404040"/>
+                <w:sz w:val="14"/>
+                <w:szCs w:val="14"/>
+                <w:rtl w:val="0"/>
+              </w:rPr>
+              <w:t xml:space="preserve">Clique ou toque aqui para inserir o texto.</w:t>
+            </w:r>
+            <w:r>
+              <w:rPr>
+                <w:rtl w:val="0"/>
+              </w:rPr>
             </w:r>
           </w:p>
         </w:tc>
@@ -1775,8 +2359,23 @@
             <w:shd w:fill="fbe2d1" w:val="clear"/>
           </w:tcPr>
           <w:p>
-            <w:r>
-              <w:t>288,50</w:t>
+            <w:pPr>
+              <w:spacing w:after="20" w:before="20" w:lineRule="auto"/>
+              <w:jc w:val="right"/>
+              <w:rPr>
+                <w:color w:val="404040"/>
+                <w:sz w:val="16"/>
+                <w:szCs w:val="16"/>
+              </w:rPr>
+            </w:pPr>
+            <w:r>
+              <w:rPr>
+                <w:color w:val="404040"/>
+                <w:sz w:val="16"/>
+                <w:szCs w:val="16"/>
+                <w:rtl w:val="0"/>
+              </w:rPr>
+              <w:t xml:space="preserve">Insira aqui o valor</w:t>
             </w:r>
           </w:p>
         </w:tc>
@@ -1791,24 +2390,69 @@
             <w:shd w:fill="auto" w:val="clear"/>
           </w:tcPr>
           <w:p>
-            <w:r>
-              <w:t>Custas</w:t>
+            <w:pPr>
+              <w:pStyle w:val="Heading1"/>
+              <w:rPr>
+                <w:color w:val="404040"/>
+                <w:sz w:val="16"/>
+                <w:szCs w:val="16"/>
+              </w:rPr>
+            </w:pPr>
+            <w:r>
+              <w:rPr>
+                <w:color w:val="404040"/>
+                <w:sz w:val="16"/>
+                <w:szCs w:val="16"/>
+                <w:rtl w:val="0"/>
+              </w:rPr>
+              <w:t xml:space="preserve">Custas</w:t>
             </w:r>
           </w:p>
         </w:tc>
         <w:tc>
           <w:tcPr/>
           <w:p>
-            <w:r>
-              <w:t>27/03/2026</w:t>
+            <w:pPr>
+              <w:rPr>
+                <w:color w:val="404040"/>
+                <w:sz w:val="16"/>
+                <w:szCs w:val="16"/>
+              </w:rPr>
+            </w:pPr>
+            <w:r>
+              <w:rPr>
+                <w:color w:val="808080"/>
+                <w:sz w:val="16"/>
+                <w:szCs w:val="16"/>
+                <w:rtl w:val="0"/>
+              </w:rPr>
+              <w:t xml:space="preserve">Inserir data</w:t>
+            </w:r>
+            <w:r>
+              <w:rPr>
+                <w:rtl w:val="0"/>
+              </w:rPr>
             </w:r>
           </w:p>
         </w:tc>
         <w:tc>
           <w:tcPr/>
           <w:p>
-            <w:r>
-              <w:t>CIV1588967</w:t>
+            <w:pPr>
+              <w:rPr>
+                <w:color w:val="404040"/>
+                <w:sz w:val="16"/>
+                <w:szCs w:val="16"/>
+              </w:rPr>
+            </w:pPr>
+            <w:r>
+              <w:rPr>
+                <w:color w:val="404040"/>
+                <w:sz w:val="16"/>
+                <w:szCs w:val="16"/>
+                <w:rtl w:val="0"/>
+              </w:rPr>
+              <w:t xml:space="preserve">Insira aqui a CIV</w:t>
             </w:r>
           </w:p>
         </w:tc>
@@ -1819,8 +2463,24 @@
             </w:tcBorders>
           </w:tcPr>
           <w:p>
-            <w:r>
-              <w:t>CUSTA FINAIS</w:t>
+            <w:pPr>
+              <w:rPr>
+                <w:color w:val="404040"/>
+              </w:rPr>
+            </w:pPr>
+            <w:r>
+              <w:rPr>
+                <w:color w:val="404040"/>
+                <w:sz w:val="14"/>
+                <w:szCs w:val="14"/>
+                <w:rtl w:val="0"/>
+              </w:rPr>
+              <w:t xml:space="preserve">Clique ou toque aqui para inserir o texto.</w:t>
+            </w:r>
+            <w:r>
+              <w:rPr>
+                <w:rtl w:val="0"/>
+              </w:rPr>
             </w:r>
           </w:p>
         </w:tc>
@@ -1835,8 +2495,23 @@
             <w:shd w:fill="fbe2d1" w:val="clear"/>
           </w:tcPr>
           <w:p>
-            <w:r>
-              <w:t>288,50</w:t>
+            <w:pPr>
+              <w:spacing w:after="20" w:before="20" w:lineRule="auto"/>
+              <w:jc w:val="right"/>
+              <w:rPr>
+                <w:color w:val="404040"/>
+                <w:sz w:val="16"/>
+                <w:szCs w:val="16"/>
+              </w:rPr>
+            </w:pPr>
+            <w:r>
+              <w:rPr>
+                <w:color w:val="404040"/>
+                <w:sz w:val="16"/>
+                <w:szCs w:val="16"/>
+                <w:rtl w:val="0"/>
+              </w:rPr>
+              <w:t xml:space="preserve">Insira aqui o valor</w:t>
             </w:r>
           </w:p>
         </w:tc>
@@ -1851,24 +2526,69 @@
             <w:shd w:fill="auto" w:val="clear"/>
           </w:tcPr>
           <w:p>
-            <w:r>
-              <w:t>Custas</w:t>
+            <w:pPr>
+              <w:pStyle w:val="Heading1"/>
+              <w:rPr>
+                <w:color w:val="404040"/>
+                <w:sz w:val="16"/>
+                <w:szCs w:val="16"/>
+              </w:rPr>
+            </w:pPr>
+            <w:r>
+              <w:rPr>
+                <w:color w:val="404040"/>
+                <w:sz w:val="16"/>
+                <w:szCs w:val="16"/>
+                <w:rtl w:val="0"/>
+              </w:rPr>
+              <w:t xml:space="preserve">Custas</w:t>
             </w:r>
           </w:p>
         </w:tc>
         <w:tc>
           <w:tcPr/>
           <w:p>
-            <w:r>
-              <w:t>27/03/2026</w:t>
+            <w:pPr>
+              <w:rPr>
+                <w:color w:val="404040"/>
+                <w:sz w:val="16"/>
+                <w:szCs w:val="16"/>
+              </w:rPr>
+            </w:pPr>
+            <w:r>
+              <w:rPr>
+                <w:color w:val="808080"/>
+                <w:sz w:val="16"/>
+                <w:szCs w:val="16"/>
+                <w:rtl w:val="0"/>
+              </w:rPr>
+              <w:t xml:space="preserve">Inserir data</w:t>
+            </w:r>
+            <w:r>
+              <w:rPr>
+                <w:rtl w:val="0"/>
+              </w:rPr>
             </w:r>
           </w:p>
         </w:tc>
         <w:tc>
           <w:tcPr/>
           <w:p>
-            <w:r>
-              <w:t>CIV1458169</w:t>
+            <w:pPr>
+              <w:rPr>
+                <w:color w:val="404040"/>
+                <w:sz w:val="16"/>
+                <w:szCs w:val="16"/>
+              </w:rPr>
+            </w:pPr>
+            <w:r>
+              <w:rPr>
+                <w:color w:val="404040"/>
+                <w:sz w:val="16"/>
+                <w:szCs w:val="16"/>
+                <w:rtl w:val="0"/>
+              </w:rPr>
+              <w:t xml:space="preserve">Insira aqui a CIV</w:t>
             </w:r>
           </w:p>
         </w:tc>
@@ -1879,8 +2599,24 @@
             </w:tcBorders>
           </w:tcPr>
           <w:p>
-            <w:r>
-              <w:t>CUSTA FINAIS</w:t>
+            <w:pPr>
+              <w:rPr>
+                <w:color w:val="404040"/>
+              </w:rPr>
+            </w:pPr>
+            <w:r>
+              <w:rPr>
+                <w:color w:val="404040"/>
+                <w:sz w:val="14"/>
+                <w:szCs w:val="14"/>
+                <w:rtl w:val="0"/>
+              </w:rPr>
+              <w:t xml:space="preserve">Clique ou toque aqui para inserir o texto.</w:t>
+            </w:r>
+            <w:r>
+              <w:rPr>
+                <w:rtl w:val="0"/>
+              </w:rPr>
             </w:r>
           </w:p>
         </w:tc>
@@ -1895,8 +2631,23 @@
             <w:shd w:fill="fbe2d1" w:val="clear"/>
           </w:tcPr>
           <w:p>
-            <w:r>
-              <w:t>750,10</w:t>
+            <w:pPr>
+              <w:spacing w:after="20" w:before="20" w:lineRule="auto"/>
+              <w:jc w:val="right"/>
+              <w:rPr>
+                <w:color w:val="404040"/>
+                <w:sz w:val="16"/>
+                <w:szCs w:val="16"/>
+              </w:rPr>
+            </w:pPr>
+            <w:r>
+              <w:rPr>
+                <w:color w:val="404040"/>
+                <w:sz w:val="16"/>
+                <w:szCs w:val="16"/>
+                <w:rtl w:val="0"/>
+              </w:rPr>
+              <w:t xml:space="preserve">Insira aqui o valor</w:t>
             </w:r>
           </w:p>
         </w:tc>
@@ -1911,246 +2662,6 @@
             <w:shd w:fill="auto" w:val="clear"/>
           </w:tcPr>
           <w:p>
-            <w:r>
-              <w:t>Custas</w:t>
-            </w:r>
-          </w:p>
-        </w:tc>
-        <w:tc>
-          <w:tcPr/>
-          <w:p>
-            <w:r>
-              <w:t>27/03/2026</w:t>
-            </w:r>
-          </w:p>
-        </w:tc>
-        <w:tc>
-          <w:tcPr/>
-          <w:p>
-            <w:r>
-              <w:t>CIV1516312</w:t>
-            </w:r>
-          </w:p>
-        </w:tc>
-        <w:tc>
-          <w:tcPr>
-            <w:tcBorders>
-              <w:right w:color="ffffff" w:space="0" w:sz="18" w:val="single"/>
-            </w:tcBorders>
-          </w:tcPr>
-          <w:p>
-            <w:r>
-              <w:t>RECURSO INOMINADO</w:t>
-            </w:r>
-          </w:p>
-        </w:tc>
-        <w:tc>
-          <w:tcPr>
-            <w:tcBorders>
-              <w:top w:color="ffffff" w:space="0" w:sz="18" w:val="single"/>
-              <w:left w:color="ffffff" w:space="0" w:sz="18" w:val="single"/>
-              <w:bottom w:color="ffffff" w:space="0" w:sz="18" w:val="single"/>
-              <w:right w:color="000000" w:space="0" w:sz="0" w:val="nil"/>
-            </w:tcBorders>
-            <w:shd w:fill="fbe2d1" w:val="clear"/>
-          </w:tcPr>
-          <w:p>
-            <w:r>
-              <w:t>1287,26</w:t>
-            </w:r>
-          </w:p>
-        </w:tc>
-      </w:tr>
-      <w:tr>
-        <w:trPr>
-          <w:cantSplit w:val="0"/>
-          <w:tblHeader w:val="0"/>
-        </w:trPr>
-        <w:tc>
-          <w:tcPr>
-            <w:shd w:fill="auto" w:val="clear"/>
-          </w:tcPr>
-          <w:p>
-            <w:r>
-              <w:t>Custas</w:t>
-            </w:r>
-          </w:p>
-        </w:tc>
-        <w:tc>
-          <w:tcPr/>
-          <w:p>
-            <w:r>
-              <w:t>27/03/2026</w:t>
-            </w:r>
-          </w:p>
-        </w:tc>
-        <w:tc>
-          <w:tcPr/>
-          <w:p>
-            <w:r>
-              <w:t>CIV1095022</w:t>
-            </w:r>
-          </w:p>
-        </w:tc>
-        <w:tc>
-          <w:tcPr>
-            <w:tcBorders>
-              <w:right w:color="ffffff" w:space="0" w:sz="18" w:val="single"/>
-            </w:tcBorders>
-          </w:tcPr>
-          <w:p>
-            <w:r>
-              <w:t>APELAÇÃO CIVEL</w:t>
-            </w:r>
-          </w:p>
-        </w:tc>
-        <w:tc>
-          <w:tcPr>
-            <w:tcBorders>
-              <w:top w:color="ffffff" w:space="0" w:sz="18" w:val="single"/>
-              <w:left w:color="ffffff" w:space="0" w:sz="18" w:val="single"/>
-              <w:bottom w:color="ffffff" w:space="0" w:sz="18" w:val="single"/>
-              <w:right w:color="000000" w:space="0" w:sz="0" w:val="nil"/>
-            </w:tcBorders>
-            <w:shd w:fill="fbe2d1" w:val="clear"/>
-          </w:tcPr>
-          <w:p>
-            <w:r>
-              <w:t>649,50</w:t>
-            </w:r>
-          </w:p>
-        </w:tc>
-      </w:tr>
-      <w:tr>
-        <w:trPr>
-          <w:cantSplit w:val="0"/>
-          <w:tblHeader w:val="0"/>
-        </w:trPr>
-        <w:tc>
-          <w:tcPr>
-            <w:shd w:fill="auto" w:val="clear"/>
-          </w:tcPr>
-          <w:p>
-            <w:r>
-              <w:t>Custas</w:t>
-            </w:r>
-          </w:p>
-        </w:tc>
-        <w:tc>
-          <w:tcPr/>
-          <w:p>
-            <w:r>
-              <w:t>27/03/2026</w:t>
-            </w:r>
-          </w:p>
-        </w:tc>
-        <w:tc>
-          <w:tcPr/>
-          <w:p>
-            <w:r>
-              <w:t>CIV1567784</w:t>
-            </w:r>
-          </w:p>
-        </w:tc>
-        <w:tc>
-          <w:tcPr>
-            <w:tcBorders>
-              <w:right w:color="ffffff" w:space="0" w:sz="18" w:val="single"/>
-            </w:tcBorders>
-          </w:tcPr>
-          <w:p>
-            <w:r>
-              <w:t>APELAÇÃO CIVEL</w:t>
-            </w:r>
-          </w:p>
-        </w:tc>
-        <w:tc>
-          <w:tcPr>
-            <w:tcBorders>
-              <w:top w:color="ffffff" w:space="0" w:sz="18" w:val="single"/>
-              <w:left w:color="ffffff" w:space="0" w:sz="18" w:val="single"/>
-              <w:bottom w:color="ffffff" w:space="0" w:sz="18" w:val="single"/>
-              <w:right w:color="000000" w:space="0" w:sz="0" w:val="nil"/>
-            </w:tcBorders>
-            <w:shd w:fill="fbe2d1" w:val="clear"/>
-          </w:tcPr>
-          <w:p>
-            <w:r>
-              <w:t>649,50</w:t>
-            </w:r>
-          </w:p>
-        </w:tc>
-      </w:tr>
-      <w:tr>
-        <w:trPr>
-          <w:cantSplit w:val="0"/>
-          <w:tblHeader w:val="0"/>
-        </w:trPr>
-        <w:tc>
-          <w:tcPr>
-            <w:shd w:fill="auto" w:val="clear"/>
-          </w:tcPr>
-          <w:p>
-            <w:r>
-              <w:t>Custas</w:t>
-            </w:r>
-          </w:p>
-        </w:tc>
-        <w:tc>
-          <w:tcPr/>
-          <w:p>
-            <w:r>
-              <w:t>27/03/2026</w:t>
-            </w:r>
-          </w:p>
-        </w:tc>
-        <w:tc>
-          <w:tcPr/>
-          <w:p>
-            <w:r>
-              <w:t>CIV1667258</w:t>
-            </w:r>
-          </w:p>
-        </w:tc>
-        <w:tc>
-          <w:tcPr>
-            <w:tcBorders>
-              <w:right w:color="ffffff" w:space="0" w:sz="18" w:val="single"/>
-            </w:tcBorders>
-          </w:tcPr>
-          <w:p>
-            <w:r>
-              <w:t>APELAÇÃO CIVEL</w:t>
-            </w:r>
-          </w:p>
-        </w:tc>
-        <w:tc>
-          <w:tcPr>
-            <w:tcBorders>
-              <w:top w:color="ffffff" w:space="0" w:sz="18" w:val="single"/>
-              <w:left w:color="ffffff" w:space="0" w:sz="18" w:val="single"/>
-              <w:bottom w:color="ffffff" w:space="0" w:sz="18" w:val="single"/>
-              <w:right w:color="000000" w:space="0" w:sz="0" w:val="nil"/>
-            </w:tcBorders>
-            <w:shd w:fill="fbe2d1" w:val="clear"/>
-          </w:tcPr>
-          <w:p>
-            <w:r>
-              <w:t>649,50</w:t>
-            </w:r>
-          </w:p>
-        </w:tc>
-      </w:tr>
-      <w:tr>
-        <w:trPr>
-          <w:cantSplit w:val="0"/>
-          <w:tblHeader w:val="0"/>
-        </w:trPr>
-        <w:tc>
-          <w:tcPr>
-            <w:shd w:fill="auto" w:val="clear"/>
-          </w:tcPr>
-          <w:p>
             <w:pPr>
               <w:pStyle w:val="Heading1"/>
               <w:rPr>
@@ -2159,8 +2670,8 @@
                 <w:szCs w:val="16"/>
               </w:rPr>
             </w:pPr>
-            <w:bookmarkStart w:colFirst="0" w:colLast="0" w:name="_ebfubqqh2zjb" w:id="4"/>
-            <w:bookmarkEnd w:id="4"/>
+            <w:bookmarkStart w:colFirst="0" w:colLast="0" w:name="_sd39j3ao8pqp" w:id="0"/>
+            <w:bookmarkEnd w:id="0"/>
             <w:r>
               <w:rPr>
                 <w:color w:val="404040"/>
@@ -2330,8 +2841,8 @@
                 <w:szCs w:val="16"/>
               </w:rPr>
             </w:pPr>
-            <w:bookmarkStart w:colFirst="0" w:colLast="0" w:name="_bxcrtqa4xafh" w:id="5"/>
-            <w:bookmarkEnd w:id="5"/>
+            <w:bookmarkStart w:colFirst="0" w:colLast="0" w:name="_f5py6ykucpph" w:id="1"/>
+            <w:bookmarkEnd w:id="1"/>
             <w:r>
               <w:rPr>
                 <w:color w:val="404040"/>
@@ -2501,8 +3012,8 @@
                 <w:szCs w:val="16"/>
               </w:rPr>
             </w:pPr>
-            <w:bookmarkStart w:colFirst="0" w:colLast="0" w:name="_up6n6jj68oid" w:id="6"/>
-            <w:bookmarkEnd w:id="6"/>
+            <w:bookmarkStart w:colFirst="0" w:colLast="0" w:name="_dhqlz94umpke" w:id="2"/>
+            <w:bookmarkEnd w:id="2"/>
             <w:r>
               <w:rPr>
                 <w:color w:val="404040"/>
@@ -2672,8 +3183,8 @@
                 <w:szCs w:val="16"/>
               </w:rPr>
             </w:pPr>
-            <w:bookmarkStart w:colFirst="0" w:colLast="0" w:name="_30n9v1q38zcw" w:id="7"/>
-            <w:bookmarkEnd w:id="7"/>
+            <w:bookmarkStart w:colFirst="0" w:colLast="0" w:name="_qp6ewsdo5j7r" w:id="3"/>
+            <w:bookmarkEnd w:id="3"/>
             <w:r>
               <w:rPr>
                 <w:color w:val="404040"/>
@@ -2843,8 +3354,8 @@
                 <w:szCs w:val="16"/>
               </w:rPr>
             </w:pPr>
-            <w:bookmarkStart w:colFirst="0" w:colLast="0" w:name="_7bppt4fwklnt" w:id="8"/>
-            <w:bookmarkEnd w:id="8"/>
+            <w:bookmarkStart w:colFirst="0" w:colLast="0" w:name="_ebfubqqh2zjb" w:id="4"/>
+            <w:bookmarkEnd w:id="4"/>
             <w:r>
               <w:rPr>
                 <w:color w:val="404040"/>
@@ -3014,8 +3525,8 @@
                 <w:szCs w:val="16"/>
               </w:rPr>
             </w:pPr>
-            <w:bookmarkStart w:colFirst="0" w:colLast="0" w:name="_uhzybp3fj983" w:id="9"/>
-            <w:bookmarkEnd w:id="9"/>
+            <w:bookmarkStart w:colFirst="0" w:colLast="0" w:name="_bxcrtqa4xafh" w:id="5"/>
+            <w:bookmarkEnd w:id="5"/>
             <w:r>
               <w:rPr>
                 <w:color w:val="404040"/>
@@ -3185,8 +3696,8 @@
                 <w:szCs w:val="16"/>
               </w:rPr>
             </w:pPr>
-            <w:bookmarkStart w:colFirst="0" w:colLast="0" w:name="_a92w015znzg1" w:id="10"/>
-            <w:bookmarkEnd w:id="10"/>
+            <w:bookmarkStart w:colFirst="0" w:colLast="0" w:name="_up6n6jj68oid" w:id="6"/>
+            <w:bookmarkEnd w:id="6"/>
             <w:r>
               <w:rPr>
                 <w:color w:val="404040"/>
@@ -3356,8 +3867,8 @@
                 <w:szCs w:val="16"/>
               </w:rPr>
             </w:pPr>
-            <w:bookmarkStart w:colFirst="0" w:colLast="0" w:name="_urdskom0lpfu" w:id="11"/>
-            <w:bookmarkEnd w:id="11"/>
+            <w:bookmarkStart w:colFirst="0" w:colLast="0" w:name="_30n9v1q38zcw" w:id="7"/>
+            <w:bookmarkEnd w:id="7"/>
             <w:r>
               <w:rPr>
                 <w:color w:val="404040"/>
@@ -3527,8 +4038,8 @@
                 <w:szCs w:val="16"/>
               </w:rPr>
             </w:pPr>
-            <w:bookmarkStart w:colFirst="0" w:colLast="0" w:name="_2rw37dvji088" w:id="12"/>
-            <w:bookmarkEnd w:id="12"/>
+            <w:bookmarkStart w:colFirst="0" w:colLast="0" w:name="_7bppt4fwklnt" w:id="8"/>
+            <w:bookmarkEnd w:id="8"/>
             <w:r>
               <w:rPr>
                 <w:color w:val="404040"/>
@@ -3698,8 +4209,8 @@
                 <w:szCs w:val="16"/>
               </w:rPr>
             </w:pPr>
-            <w:bookmarkStart w:colFirst="0" w:colLast="0" w:name="_n2wyfa8c264d" w:id="13"/>
-            <w:bookmarkEnd w:id="13"/>
+            <w:bookmarkStart w:colFirst="0" w:colLast="0" w:name="_uhzybp3fj983" w:id="9"/>
+            <w:bookmarkEnd w:id="9"/>
             <w:r>
               <w:rPr>
                 <w:color w:val="404040"/>
@@ -3869,8 +4380,8 @@
                 <w:szCs w:val="16"/>
               </w:rPr>
             </w:pPr>
-            <w:bookmarkStart w:colFirst="0" w:colLast="0" w:name="_ofjeporj49yh" w:id="14"/>
-            <w:bookmarkEnd w:id="14"/>
+            <w:bookmarkStart w:colFirst="0" w:colLast="0" w:name="_a92w015znzg1" w:id="10"/>
+            <w:bookmarkEnd w:id="10"/>
             <w:r>
               <w:rPr>
                 <w:color w:val="404040"/>
@@ -4040,8 +4551,8 @@
                 <w:szCs w:val="16"/>
               </w:rPr>
             </w:pPr>
-            <w:bookmarkStart w:colFirst="0" w:colLast="0" w:name="_f5cind9pa8zf" w:id="15"/>
-            <w:bookmarkEnd w:id="15"/>
+            <w:bookmarkStart w:colFirst="0" w:colLast="0" w:name="_urdskom0lpfu" w:id="11"/>
+            <w:bookmarkEnd w:id="11"/>
             <w:r>
               <w:rPr>
                 <w:color w:val="404040"/>
@@ -4211,8 +4722,8 @@
                 <w:szCs w:val="16"/>
               </w:rPr>
             </w:pPr>
-            <w:bookmarkStart w:colFirst="0" w:colLast="0" w:name="_t1d3h6rn0nct" w:id="16"/>
-            <w:bookmarkEnd w:id="16"/>
+            <w:bookmarkStart w:colFirst="0" w:colLast="0" w:name="_2rw37dvji088" w:id="12"/>
+            <w:bookmarkEnd w:id="12"/>
             <w:r>
               <w:rPr>
                 <w:color w:val="404040"/>
@@ -4382,8 +4893,8 @@
                 <w:szCs w:val="16"/>
               </w:rPr>
             </w:pPr>
-            <w:bookmarkStart w:colFirst="0" w:colLast="0" w:name="_6on19tlxeb2m" w:id="17"/>
-            <w:bookmarkEnd w:id="17"/>
+            <w:bookmarkStart w:colFirst="0" w:colLast="0" w:name="_n2wyfa8c264d" w:id="13"/>
+            <w:bookmarkEnd w:id="13"/>
             <w:r>
               <w:rPr>
                 <w:color w:val="404040"/>
@@ -4553,8 +5064,8 @@
                 <w:szCs w:val="16"/>
               </w:rPr>
             </w:pPr>
-            <w:bookmarkStart w:colFirst="0" w:colLast="0" w:name="_4cwo4kgzeb0s" w:id="18"/>
-            <w:bookmarkEnd w:id="18"/>
+            <w:bookmarkStart w:colFirst="0" w:colLast="0" w:name="_ofjeporj49yh" w:id="14"/>
+            <w:bookmarkEnd w:id="14"/>
             <w:r>
               <w:rPr>
                 <w:color w:val="404040"/>
@@ -4724,8 +5235,8 @@
                 <w:szCs w:val="16"/>
               </w:rPr>
             </w:pPr>
-            <w:bookmarkStart w:colFirst="0" w:colLast="0" w:name="_cc4a4yedhsqv" w:id="19"/>
-            <w:bookmarkEnd w:id="19"/>
+            <w:bookmarkStart w:colFirst="0" w:colLast="0" w:name="_f5cind9pa8zf" w:id="15"/>
+            <w:bookmarkEnd w:id="15"/>
             <w:r>
               <w:rPr>
                 <w:color w:val="404040"/>
@@ -4895,8 +5406,8 @@
                 <w:szCs w:val="16"/>
               </w:rPr>
             </w:pPr>
-            <w:bookmarkStart w:colFirst="0" w:colLast="0" w:name="_63rhf2cx9ffs" w:id="20"/>
-            <w:bookmarkEnd w:id="20"/>
+            <w:bookmarkStart w:colFirst="0" w:colLast="0" w:name="_t1d3h6rn0nct" w:id="16"/>
+            <w:bookmarkEnd w:id="16"/>
             <w:r>
               <w:rPr>
                 <w:color w:val="404040"/>
@@ -5066,8 +5577,8 @@
                 <w:szCs w:val="16"/>
               </w:rPr>
             </w:pPr>
-            <w:bookmarkStart w:colFirst="0" w:colLast="0" w:name="_mv34e6my0ku4" w:id="21"/>
-            <w:bookmarkEnd w:id="21"/>
+            <w:bookmarkStart w:colFirst="0" w:colLast="0" w:name="_6on19tlxeb2m" w:id="17"/>
+            <w:bookmarkEnd w:id="17"/>
             <w:r>
               <w:rPr>
                 <w:color w:val="404040"/>
@@ -5237,8 +5748,8 @@
                 <w:szCs w:val="16"/>
               </w:rPr>
             </w:pPr>
-            <w:bookmarkStart w:colFirst="0" w:colLast="0" w:name="_mk15luoi5okf" w:id="22"/>
-            <w:bookmarkEnd w:id="22"/>
+            <w:bookmarkStart w:colFirst="0" w:colLast="0" w:name="_4cwo4kgzeb0s" w:id="18"/>
+            <w:bookmarkEnd w:id="18"/>
             <w:r>
               <w:rPr>
                 <w:color w:val="404040"/>
@@ -5408,8 +5919,8 @@
                 <w:szCs w:val="16"/>
               </w:rPr>
             </w:pPr>
-            <w:bookmarkStart w:colFirst="0" w:colLast="0" w:name="_yrfs3cplasrf" w:id="23"/>
-            <w:bookmarkEnd w:id="23"/>
+            <w:bookmarkStart w:colFirst="0" w:colLast="0" w:name="_cc4a4yedhsqv" w:id="19"/>
+            <w:bookmarkEnd w:id="19"/>
             <w:r>
               <w:rPr>
                 <w:color w:val="404040"/>
@@ -5579,8 +6090,8 @@
                 <w:szCs w:val="16"/>
               </w:rPr>
             </w:pPr>
-            <w:bookmarkStart w:colFirst="0" w:colLast="0" w:name="_mhgo4jfnucw" w:id="24"/>
-            <w:bookmarkEnd w:id="24"/>
+            <w:bookmarkStart w:colFirst="0" w:colLast="0" w:name="_63rhf2cx9ffs" w:id="20"/>
+            <w:bookmarkEnd w:id="20"/>
             <w:r>
               <w:rPr>
                 <w:color w:val="404040"/>
@@ -5750,8 +6261,8 @@
                 <w:szCs w:val="16"/>
               </w:rPr>
             </w:pPr>
-            <w:bookmarkStart w:colFirst="0" w:colLast="0" w:name="_jpgqoighbi7l" w:id="25"/>
-            <w:bookmarkEnd w:id="25"/>
+            <w:bookmarkStart w:colFirst="0" w:colLast="0" w:name="_mv34e6my0ku4" w:id="21"/>
+            <w:bookmarkEnd w:id="21"/>
             <w:r>
               <w:rPr>
                 <w:color w:val="404040"/>
@@ -5921,8 +6432,8 @@
                 <w:szCs w:val="16"/>
               </w:rPr>
             </w:pPr>
-            <w:bookmarkStart w:colFirst="0" w:colLast="0" w:name="_hwvt8npkipj0" w:id="26"/>
-            <w:bookmarkEnd w:id="26"/>
+            <w:bookmarkStart w:colFirst="0" w:colLast="0" w:name="_mk15luoi5okf" w:id="22"/>
+            <w:bookmarkEnd w:id="22"/>
             <w:r>
               <w:rPr>
                 <w:color w:val="404040"/>
@@ -6092,19 +6603,16 @@
                 <w:szCs w:val="16"/>
               </w:rPr>
             </w:pPr>
-            <w:r>
-              <w:rPr>
-                <w:color w:val="808080"/>
-                <w:sz w:val="16"/>
-                <w:szCs w:val="16"/>
-                <w:rtl w:val="0"/>
-              </w:rPr>
-              <w:t xml:space="preserve">Escolher um item.</w:t>
-            </w:r>
-            <w:r>
-              <w:rPr>
-                <w:rtl w:val="0"/>
-              </w:rPr>
+            <w:bookmarkStart w:colFirst="0" w:colLast="0" w:name="_yrfs3cplasrf" w:id="23"/>
+            <w:bookmarkEnd w:id="23"/>
+            <w:r>
+              <w:rPr>
+                <w:color w:val="404040"/>
+                <w:sz w:val="16"/>
+                <w:szCs w:val="16"/>
+                <w:rtl w:val="0"/>
+              </w:rPr>
+              <w:t xml:space="preserve">Custas</w:t>
             </w:r>
           </w:p>
         </w:tc>
@@ -6266,19 +6774,16 @@
                 <w:szCs w:val="16"/>
               </w:rPr>
             </w:pPr>
-            <w:r>
-              <w:rPr>
-                <w:color w:val="808080"/>
-                <w:sz w:val="16"/>
-                <w:szCs w:val="16"/>
-                <w:rtl w:val="0"/>
-              </w:rPr>
-              <w:t xml:space="preserve">Escolher um item.</w:t>
-            </w:r>
-            <w:r>
-              <w:rPr>
-                <w:rtl w:val="0"/>
-              </w:rPr>
+            <w:bookmarkStart w:colFirst="0" w:colLast="0" w:name="_mhgo4jfnucw" w:id="24"/>
+            <w:bookmarkEnd w:id="24"/>
+            <w:r>
+              <w:rPr>
+                <w:color w:val="404040"/>
+                <w:sz w:val="16"/>
+                <w:szCs w:val="16"/>
+                <w:rtl w:val="0"/>
+              </w:rPr>
+              <w:t xml:space="preserve">Custas</w:t>
             </w:r>
           </w:p>
         </w:tc>
@@ -6440,19 +6945,16 @@
                 <w:szCs w:val="16"/>
               </w:rPr>
             </w:pPr>
-            <w:r>
-              <w:rPr>
-                <w:color w:val="808080"/>
-                <w:sz w:val="16"/>
-                <w:szCs w:val="16"/>
-                <w:rtl w:val="0"/>
-              </w:rPr>
-              <w:t xml:space="preserve">Escolher um item.</w:t>
-            </w:r>
-            <w:r>
-              <w:rPr>
-                <w:rtl w:val="0"/>
-              </w:rPr>
+            <w:bookmarkStart w:colFirst="0" w:colLast="0" w:name="_jpgqoighbi7l" w:id="25"/>
+            <w:bookmarkEnd w:id="25"/>
+            <w:r>
+              <w:rPr>
+                <w:color w:val="404040"/>
+                <w:sz w:val="16"/>
+                <w:szCs w:val="16"/>
+                <w:rtl w:val="0"/>
+              </w:rPr>
+              <w:t xml:space="preserve">Custas</w:t>
             </w:r>
           </w:p>
         </w:tc>
@@ -6614,19 +7116,16 @@
                 <w:szCs w:val="16"/>
               </w:rPr>
             </w:pPr>
-            <w:r>
-              <w:rPr>
-                <w:color w:val="808080"/>
-                <w:sz w:val="16"/>
-                <w:szCs w:val="16"/>
-                <w:rtl w:val="0"/>
-              </w:rPr>
-              <w:t xml:space="preserve">Escolher um item.</w:t>
-            </w:r>
-            <w:r>
-              <w:rPr>
-                <w:rtl w:val="0"/>
-              </w:rPr>
+            <w:bookmarkStart w:colFirst="0" w:colLast="0" w:name="_hwvt8npkipj0" w:id="26"/>
+            <w:bookmarkEnd w:id="26"/>
+            <w:r>
+              <w:rPr>
+                <w:color w:val="404040"/>
+                <w:sz w:val="16"/>
+                <w:szCs w:val="16"/>
+                <w:rtl w:val="0"/>
+              </w:rPr>
+              <w:t xml:space="preserve">Custas</w:t>
             </w:r>
           </w:p>
         </w:tc>
@@ -11471,6 +11970,702 @@
       <w:tr>
         <w:trPr>
           <w:cantSplit w:val="0"/>
+          <w:tblHeader w:val="0"/>
+        </w:trPr>
+        <w:tc>
+          <w:tcPr>
+            <w:shd w:fill="auto" w:val="clear"/>
+          </w:tcPr>
+          <w:p>
+            <w:pPr>
+              <w:pStyle w:val="Heading1"/>
+              <w:rPr>
+                <w:color w:val="404040"/>
+                <w:sz w:val="16"/>
+                <w:szCs w:val="16"/>
+              </w:rPr>
+            </w:pPr>
+            <w:r>
+              <w:rPr>
+                <w:color w:val="808080"/>
+                <w:sz w:val="16"/>
+                <w:szCs w:val="16"/>
+                <w:rtl w:val="0"/>
+              </w:rPr>
+              <w:t xml:space="preserve">Escolher um item.</w:t>
+            </w:r>
+            <w:r>
+              <w:rPr>
+                <w:rtl w:val="0"/>
+              </w:rPr>
+            </w:r>
+          </w:p>
+        </w:tc>
+        <w:tc>
+          <w:tcPr/>
+          <w:p>
+            <w:pPr>
+              <w:rPr>
+                <w:color w:val="404040"/>
+                <w:sz w:val="16"/>
+                <w:szCs w:val="16"/>
+              </w:rPr>
+            </w:pPr>
+            <w:r>
+              <w:rPr>
+                <w:color w:val="808080"/>
+                <w:sz w:val="16"/>
+                <w:szCs w:val="16"/>
+                <w:rtl w:val="0"/>
+              </w:rPr>
+              <w:t xml:space="preserve">Inserir data</w:t>
+            </w:r>
+            <w:r>
+              <w:rPr>
+                <w:rtl w:val="0"/>
+              </w:rPr>
+            </w:r>
+          </w:p>
+        </w:tc>
+        <w:tc>
+          <w:tcPr/>
+          <w:p>
+            <w:pPr>
+              <w:rPr>
+                <w:color w:val="404040"/>
+                <w:sz w:val="16"/>
+                <w:szCs w:val="16"/>
+              </w:rPr>
+            </w:pPr>
+            <w:r>
+              <w:rPr>
+                <w:color w:val="404040"/>
+                <w:sz w:val="16"/>
+                <w:szCs w:val="16"/>
+                <w:rtl w:val="0"/>
+              </w:rPr>
+              <w:t xml:space="preserve">Insira aqui a CIV</w:t>
+            </w:r>
+          </w:p>
+        </w:tc>
+        <w:tc>
+          <w:tcPr>
+            <w:tcBorders>
+              <w:right w:color="ffffff" w:space="0" w:sz="18" w:val="single"/>
+            </w:tcBorders>
+          </w:tcPr>
+          <w:p>
+            <w:pPr>
+              <w:rPr>
+                <w:color w:val="404040"/>
+              </w:rPr>
+            </w:pPr>
+            <w:r>
+              <w:rPr>
+                <w:color w:val="404040"/>
+                <w:sz w:val="14"/>
+                <w:szCs w:val="14"/>
+                <w:rtl w:val="0"/>
+              </w:rPr>
+              <w:t xml:space="preserve">Clique ou toque aqui para inserir o texto.</w:t>
+            </w:r>
+            <w:r>
+              <w:rPr>
+                <w:rtl w:val="0"/>
+              </w:rPr>
+            </w:r>
+          </w:p>
+        </w:tc>
+        <w:tc>
+          <w:tcPr>
+            <w:tcBorders>
+              <w:top w:color="ffffff" w:space="0" w:sz="18" w:val="single"/>
+              <w:left w:color="ffffff" w:space="0" w:sz="18" w:val="single"/>
+              <w:bottom w:color="ffffff" w:space="0" w:sz="18" w:val="single"/>
+              <w:right w:color="000000" w:space="0" w:sz="0" w:val="nil"/>
+            </w:tcBorders>
+            <w:shd w:fill="fbe2d1" w:val="clear"/>
+          </w:tcPr>
+          <w:p>
+            <w:pPr>
+              <w:keepNext w:val="0"/>
+              <w:keepLines w:val="0"/>
+              <w:pageBreakBefore w:val="0"/>
+              <w:widowControl w:val="1"/>
+              <w:pBdr>
+                <w:top w:space="0" w:sz="0" w:val="nil"/>
+                <w:left w:space="0" w:sz="0" w:val="nil"/>
+                <w:bottom w:space="0" w:sz="0" w:val="nil"/>
+                <w:right w:space="0" w:sz="0" w:val="nil"/>
+                <w:between w:space="0" w:sz="0" w:val="nil"/>
+              </w:pBdr>
+              <w:shd w:fill="auto" w:val="clear"/>
+              <w:spacing w:after="20" w:before="20" w:line="240" w:lineRule="auto"/>
+              <w:ind w:left="0" w:right="0" w:firstLine="0"/>
+              <w:jc w:val="right"/>
+              <w:rPr>
+                <w:rFonts w:ascii="Century Gothic" w:cs="Century Gothic" w:eastAsia="Century Gothic" w:hAnsi="Century Gothic"/>
+                <w:b w:val="0"/>
+                <w:bCs w:val="0"/>
+                <w:i w:val="0"/>
+                <w:iCs w:val="0"/>
+                <w:smallCaps w:val="0"/>
+                <w:strike w:val="0"/>
+                <w:color w:val="404040"/>
+                <w:sz w:val="16"/>
+                <w:szCs w:val="16"/>
+                <w:u w:val="none"/>
+                <w:shd w:fill="auto" w:val="clear"/>
+                <w:vertAlign w:val="baseline"/>
+              </w:rPr>
+            </w:pPr>
+            <w:r>
+              <w:rPr>
+                <w:rFonts w:ascii="Century Gothic" w:cs="Century Gothic" w:eastAsia="Century Gothic" w:hAnsi="Century Gothic"/>
+                <w:b w:val="0"/>
+                <w:bCs w:val="0"/>
+                <w:i w:val="0"/>
+                <w:iCs w:val="0"/>
+                <w:smallCaps w:val="0"/>
+                <w:strike w:val="0"/>
+                <w:color w:val="404040"/>
+                <w:sz w:val="16"/>
+                <w:szCs w:val="16"/>
+                <w:u w:val="none"/>
+                <w:shd w:fill="auto" w:val="clear"/>
+                <w:vertAlign w:val="baseline"/>
+                <w:rtl w:val="0"/>
+              </w:rPr>
+              <w:t xml:space="preserve">Insira aqui o valor</w:t>
+            </w:r>
+          </w:p>
+        </w:tc>
+      </w:tr>
+      <w:tr>
+        <w:trPr>
+          <w:cantSplit w:val="0"/>
+          <w:tblHeader w:val="0"/>
+        </w:trPr>
+        <w:tc>
+          <w:tcPr>
+            <w:shd w:fill="auto" w:val="clear"/>
+          </w:tcPr>
+          <w:p>
+            <w:pPr>
+              <w:pStyle w:val="Heading1"/>
+              <w:rPr>
+                <w:color w:val="404040"/>
+                <w:sz w:val="16"/>
+                <w:szCs w:val="16"/>
+              </w:rPr>
+            </w:pPr>
+            <w:r>
+              <w:rPr>
+                <w:color w:val="808080"/>
+                <w:sz w:val="16"/>
+                <w:szCs w:val="16"/>
+                <w:rtl w:val="0"/>
+              </w:rPr>
+              <w:t xml:space="preserve">Escolher um item.</w:t>
+            </w:r>
+            <w:r>
+              <w:rPr>
+                <w:rtl w:val="0"/>
+              </w:rPr>
+            </w:r>
+          </w:p>
+        </w:tc>
+        <w:tc>
+          <w:tcPr/>
+          <w:p>
+            <w:pPr>
+              <w:rPr>
+                <w:color w:val="404040"/>
+                <w:sz w:val="16"/>
+                <w:szCs w:val="16"/>
+              </w:rPr>
+            </w:pPr>
+            <w:r>
+              <w:rPr>
+                <w:color w:val="808080"/>
+                <w:sz w:val="16"/>
+                <w:szCs w:val="16"/>
+                <w:rtl w:val="0"/>
+              </w:rPr>
+              <w:t xml:space="preserve">Inserir data</w:t>
+            </w:r>
+            <w:r>
+              <w:rPr>
+                <w:rtl w:val="0"/>
+              </w:rPr>
+            </w:r>
+          </w:p>
+        </w:tc>
+        <w:tc>
+          <w:tcPr/>
+          <w:p>
+            <w:pPr>
+              <w:rPr>
+                <w:color w:val="404040"/>
+                <w:sz w:val="16"/>
+                <w:szCs w:val="16"/>
+              </w:rPr>
+            </w:pPr>
+            <w:r>
+              <w:rPr>
+                <w:color w:val="404040"/>
+                <w:sz w:val="16"/>
+                <w:szCs w:val="16"/>
+                <w:rtl w:val="0"/>
+              </w:rPr>
+              <w:t xml:space="preserve">Insira aqui a CIV</w:t>
+            </w:r>
+          </w:p>
+        </w:tc>
+        <w:tc>
+          <w:tcPr>
+            <w:tcBorders>
+              <w:right w:color="ffffff" w:space="0" w:sz="18" w:val="single"/>
+            </w:tcBorders>
+          </w:tcPr>
+          <w:p>
+            <w:pPr>
+              <w:rPr>
+                <w:color w:val="404040"/>
+              </w:rPr>
+            </w:pPr>
+            <w:r>
+              <w:rPr>
+                <w:color w:val="404040"/>
+                <w:sz w:val="14"/>
+                <w:szCs w:val="14"/>
+                <w:rtl w:val="0"/>
+              </w:rPr>
+              <w:t xml:space="preserve">Clique ou toque aqui para inserir o texto.</w:t>
+            </w:r>
+            <w:r>
+              <w:rPr>
+                <w:rtl w:val="0"/>
+              </w:rPr>
+            </w:r>
+          </w:p>
+        </w:tc>
+        <w:tc>
+          <w:tcPr>
+            <w:tcBorders>
+              <w:top w:color="ffffff" w:space="0" w:sz="18" w:val="single"/>
+              <w:left w:color="ffffff" w:space="0" w:sz="18" w:val="single"/>
+              <w:bottom w:color="ffffff" w:space="0" w:sz="18" w:val="single"/>
+              <w:right w:color="000000" w:space="0" w:sz="0" w:val="nil"/>
+            </w:tcBorders>
+            <w:shd w:fill="fbe2d1" w:val="clear"/>
+          </w:tcPr>
+          <w:p>
+            <w:pPr>
+              <w:keepNext w:val="0"/>
+              <w:keepLines w:val="0"/>
+              <w:pageBreakBefore w:val="0"/>
+              <w:widowControl w:val="1"/>
+              <w:pBdr>
+                <w:top w:space="0" w:sz="0" w:val="nil"/>
+                <w:left w:space="0" w:sz="0" w:val="nil"/>
+                <w:bottom w:space="0" w:sz="0" w:val="nil"/>
+                <w:right w:space="0" w:sz="0" w:val="nil"/>
+                <w:between w:space="0" w:sz="0" w:val="nil"/>
+              </w:pBdr>
+              <w:shd w:fill="auto" w:val="clear"/>
+              <w:spacing w:after="20" w:before="20" w:line="240" w:lineRule="auto"/>
+              <w:ind w:left="0" w:right="0" w:firstLine="0"/>
+              <w:jc w:val="right"/>
+              <w:rPr>
+                <w:rFonts w:ascii="Century Gothic" w:cs="Century Gothic" w:eastAsia="Century Gothic" w:hAnsi="Century Gothic"/>
+                <w:b w:val="0"/>
+                <w:bCs w:val="0"/>
+                <w:i w:val="0"/>
+                <w:iCs w:val="0"/>
+                <w:smallCaps w:val="0"/>
+                <w:strike w:val="0"/>
+                <w:color w:val="404040"/>
+                <w:sz w:val="16"/>
+                <w:szCs w:val="16"/>
+                <w:u w:val="none"/>
+                <w:shd w:fill="auto" w:val="clear"/>
+                <w:vertAlign w:val="baseline"/>
+              </w:rPr>
+            </w:pPr>
+            <w:r>
+              <w:rPr>
+                <w:rFonts w:ascii="Century Gothic" w:cs="Century Gothic" w:eastAsia="Century Gothic" w:hAnsi="Century Gothic"/>
+                <w:b w:val="0"/>
+                <w:bCs w:val="0"/>
+                <w:i w:val="0"/>
+                <w:iCs w:val="0"/>
+                <w:smallCaps w:val="0"/>
+                <w:strike w:val="0"/>
+                <w:color w:val="404040"/>
+                <w:sz w:val="16"/>
+                <w:szCs w:val="16"/>
+                <w:u w:val="none"/>
+                <w:shd w:fill="auto" w:val="clear"/>
+                <w:vertAlign w:val="baseline"/>
+                <w:rtl w:val="0"/>
+              </w:rPr>
+              <w:t xml:space="preserve">Insira aqui o valor</w:t>
+            </w:r>
+          </w:p>
+        </w:tc>
+      </w:tr>
+      <w:tr>
+        <w:trPr>
+          <w:cantSplit w:val="0"/>
+          <w:tblHeader w:val="0"/>
+        </w:trPr>
+        <w:tc>
+          <w:tcPr>
+            <w:shd w:fill="auto" w:val="clear"/>
+          </w:tcPr>
+          <w:p>
+            <w:pPr>
+              <w:pStyle w:val="Heading1"/>
+              <w:rPr>
+                <w:color w:val="404040"/>
+                <w:sz w:val="16"/>
+                <w:szCs w:val="16"/>
+              </w:rPr>
+            </w:pPr>
+            <w:r>
+              <w:rPr>
+                <w:color w:val="808080"/>
+                <w:sz w:val="16"/>
+                <w:szCs w:val="16"/>
+                <w:rtl w:val="0"/>
+              </w:rPr>
+              <w:t xml:space="preserve">Escolher um item.</w:t>
+            </w:r>
+            <w:r>
+              <w:rPr>
+                <w:rtl w:val="0"/>
+              </w:rPr>
+            </w:r>
+          </w:p>
+        </w:tc>
+        <w:tc>
+          <w:tcPr/>
+          <w:p>
+            <w:pPr>
+              <w:rPr>
+                <w:color w:val="404040"/>
+                <w:sz w:val="16"/>
+                <w:szCs w:val="16"/>
+              </w:rPr>
+            </w:pPr>
+            <w:r>
+              <w:rPr>
+                <w:color w:val="808080"/>
+                <w:sz w:val="16"/>
+                <w:szCs w:val="16"/>
+                <w:rtl w:val="0"/>
+              </w:rPr>
+              <w:t xml:space="preserve">Inserir data</w:t>
+            </w:r>
+            <w:r>
+              <w:rPr>
+                <w:rtl w:val="0"/>
+              </w:rPr>
+            </w:r>
+          </w:p>
+        </w:tc>
+        <w:tc>
+          <w:tcPr/>
+          <w:p>
+            <w:pPr>
+              <w:rPr>
+                <w:color w:val="404040"/>
+                <w:sz w:val="16"/>
+                <w:szCs w:val="16"/>
+              </w:rPr>
+            </w:pPr>
+            <w:r>
+              <w:rPr>
+                <w:color w:val="404040"/>
+                <w:sz w:val="16"/>
+                <w:szCs w:val="16"/>
+                <w:rtl w:val="0"/>
+              </w:rPr>
+              <w:t xml:space="preserve">Insira aqui a CIV</w:t>
+            </w:r>
+          </w:p>
+        </w:tc>
+        <w:tc>
+          <w:tcPr>
+            <w:tcBorders>
+              <w:right w:color="ffffff" w:space="0" w:sz="18" w:val="single"/>
+            </w:tcBorders>
+          </w:tcPr>
+          <w:p>
+            <w:pPr>
+              <w:rPr>
+                <w:color w:val="404040"/>
+              </w:rPr>
+            </w:pPr>
+            <w:r>
+              <w:rPr>
+                <w:color w:val="404040"/>
+                <w:sz w:val="14"/>
+                <w:szCs w:val="14"/>
+                <w:rtl w:val="0"/>
+              </w:rPr>
+              <w:t xml:space="preserve">Clique ou toque aqui para inserir o texto.</w:t>
+            </w:r>
+            <w:r>
+              <w:rPr>
+                <w:rtl w:val="0"/>
+              </w:rPr>
+            </w:r>
+          </w:p>
+        </w:tc>
+        <w:tc>
+          <w:tcPr>
+            <w:tcBorders>
+              <w:top w:color="ffffff" w:space="0" w:sz="18" w:val="single"/>
+              <w:left w:color="ffffff" w:space="0" w:sz="18" w:val="single"/>
+              <w:bottom w:color="ffffff" w:space="0" w:sz="18" w:val="single"/>
+              <w:right w:color="000000" w:space="0" w:sz="0" w:val="nil"/>
+            </w:tcBorders>
+            <w:shd w:fill="fbe2d1" w:val="clear"/>
+          </w:tcPr>
+          <w:p>
+            <w:pPr>
+              <w:keepNext w:val="0"/>
+              <w:keepLines w:val="0"/>
+              <w:pageBreakBefore w:val="0"/>
+              <w:widowControl w:val="1"/>
+              <w:pBdr>
+                <w:top w:space="0" w:sz="0" w:val="nil"/>
+                <w:left w:space="0" w:sz="0" w:val="nil"/>
+                <w:bottom w:space="0" w:sz="0" w:val="nil"/>
+                <w:right w:space="0" w:sz="0" w:val="nil"/>
+                <w:between w:space="0" w:sz="0" w:val="nil"/>
+              </w:pBdr>
+              <w:shd w:fill="auto" w:val="clear"/>
+              <w:spacing w:after="20" w:before="20" w:line="240" w:lineRule="auto"/>
+              <w:ind w:left="0" w:right="0" w:firstLine="0"/>
+              <w:jc w:val="right"/>
+              <w:rPr>
+                <w:rFonts w:ascii="Century Gothic" w:cs="Century Gothic" w:eastAsia="Century Gothic" w:hAnsi="Century Gothic"/>
+                <w:b w:val="0"/>
+                <w:bCs w:val="0"/>
+                <w:i w:val="0"/>
+                <w:iCs w:val="0"/>
+                <w:smallCaps w:val="0"/>
+                <w:strike w:val="0"/>
+                <w:color w:val="404040"/>
+                <w:sz w:val="16"/>
+                <w:szCs w:val="16"/>
+                <w:u w:val="none"/>
+                <w:shd w:fill="auto" w:val="clear"/>
+                <w:vertAlign w:val="baseline"/>
+              </w:rPr>
+            </w:pPr>
+            <w:r>
+              <w:rPr>
+                <w:rFonts w:ascii="Century Gothic" w:cs="Century Gothic" w:eastAsia="Century Gothic" w:hAnsi="Century Gothic"/>
+                <w:b w:val="0"/>
+                <w:bCs w:val="0"/>
+                <w:i w:val="0"/>
+                <w:iCs w:val="0"/>
+                <w:smallCaps w:val="0"/>
+                <w:strike w:val="0"/>
+                <w:color w:val="404040"/>
+                <w:sz w:val="16"/>
+                <w:szCs w:val="16"/>
+                <w:u w:val="none"/>
+                <w:shd w:fill="auto" w:val="clear"/>
+                <w:vertAlign w:val="baseline"/>
+                <w:rtl w:val="0"/>
+              </w:rPr>
+              <w:t xml:space="preserve">Insira aqui o valor</w:t>
+            </w:r>
+          </w:p>
+        </w:tc>
+      </w:tr>
+      <w:tr>
+        <w:trPr>
+          <w:cantSplit w:val="0"/>
+          <w:tblHeader w:val="0"/>
+        </w:trPr>
+        <w:tc>
+          <w:tcPr>
+            <w:shd w:fill="auto" w:val="clear"/>
+          </w:tcPr>
+          <w:p>
+            <w:pPr>
+              <w:pStyle w:val="Heading1"/>
+              <w:rPr>
+                <w:color w:val="404040"/>
+                <w:sz w:val="16"/>
+                <w:szCs w:val="16"/>
+              </w:rPr>
+            </w:pPr>
+            <w:r>
+              <w:rPr>
+                <w:color w:val="808080"/>
+                <w:sz w:val="16"/>
+                <w:szCs w:val="16"/>
+                <w:rtl w:val="0"/>
+              </w:rPr>
+              <w:t xml:space="preserve">Escolher um item.</w:t>
+            </w:r>
+            <w:r>
+              <w:rPr>
+                <w:rtl w:val="0"/>
+              </w:rPr>
+            </w:r>
+          </w:p>
+        </w:tc>
+        <w:tc>
+          <w:tcPr/>
+          <w:p>
+            <w:pPr>
+              <w:rPr>
+                <w:color w:val="404040"/>
+                <w:sz w:val="16"/>
+                <w:szCs w:val="16"/>
+              </w:rPr>
+            </w:pPr>
+            <w:r>
+              <w:rPr>
+                <w:color w:val="808080"/>
+                <w:sz w:val="16"/>
+                <w:szCs w:val="16"/>
+                <w:rtl w:val="0"/>
+              </w:rPr>
+              <w:t xml:space="preserve">Inserir data</w:t>
+            </w:r>
+            <w:r>
+              <w:rPr>
+                <w:rtl w:val="0"/>
+              </w:rPr>
+            </w:r>
+          </w:p>
+        </w:tc>
+        <w:tc>
+          <w:tcPr/>
+          <w:p>
+            <w:pPr>
+              <w:rPr>
+                <w:color w:val="404040"/>
+                <w:sz w:val="16"/>
+                <w:szCs w:val="16"/>
+              </w:rPr>
+            </w:pPr>
+            <w:r>
+              <w:rPr>
+                <w:color w:val="404040"/>
+                <w:sz w:val="16"/>
+                <w:szCs w:val="16"/>
+                <w:rtl w:val="0"/>
+              </w:rPr>
+              <w:t xml:space="preserve">Insira aqui a CIV</w:t>
+            </w:r>
+          </w:p>
+        </w:tc>
+        <w:tc>
+          <w:tcPr>
+            <w:tcBorders>
+              <w:right w:color="ffffff" w:space="0" w:sz="18" w:val="single"/>
+            </w:tcBorders>
+          </w:tcPr>
+          <w:p>
+            <w:pPr>
+              <w:rPr>
+                <w:color w:val="404040"/>
+              </w:rPr>
+            </w:pPr>
+            <w:r>
+              <w:rPr>
+                <w:color w:val="404040"/>
+                <w:sz w:val="14"/>
+                <w:szCs w:val="14"/>
+                <w:rtl w:val="0"/>
+              </w:rPr>
+              <w:t xml:space="preserve">Clique ou toque aqui para inserir o texto.</w:t>
+            </w:r>
+            <w:r>
+              <w:rPr>
+                <w:rtl w:val="0"/>
+              </w:rPr>
+            </w:r>
+          </w:p>
+        </w:tc>
+        <w:tc>
+          <w:tcPr>
+            <w:tcBorders>
+              <w:top w:color="ffffff" w:space="0" w:sz="18" w:val="single"/>
+              <w:left w:color="ffffff" w:space="0" w:sz="18" w:val="single"/>
+              <w:bottom w:color="ffffff" w:space="0" w:sz="18" w:val="single"/>
+              <w:right w:color="000000" w:space="0" w:sz="0" w:val="nil"/>
+            </w:tcBorders>
+            <w:shd w:fill="fbe2d1" w:val="clear"/>
+          </w:tcPr>
+          <w:p>
+            <w:pPr>
+              <w:keepNext w:val="0"/>
+              <w:keepLines w:val="0"/>
+              <w:pageBreakBefore w:val="0"/>
+              <w:widowControl w:val="1"/>
+              <w:pBdr>
+                <w:top w:space="0" w:sz="0" w:val="nil"/>
+                <w:left w:space="0" w:sz="0" w:val="nil"/>
+                <w:bottom w:space="0" w:sz="0" w:val="nil"/>
+                <w:right w:space="0" w:sz="0" w:val="nil"/>
+                <w:between w:space="0" w:sz="0" w:val="nil"/>
+              </w:pBdr>
+              <w:shd w:fill="auto" w:val="clear"/>
+              <w:spacing w:after="20" w:before="20" w:line="240" w:lineRule="auto"/>
+              <w:ind w:left="0" w:right="0" w:firstLine="0"/>
+              <w:jc w:val="right"/>
+              <w:rPr>
+                <w:rFonts w:ascii="Century Gothic" w:cs="Century Gothic" w:eastAsia="Century Gothic" w:hAnsi="Century Gothic"/>
+                <w:b w:val="0"/>
+                <w:bCs w:val="0"/>
+                <w:i w:val="0"/>
+                <w:iCs w:val="0"/>
+                <w:smallCaps w:val="0"/>
+                <w:strike w:val="0"/>
+                <w:color w:val="404040"/>
+                <w:sz w:val="16"/>
+                <w:szCs w:val="16"/>
+                <w:u w:val="none"/>
+                <w:shd w:fill="auto" w:val="clear"/>
+                <w:vertAlign w:val="baseline"/>
+              </w:rPr>
+            </w:pPr>
+            <w:r>
+              <w:rPr>
+                <w:rFonts w:ascii="Century Gothic" w:cs="Century Gothic" w:eastAsia="Century Gothic" w:hAnsi="Century Gothic"/>
+                <w:b w:val="0"/>
+                <w:bCs w:val="0"/>
+                <w:i w:val="0"/>
+                <w:iCs w:val="0"/>
+                <w:smallCaps w:val="0"/>
+                <w:strike w:val="0"/>
+                <w:color w:val="404040"/>
+                <w:sz w:val="16"/>
+                <w:szCs w:val="16"/>
+                <w:u w:val="none"/>
+                <w:shd w:fill="auto" w:val="clear"/>
+                <w:vertAlign w:val="baseline"/>
+                <w:rtl w:val="0"/>
+              </w:rPr>
+              <w:t xml:space="preserve">Insira aqui o valor</w:t>
+            </w:r>
+          </w:p>
+        </w:tc>
+      </w:tr>
+      <w:tr>
+        <w:trPr>
+          <w:cantSplit w:val="0"/>
           <w:trHeight w:val="158" w:hRule="atLeast"/>
           <w:tblHeader w:val="0"/>
         </w:trPr>
@@ -11563,7 +12758,7 @@
           </w:tcPr>
           <w:p>
             <w:r>
-              <w:t>7611,84</w:t>
+              <w:t>288,50</w:t>
             </w:r>
           </w:p>
         </w:tc>

</xml_diff>

<commit_message>
atualiza robos e adiciona suporte Daycoval CC e iFood em lancamento-prepostos
- cpj_api: aumenta timeouts de 30s para 180s em todas requisicoes; corrige filtro numero_cc para ccl.numero_cc; adiciona CC 1479 na lista de lancamentos permitidos
- omni/bradesco CC main.py: ajustes de logica de conciliacao
- omni-pde-fsp-trc main.py: atualizacoes de fluxo
- cpj-reembolso-bmg main.py: melhorias na busca de processo alternativo
- lancamento-prepostos main.py: adiciona suporte iFood; atualiza configs BMG e Daycoval
- daycoval-conciliacao-conta-corrente: adiciona robo completo com main.py, config e tabela de valores
- lancamento-prepostos: adiciona config e documentos padrao iFood

Co-Authored-By: Claude Sonnet 4.6 <noreply@anthropic.com>
</commit_message>
<xml_diff>
--- a/sites/cpj-reembolso-bmg/documento_modelo/bmg/descritivo_custas_preenchido.docx
+++ b/sites/cpj-reembolso-bmg/documento_modelo/bmg/descritivo_custas_preenchido.docx
@@ -184,7 +184,7 @@
           </w:tcPr>
           <w:p>
             <w:r>
-              <w:t>173696</w:t>
+              <w:t>180207</w:t>
             </w:r>
           </w:p>
         </w:tc>
@@ -236,7 +236,7 @@
           </w:tcPr>
           <w:p>
             <w:r>
-              <w:t>08/04/2026</w:t>
+              <w:t>07/07/2026</w:t>
             </w:r>
           </w:p>
         </w:tc>
@@ -288,7 +288,7 @@
           </w:tcPr>
           <w:p>
             <w:r>
-              <w:t>04/2026</w:t>
+              <w:t>07/2026</w:t>
             </w:r>
           </w:p>
         </w:tc>
@@ -449,7 +449,7 @@
           </w:tcPr>
           <w:p>
             <w:r>
-              <w:t>288,50</w:t>
+              <w:t>4197,37</w:t>
             </w:r>
           </w:p>
         </w:tc>
@@ -1256,15 +1256,15 @@
           <w:tcPr/>
           <w:p>
             <w:r>
-              <w:t>08/04/2026</w:t>
-            </w:r>
-          </w:p>
-        </w:tc>
-        <w:tc>
-          <w:tcPr/>
-          <w:p>
-            <w:r>
-              <w:t>CIV1449545</w:t>
+              <w:t>07/07/2026</w:t>
+            </w:r>
+          </w:p>
+        </w:tc>
+        <w:tc>
+          <w:tcPr/>
+          <w:p>
+            <w:r>
+              <w:t>CIV1390290</w:t>
             </w:r>
           </w:p>
         </w:tc>
@@ -1276,7 +1276,7 @@
           </w:tcPr>
           <w:p>
             <w:r>
-              <w:t>CUSTAS DIVERSAS E TAXAS JUDICIAIS / TRIBUNAL DE JU</w:t>
+              <w:t>APELAÇÃO CIVEL</w:t>
             </w:r>
           </w:p>
         </w:tc>
@@ -1292,7 +1292,7 @@
           </w:tcPr>
           <w:p>
             <w:r>
-              <w:t>288,50</w:t>
+              <w:t>512,00</w:t>
             </w:r>
           </w:p>
         </w:tc>
@@ -1311,68 +1311,24 @@
             <w:shd w:fill="auto" w:val="clear"/>
           </w:tcPr>
           <w:p>
-            <w:pPr>
-              <w:pStyle w:val="Heading1"/>
-              <w:spacing w:after="20" w:before="20" w:lineRule="auto"/>
-              <w:rPr>
-                <w:color w:val="404040"/>
-                <w:sz w:val="16"/>
-                <w:szCs w:val="16"/>
-              </w:rPr>
-            </w:pPr>
-            <w:r>
-              <w:rPr>
-                <w:color w:val="404040"/>
-                <w:sz w:val="16"/>
-                <w:szCs w:val="16"/>
-                <w:rtl w:val="0"/>
-              </w:rPr>
-              <w:t xml:space="preserve">Custas</w:t>
-            </w:r>
-          </w:p>
-        </w:tc>
-        <w:tc>
-          <w:tcPr/>
-          <w:p>
-            <w:pPr>
-              <w:rPr>
-                <w:color w:val="404040"/>
-              </w:rPr>
-            </w:pPr>
-            <w:r>
-              <w:rPr>
-                <w:color w:val="808080"/>
-                <w:sz w:val="16"/>
-                <w:szCs w:val="16"/>
-                <w:rtl w:val="0"/>
-              </w:rPr>
-              <w:t xml:space="preserve">Inserir data</w:t>
-            </w:r>
-            <w:r>
-              <w:rPr>
-                <w:rtl w:val="0"/>
-              </w:rPr>
-            </w:r>
-          </w:p>
-        </w:tc>
-        <w:tc>
-          <w:tcPr/>
-          <w:p>
-            <w:pPr>
-              <w:rPr>
-                <w:color w:val="404040"/>
-                <w:sz w:val="16"/>
-                <w:szCs w:val="16"/>
-              </w:rPr>
-            </w:pPr>
-            <w:r>
-              <w:rPr>
-                <w:color w:val="404040"/>
-                <w:sz w:val="16"/>
-                <w:szCs w:val="16"/>
-                <w:rtl w:val="0"/>
-              </w:rPr>
-              <w:t xml:space="preserve">Insira aqui a CIV</w:t>
+            <w:r>
+              <w:t>Custas</w:t>
+            </w:r>
+          </w:p>
+        </w:tc>
+        <w:tc>
+          <w:tcPr/>
+          <w:p>
+            <w:r>
+              <w:t>07/07/2026</w:t>
+            </w:r>
+          </w:p>
+        </w:tc>
+        <w:tc>
+          <w:tcPr/>
+          <w:p>
+            <w:r>
+              <w:t>CIV1233178</w:t>
             </w:r>
           </w:p>
         </w:tc>
@@ -1383,24 +1339,8 @@
             </w:tcBorders>
           </w:tcPr>
           <w:p>
-            <w:pPr>
-              <w:rPr>
-                <w:color w:val="404040"/>
-              </w:rPr>
-            </w:pPr>
-            <w:r>
-              <w:rPr>
-                <w:color w:val="404040"/>
-                <w:sz w:val="14"/>
-                <w:szCs w:val="14"/>
-                <w:rtl w:val="0"/>
-              </w:rPr>
-              <w:t xml:space="preserve">Clique ou toque aqui para inserir o texto.</w:t>
-            </w:r>
-            <w:r>
-              <w:rPr>
-                <w:rtl w:val="0"/>
-              </w:rPr>
+            <w:r>
+              <w:t>APELAÇÃO CIVEL</w:t>
             </w:r>
           </w:p>
         </w:tc>
@@ -1415,23 +1355,8 @@
             <w:shd w:fill="fbe2d1" w:val="clear"/>
           </w:tcPr>
           <w:p>
-            <w:pPr>
-              <w:spacing w:after="20" w:before="20" w:lineRule="auto"/>
-              <w:jc w:val="right"/>
-              <w:rPr>
-                <w:color w:val="404040"/>
-                <w:sz w:val="16"/>
-                <w:szCs w:val="16"/>
-              </w:rPr>
-            </w:pPr>
-            <w:r>
-              <w:rPr>
-                <w:color w:val="404040"/>
-                <w:sz w:val="16"/>
-                <w:szCs w:val="16"/>
-                <w:rtl w:val="0"/>
-              </w:rPr>
-              <w:t xml:space="preserve">Insira aqui o valor</w:t>
+            <w:r>
+              <w:t>1250,38</w:t>
             </w:r>
           </w:p>
         </w:tc>
@@ -1446,68 +1371,24 @@
             <w:shd w:fill="auto" w:val="clear"/>
           </w:tcPr>
           <w:p>
-            <w:pPr>
-              <w:pStyle w:val="Heading1"/>
-              <w:spacing w:after="20" w:before="20" w:lineRule="auto"/>
-              <w:rPr>
-                <w:color w:val="404040"/>
-                <w:sz w:val="16"/>
-                <w:szCs w:val="16"/>
-              </w:rPr>
-            </w:pPr>
-            <w:r>
-              <w:rPr>
-                <w:color w:val="404040"/>
-                <w:sz w:val="16"/>
-                <w:szCs w:val="16"/>
-                <w:rtl w:val="0"/>
-              </w:rPr>
-              <w:t xml:space="preserve">Custas</w:t>
-            </w:r>
-          </w:p>
-        </w:tc>
-        <w:tc>
-          <w:tcPr/>
-          <w:p>
-            <w:pPr>
-              <w:rPr>
-                <w:color w:val="404040"/>
-              </w:rPr>
-            </w:pPr>
-            <w:r>
-              <w:rPr>
-                <w:color w:val="808080"/>
-                <w:sz w:val="16"/>
-                <w:szCs w:val="16"/>
-                <w:rtl w:val="0"/>
-              </w:rPr>
-              <w:t xml:space="preserve">Inserir data</w:t>
-            </w:r>
-            <w:r>
-              <w:rPr>
-                <w:rtl w:val="0"/>
-              </w:rPr>
-            </w:r>
-          </w:p>
-        </w:tc>
-        <w:tc>
-          <w:tcPr/>
-          <w:p>
-            <w:pPr>
-              <w:rPr>
-                <w:color w:val="404040"/>
-                <w:sz w:val="16"/>
-                <w:szCs w:val="16"/>
-              </w:rPr>
-            </w:pPr>
-            <w:r>
-              <w:rPr>
-                <w:color w:val="404040"/>
-                <w:sz w:val="16"/>
-                <w:szCs w:val="16"/>
-                <w:rtl w:val="0"/>
-              </w:rPr>
-              <w:t xml:space="preserve">Insira aqui a CIV</w:t>
+            <w:r>
+              <w:t>Custas</w:t>
+            </w:r>
+          </w:p>
+        </w:tc>
+        <w:tc>
+          <w:tcPr/>
+          <w:p>
+            <w:r>
+              <w:t>07/07/2026</w:t>
+            </w:r>
+          </w:p>
+        </w:tc>
+        <w:tc>
+          <w:tcPr/>
+          <w:p>
+            <w:r>
+              <w:t>CIV1641502</w:t>
             </w:r>
           </w:p>
         </w:tc>
@@ -1518,24 +1399,8 @@
             </w:tcBorders>
           </w:tcPr>
           <w:p>
-            <w:pPr>
-              <w:rPr>
-                <w:color w:val="404040"/>
-              </w:rPr>
-            </w:pPr>
-            <w:r>
-              <w:rPr>
-                <w:color w:val="404040"/>
-                <w:sz w:val="14"/>
-                <w:szCs w:val="14"/>
-                <w:rtl w:val="0"/>
-              </w:rPr>
-              <w:t xml:space="preserve">Clique ou toque aqui para inserir o texto.</w:t>
-            </w:r>
-            <w:r>
-              <w:rPr>
-                <w:rtl w:val="0"/>
-              </w:rPr>
+            <w:r>
+              <w:t>RECURSO INOMINADO</w:t>
             </w:r>
           </w:p>
         </w:tc>
@@ -1550,23 +1415,8 @@
             <w:shd w:fill="fbe2d1" w:val="clear"/>
           </w:tcPr>
           <w:p>
-            <w:pPr>
-              <w:spacing w:after="20" w:before="20" w:lineRule="auto"/>
-              <w:jc w:val="right"/>
-              <w:rPr>
-                <w:color w:val="404040"/>
-                <w:sz w:val="16"/>
-                <w:szCs w:val="16"/>
-              </w:rPr>
-            </w:pPr>
-            <w:r>
-              <w:rPr>
-                <w:color w:val="404040"/>
-                <w:sz w:val="16"/>
-                <w:szCs w:val="16"/>
-                <w:rtl w:val="0"/>
-              </w:rPr>
-              <w:t xml:space="preserve">Insira aqui o valor</w:t>
+            <w:r>
+              <w:t>666,67</w:t>
             </w:r>
           </w:p>
         </w:tc>
@@ -1581,68 +1431,24 @@
             <w:shd w:fill="auto" w:val="clear"/>
           </w:tcPr>
           <w:p>
-            <w:pPr>
-              <w:pStyle w:val="Heading1"/>
-              <w:spacing w:after="20" w:before="20" w:lineRule="auto"/>
-              <w:rPr>
-                <w:color w:val="404040"/>
-                <w:sz w:val="16"/>
-                <w:szCs w:val="16"/>
-              </w:rPr>
-            </w:pPr>
-            <w:r>
-              <w:rPr>
-                <w:color w:val="404040"/>
-                <w:sz w:val="16"/>
-                <w:szCs w:val="16"/>
-                <w:rtl w:val="0"/>
-              </w:rPr>
-              <w:t xml:space="preserve">Custas</w:t>
-            </w:r>
-          </w:p>
-        </w:tc>
-        <w:tc>
-          <w:tcPr/>
-          <w:p>
-            <w:pPr>
-              <w:rPr>
-                <w:color w:val="404040"/>
-              </w:rPr>
-            </w:pPr>
-            <w:r>
-              <w:rPr>
-                <w:color w:val="808080"/>
-                <w:sz w:val="16"/>
-                <w:szCs w:val="16"/>
-                <w:rtl w:val="0"/>
-              </w:rPr>
-              <w:t xml:space="preserve">Inserir data</w:t>
-            </w:r>
-            <w:r>
-              <w:rPr>
-                <w:rtl w:val="0"/>
-              </w:rPr>
-            </w:r>
-          </w:p>
-        </w:tc>
-        <w:tc>
-          <w:tcPr/>
-          <w:p>
-            <w:pPr>
-              <w:rPr>
-                <w:color w:val="404040"/>
-                <w:sz w:val="16"/>
-                <w:szCs w:val="16"/>
-              </w:rPr>
-            </w:pPr>
-            <w:r>
-              <w:rPr>
-                <w:color w:val="404040"/>
-                <w:sz w:val="16"/>
-                <w:szCs w:val="16"/>
-                <w:rtl w:val="0"/>
-              </w:rPr>
-              <w:t xml:space="preserve">Insira aqui a CIV</w:t>
+            <w:r>
+              <w:t>Custas</w:t>
+            </w:r>
+          </w:p>
+        </w:tc>
+        <w:tc>
+          <w:tcPr/>
+          <w:p>
+            <w:r>
+              <w:t>07/07/2026</w:t>
+            </w:r>
+          </w:p>
+        </w:tc>
+        <w:tc>
+          <w:tcPr/>
+          <w:p>
+            <w:r>
+              <w:t>CIV1262104</w:t>
             </w:r>
           </w:p>
         </w:tc>
@@ -1653,24 +1459,8 @@
             </w:tcBorders>
           </w:tcPr>
           <w:p>
-            <w:pPr>
-              <w:rPr>
-                <w:color w:val="404040"/>
-              </w:rPr>
-            </w:pPr>
-            <w:r>
-              <w:rPr>
-                <w:color w:val="404040"/>
-                <w:sz w:val="14"/>
-                <w:szCs w:val="14"/>
-                <w:rtl w:val="0"/>
-              </w:rPr>
-              <w:t xml:space="preserve">Clique ou toque aqui para inserir o texto.</w:t>
-            </w:r>
-            <w:r>
-              <w:rPr>
-                <w:rtl w:val="0"/>
-              </w:rPr>
+            <w:r>
+              <w:t>APELAÇÃO CIVEL</w:t>
             </w:r>
           </w:p>
         </w:tc>
@@ -1685,23 +1475,8 @@
             <w:shd w:fill="fbe2d1" w:val="clear"/>
           </w:tcPr>
           <w:p>
-            <w:pPr>
-              <w:spacing w:after="20" w:before="20" w:lineRule="auto"/>
-              <w:jc w:val="right"/>
-              <w:rPr>
-                <w:color w:val="404040"/>
-                <w:sz w:val="16"/>
-                <w:szCs w:val="16"/>
-              </w:rPr>
-            </w:pPr>
-            <w:r>
-              <w:rPr>
-                <w:color w:val="404040"/>
-                <w:sz w:val="16"/>
-                <w:szCs w:val="16"/>
-                <w:rtl w:val="0"/>
-              </w:rPr>
-              <w:t xml:space="preserve">Insira aqui o valor</w:t>
+            <w:r>
+              <w:t>666,67</w:t>
             </w:r>
           </w:p>
         </w:tc>
@@ -1716,67 +1491,24 @@
             <w:shd w:fill="auto" w:val="clear"/>
           </w:tcPr>
           <w:p>
-            <w:pPr>
-              <w:pStyle w:val="Heading1"/>
-              <w:rPr>
-                <w:color w:val="404040"/>
-                <w:sz w:val="16"/>
-                <w:szCs w:val="16"/>
-              </w:rPr>
-            </w:pPr>
-            <w:r>
-              <w:rPr>
-                <w:color w:val="404040"/>
-                <w:sz w:val="16"/>
-                <w:szCs w:val="16"/>
-                <w:rtl w:val="0"/>
-              </w:rPr>
-              <w:t xml:space="preserve">Custas</w:t>
-            </w:r>
-          </w:p>
-        </w:tc>
-        <w:tc>
-          <w:tcPr/>
-          <w:p>
-            <w:pPr>
-              <w:rPr>
-                <w:color w:val="404040"/>
-              </w:rPr>
-            </w:pPr>
-            <w:r>
-              <w:rPr>
-                <w:color w:val="808080"/>
-                <w:sz w:val="16"/>
-                <w:szCs w:val="16"/>
-                <w:rtl w:val="0"/>
-              </w:rPr>
-              <w:t xml:space="preserve">Inserir data</w:t>
-            </w:r>
-            <w:r>
-              <w:rPr>
-                <w:rtl w:val="0"/>
-              </w:rPr>
-            </w:r>
-          </w:p>
-        </w:tc>
-        <w:tc>
-          <w:tcPr/>
-          <w:p>
-            <w:pPr>
-              <w:rPr>
-                <w:color w:val="404040"/>
-                <w:sz w:val="16"/>
-                <w:szCs w:val="16"/>
-              </w:rPr>
-            </w:pPr>
-            <w:r>
-              <w:rPr>
-                <w:color w:val="404040"/>
-                <w:sz w:val="16"/>
-                <w:szCs w:val="16"/>
-                <w:rtl w:val="0"/>
-              </w:rPr>
-              <w:t xml:space="preserve">Insira aqui a CIV</w:t>
+            <w:r>
+              <w:t>Custas</w:t>
+            </w:r>
+          </w:p>
+        </w:tc>
+        <w:tc>
+          <w:tcPr/>
+          <w:p>
+            <w:r>
+              <w:t>07/07/2026</w:t>
+            </w:r>
+          </w:p>
+        </w:tc>
+        <w:tc>
+          <w:tcPr/>
+          <w:p>
+            <w:r>
+              <w:t>CIV1673812</w:t>
             </w:r>
           </w:p>
         </w:tc>
@@ -1787,24 +1519,8 @@
             </w:tcBorders>
           </w:tcPr>
           <w:p>
-            <w:pPr>
-              <w:rPr>
-                <w:color w:val="404040"/>
-              </w:rPr>
-            </w:pPr>
-            <w:r>
-              <w:rPr>
-                <w:color w:val="404040"/>
-                <w:sz w:val="14"/>
-                <w:szCs w:val="14"/>
-                <w:rtl w:val="0"/>
-              </w:rPr>
-              <w:t xml:space="preserve">Clique ou toque aqui para inserir o texto.</w:t>
-            </w:r>
-            <w:r>
-              <w:rPr>
-                <w:rtl w:val="0"/>
-              </w:rPr>
+            <w:r>
+              <w:t>RECURSO INOMINADO</w:t>
             </w:r>
           </w:p>
         </w:tc>
@@ -1819,23 +1535,8 @@
             <w:shd w:fill="fbe2d1" w:val="clear"/>
           </w:tcPr>
           <w:p>
-            <w:pPr>
-              <w:spacing w:after="20" w:before="20" w:lineRule="auto"/>
-              <w:jc w:val="right"/>
-              <w:rPr>
-                <w:color w:val="404040"/>
-                <w:sz w:val="16"/>
-                <w:szCs w:val="16"/>
-              </w:rPr>
-            </w:pPr>
-            <w:r>
-              <w:rPr>
-                <w:color w:val="404040"/>
-                <w:sz w:val="16"/>
-                <w:szCs w:val="16"/>
-                <w:rtl w:val="0"/>
-              </w:rPr>
-              <w:t xml:space="preserve">Insira aqui o valor</w:t>
+            <w:r>
+              <w:t>709,11</w:t>
             </w:r>
           </w:p>
         </w:tc>
@@ -1850,67 +1551,24 @@
             <w:shd w:fill="auto" w:val="clear"/>
           </w:tcPr>
           <w:p>
-            <w:pPr>
-              <w:pStyle w:val="Heading1"/>
-              <w:rPr>
-                <w:color w:val="404040"/>
-                <w:sz w:val="16"/>
-                <w:szCs w:val="16"/>
-              </w:rPr>
-            </w:pPr>
-            <w:r>
-              <w:rPr>
-                <w:color w:val="404040"/>
-                <w:sz w:val="16"/>
-                <w:szCs w:val="16"/>
-                <w:rtl w:val="0"/>
-              </w:rPr>
-              <w:t xml:space="preserve">Custas</w:t>
-            </w:r>
-          </w:p>
-        </w:tc>
-        <w:tc>
-          <w:tcPr/>
-          <w:p>
-            <w:pPr>
-              <w:rPr>
-                <w:color w:val="404040"/>
-              </w:rPr>
-            </w:pPr>
-            <w:r>
-              <w:rPr>
-                <w:color w:val="808080"/>
-                <w:sz w:val="16"/>
-                <w:szCs w:val="16"/>
-                <w:rtl w:val="0"/>
-              </w:rPr>
-              <w:t xml:space="preserve">Inserir data</w:t>
-            </w:r>
-            <w:r>
-              <w:rPr>
-                <w:rtl w:val="0"/>
-              </w:rPr>
-            </w:r>
-          </w:p>
-        </w:tc>
-        <w:tc>
-          <w:tcPr/>
-          <w:p>
-            <w:pPr>
-              <w:rPr>
-                <w:color w:val="404040"/>
-                <w:sz w:val="16"/>
-                <w:szCs w:val="16"/>
-              </w:rPr>
-            </w:pPr>
-            <w:r>
-              <w:rPr>
-                <w:color w:val="404040"/>
-                <w:sz w:val="16"/>
-                <w:szCs w:val="16"/>
-                <w:rtl w:val="0"/>
-              </w:rPr>
-              <w:t xml:space="preserve">Insira aqui a CIV</w:t>
+            <w:r>
+              <w:t>Custas</w:t>
+            </w:r>
+          </w:p>
+        </w:tc>
+        <w:tc>
+          <w:tcPr/>
+          <w:p>
+            <w:r>
+              <w:t>07/07/2026</w:t>
+            </w:r>
+          </w:p>
+        </w:tc>
+        <w:tc>
+          <w:tcPr/>
+          <w:p>
+            <w:r>
+              <w:t>CIV1574977</w:t>
             </w:r>
           </w:p>
         </w:tc>
@@ -1921,24 +1579,8 @@
             </w:tcBorders>
           </w:tcPr>
           <w:p>
-            <w:pPr>
-              <w:rPr>
-                <w:color w:val="404040"/>
-              </w:rPr>
-            </w:pPr>
-            <w:r>
-              <w:rPr>
-                <w:color w:val="404040"/>
-                <w:sz w:val="14"/>
-                <w:szCs w:val="14"/>
-                <w:rtl w:val="0"/>
-              </w:rPr>
-              <w:t xml:space="preserve">Clique ou toque aqui para inserir o texto.</w:t>
-            </w:r>
-            <w:r>
-              <w:rPr>
-                <w:rtl w:val="0"/>
-              </w:rPr>
+            <w:r>
+              <w:t>RECURSO INOMINADO</w:t>
             </w:r>
           </w:p>
         </w:tc>
@@ -1953,23 +1595,8 @@
             <w:shd w:fill="fbe2d1" w:val="clear"/>
           </w:tcPr>
           <w:p>
-            <w:pPr>
-              <w:spacing w:after="20" w:before="20" w:lineRule="auto"/>
-              <w:jc w:val="right"/>
-              <w:rPr>
-                <w:color w:val="404040"/>
-                <w:sz w:val="16"/>
-                <w:szCs w:val="16"/>
-              </w:rPr>
-            </w:pPr>
-            <w:r>
-              <w:rPr>
-                <w:color w:val="404040"/>
-                <w:sz w:val="16"/>
-                <w:szCs w:val="16"/>
-                <w:rtl w:val="0"/>
-              </w:rPr>
-              <w:t xml:space="preserve">Insira aqui o valor</w:t>
+            <w:r>
+              <w:t>392,54</w:t>
             </w:r>
           </w:p>
         </w:tc>
@@ -12758,7 +12385,7 @@
           </w:tcPr>
           <w:p>
             <w:r>
-              <w:t>288,50</w:t>
+              <w:t>4197,37</w:t>
             </w:r>
           </w:p>
         </w:tc>

</xml_diff>